<commit_message>
fix: reject 2-digit numbers as NR_CRT in IDLE state
When in IDLE state, reject 2-digit numbers > 5 as false NR_CRT markers.
Numbers like '21', '27' are usually sub-section markers, not article numbers.
Real article numbers are 3+ digits (001-999) or 1-5 (reset).

This prevents patterns like:
  '21' (section marker) → '027' (real article)
from confusing the parser.

Also refactored extract_articles_v3() to group pages by deviz before
extraction, maintaining last_nr_crt across all pages of same deviz.
</commit_message>
<xml_diff>
--- a/output_AO/Raport_Oferta_2.docx
+++ b/output_AO/Raport_Oferta_2.docx
@@ -34,7 +34,7 @@
         <w:rPr>
           <w:b/>
         </w:rPr>
-        <w:t>Articole referință: 1534  │  Articole ofertă: 1384  │  Matched: 0  │  Neconformități: 0</w:t>
+        <w:t>Articole referință: 1535  │  Articole ofertă: 1384  │  Matched: 0  │  Neconformități: 0</w:t>
       </w:r>
     </w:p>
     <w:p>
@@ -42,7 +42,7 @@
         <w:rPr>
           <w:b/>
         </w:rPr>
-        <w:t>Devize: 226028, 226108, 226118, 226208, 226218, 226228, 226248, 226268, 226308, 226318, 226328, 226348, 226428, 226448, 226528, 226288, 226338, 226358, 226368, 226408, 226438, 226458, 226468, 226478, 226508, 226518, 226708, 226718, 226F08</w:t>
+        <w:t>Devize: 226028, 226108, 226118, 226208, 226218, 226228, 226248, 226268, 226308, 226318, 226328, 226348, 226358, 226428, 226448, 226528, 226258, 226288, 226338, 226368, 226408, 226418, 226438, 226468, 226478, 226518, 226708, 226718, 226F08</w:t>
       </w:r>
     </w:p>
     <w:tbl>
@@ -1932,7 +1932,7 @@
                 <w:b w:val="0"/>
                 <w:sz w:val="16"/>
               </w:rPr>
-              <w:t>IZK03C1</w:t>
+              <w:t>CB02A1</w:t>
             </w:r>
           </w:p>
         </w:tc>
@@ -1947,7 +1947,7 @@
                 <w:b w:val="0"/>
                 <w:sz w:val="16"/>
               </w:rPr>
-              <w:t>ecrane termoizolante din foi de polietilena</w:t>
+              <w:t>cofraje pt beton in elevatie din panouri refol ...</w:t>
             </w:r>
           </w:p>
         </w:tc>
@@ -1977,7 +1977,7 @@
                 <w:b w:val="0"/>
                 <w:sz w:val="16"/>
               </w:rPr>
-              <w:t>115.0</w:t>
+              <w:t>220.0</w:t>
             </w:r>
           </w:p>
         </w:tc>
@@ -2096,7 +2096,7 @@
                 <w:b w:val="0"/>
                 <w:sz w:val="16"/>
               </w:rPr>
-              <w:t>CB02A1</w:t>
+              <w:t>IZK03C1</w:t>
             </w:r>
           </w:p>
         </w:tc>
@@ -2111,7 +2111,7 @@
                 <w:b w:val="0"/>
                 <w:sz w:val="16"/>
               </w:rPr>
-              <w:t>cofraje pt beton in elevatie din panouri refol ...</w:t>
+              <w:t>ecrane termoizolante din foi de polietilena</w:t>
             </w:r>
           </w:p>
         </w:tc>
@@ -2141,7 +2141,7 @@
                 <w:b w:val="0"/>
                 <w:sz w:val="16"/>
               </w:rPr>
-              <w:t>220.0</w:t>
+              <w:t>115.0</w:t>
             </w:r>
           </w:p>
         </w:tc>
@@ -3276,7 +3276,7 @@
                 <w:b/>
                 <w:sz w:val="18"/>
               </w:rPr>
-              <w:t>Capitol de lucrări 226228 — INSTALATII SANITARE OB.2  │  LIPSA: 0  │  EXTRA: 0  │  Delta: 0 ✓</w:t>
+              <w:t>Capitol de lucrări 226228 — INSTALATII SANITARE OB.2  │  LIPSA: 0  │  EXTRA: 1  │  Delta: +1</w:t>
             </w:r>
           </w:p>
         </w:tc>
@@ -3435,6 +3435,189 @@
                 <w:sz w:val="16"/>
               </w:rPr>
               <w:t xml:space="preserve">Unitate de măsură diferită: referință buc, ofertat </w:t>
+            </w:r>
+          </w:p>
+        </w:tc>
+      </w:tr>
+      <w:tr>
+        <w:tc>
+          <w:tcPr>
+            <w:tcW w:type="dxa" w:w="3572"/>
+            <w:gridSpan w:val="11"/>
+            <w:shd w:fill="FFFF99" w:val="clear"/>
+          </w:tcPr>
+          <w:p>
+            <w:r>
+              <w:rPr>
+                <w:b w:val="0"/>
+                <w:i/>
+                <w:sz w:val="16"/>
+              </w:rPr>
+              <w:t>▸ Articole extra în ofertă — verificare manuală recomandată</w:t>
+            </w:r>
+          </w:p>
+        </w:tc>
+      </w:tr>
+      <w:tr>
+        <w:tc>
+          <w:tcPr>
+            <w:tcW w:type="dxa" w:w="397"/>
+            <w:shd w:fill="FFFF99" w:val="clear"/>
+          </w:tcPr>
+          <w:p>
+            <w:r>
+              <w:rPr>
+                <w:b w:val="0"/>
+                <w:sz w:val="16"/>
+              </w:rPr>
+              <w:t>20</w:t>
+            </w:r>
+          </w:p>
+        </w:tc>
+        <w:tc>
+          <w:tcPr>
+            <w:tcW w:type="dxa" w:w="1701"/>
+            <w:shd w:fill="FFFF99" w:val="clear"/>
+          </w:tcPr>
+          <w:p>
+            <w:r>
+              <w:rPr>
+                <w:b w:val="0"/>
+                <w:sz w:val="16"/>
+              </w:rPr>
+              <w:t>226228 - INSTALATII SANITARE OB.2</w:t>
+            </w:r>
+          </w:p>
+        </w:tc>
+        <w:tc>
+          <w:tcPr>
+            <w:tcW w:type="dxa" w:w="850"/>
+            <w:shd w:fill="FFFF99" w:val="clear"/>
+          </w:tcPr>
+          <w:p>
+            <w:r>
+              <w:rPr>
+                <w:b w:val="0"/>
+                <w:sz w:val="16"/>
+              </w:rPr>
+            </w:r>
+          </w:p>
+        </w:tc>
+        <w:tc>
+          <w:tcPr>
+            <w:tcW w:type="dxa" w:w="1984"/>
+            <w:shd w:fill="FFFF99" w:val="clear"/>
+          </w:tcPr>
+          <w:p>
+            <w:r>
+              <w:rPr>
+                <w:b w:val="0"/>
+                <w:sz w:val="16"/>
+              </w:rPr>
+            </w:r>
+          </w:p>
+        </w:tc>
+        <w:tc>
+          <w:tcPr>
+            <w:tcW w:type="dxa" w:w="454"/>
+            <w:shd w:fill="FFFF99" w:val="clear"/>
+          </w:tcPr>
+          <w:p>
+            <w:r>
+              <w:rPr>
+                <w:b w:val="0"/>
+                <w:sz w:val="16"/>
+              </w:rPr>
+            </w:r>
+          </w:p>
+        </w:tc>
+        <w:tc>
+          <w:tcPr>
+            <w:tcW w:type="dxa" w:w="680"/>
+            <w:shd w:fill="FFFF99" w:val="clear"/>
+          </w:tcPr>
+          <w:p>
+            <w:r>
+              <w:rPr>
+                <w:b w:val="0"/>
+                <w:sz w:val="16"/>
+              </w:rPr>
+            </w:r>
+          </w:p>
+        </w:tc>
+        <w:tc>
+          <w:tcPr>
+            <w:tcW w:type="dxa" w:w="850"/>
+            <w:shd w:fill="FFFF99" w:val="clear"/>
+          </w:tcPr>
+          <w:p>
+            <w:r>
+              <w:rPr>
+                <w:b w:val="0"/>
+                <w:sz w:val="16"/>
+              </w:rPr>
+              <w:t>SA14B</w:t>
+            </w:r>
+          </w:p>
+        </w:tc>
+        <w:tc>
+          <w:tcPr>
+            <w:tcW w:type="dxa" w:w="1984"/>
+            <w:shd w:fill="FFFF99" w:val="clear"/>
+          </w:tcPr>
+          <w:p>
+            <w:r>
+              <w:rPr>
+                <w:b w:val="0"/>
+                <w:sz w:val="16"/>
+              </w:rPr>
+              <w:t>teava mat pl (pp, pe, pp-r) imbinare prin sudur...</w:t>
+            </w:r>
+          </w:p>
+        </w:tc>
+        <w:tc>
+          <w:tcPr>
+            <w:tcW w:type="dxa" w:w="454"/>
+            <w:shd w:fill="FFFF99" w:val="clear"/>
+          </w:tcPr>
+          <w:p>
+            <w:r>
+              <w:rPr>
+                <w:b w:val="0"/>
+                <w:sz w:val="16"/>
+              </w:rPr>
+              <w:t>m</w:t>
+            </w:r>
+          </w:p>
+        </w:tc>
+        <w:tc>
+          <w:tcPr>
+            <w:tcW w:type="dxa" w:w="680"/>
+            <w:shd w:fill="FFFF99" w:val="clear"/>
+          </w:tcPr>
+          <w:p>
+            <w:r>
+              <w:rPr>
+                <w:b w:val="0"/>
+                <w:sz w:val="16"/>
+              </w:rPr>
+              <w:t>70.0</w:t>
+            </w:r>
+          </w:p>
+        </w:tc>
+        <w:tc>
+          <w:tcPr>
+            <w:tcW w:type="dxa" w:w="3572"/>
+            <w:shd w:fill="FFFF99" w:val="clear"/>
+          </w:tcPr>
+          <w:p>
+            <w:r>
+              <w:rPr>
+                <w:b w:val="0"/>
+                <w:color w:val="CC0000"/>
+                <w:sz w:val="16"/>
+              </w:rPr>
+              <w:t>Articol suplimentar în ofertă (nu există în referință)</w:t>
             </w:r>
           </w:p>
         </w:tc>
@@ -3600,7 +3783,7 @@
                 <w:b w:val="0"/>
                 <w:sz w:val="16"/>
               </w:rPr>
-              <w:t>21</w:t>
+              <w:t>22</w:t>
             </w:r>
           </w:p>
         </w:tc>
@@ -3892,7 +4075,7 @@
                 <w:b/>
                 <w:sz w:val="18"/>
               </w:rPr>
-              <w:t>Capitol de lucrări 226268 — INSTALATII ELECTRICE curenti tari OB.4  │  LIPSA: 0  │  EXTRA: 1  │  Delta: +1</w:t>
+              <w:t>Capitol de lucrări 226268 — INSTALATII ELECTRICE tari OB.2 curenti  │  LIPSA: 0  │  EXTRA: 1  │  Delta: +1</w:t>
             </w:r>
           </w:p>
         </w:tc>
@@ -3908,7 +4091,7 @@
                 <w:b w:val="0"/>
                 <w:sz w:val="16"/>
               </w:rPr>
-              <w:t>23</w:t>
+              <w:t>24</w:t>
             </w:r>
           </w:p>
         </w:tc>
@@ -3922,7 +4105,7 @@
                 <w:b w:val="0"/>
                 <w:sz w:val="16"/>
               </w:rPr>
-              <w:t>226268 - INSTALATII ELECTRICE curenti tari OB.4</w:t>
+              <w:t>226268 - INSTALATII ELECTRICE tari OB.2 curenti</w:t>
             </w:r>
           </w:p>
         </w:tc>
@@ -4087,7 +4270,7 @@
                 <w:b w:val="0"/>
                 <w:sz w:val="16"/>
               </w:rPr>
-              <w:t>24</w:t>
+              <w:t>25</w:t>
             </w:r>
           </w:p>
         </w:tc>
@@ -4102,7 +4285,7 @@
                 <w:b w:val="0"/>
                 <w:sz w:val="16"/>
               </w:rPr>
-              <w:t>226268 - INSTALATII ELECTRICE curenti tari OB.4</w:t>
+              <w:t>226268 - INSTALATII ELECTRICE tari OB.2 curenti</w:t>
             </w:r>
           </w:p>
         </w:tc>
@@ -4384,7 +4567,7 @@
                 <w:b/>
                 <w:sz w:val="18"/>
               </w:rPr>
-              <w:t>Capitol de lucrări 226308 — STRUCTURA DE REZISTENTA- (graden e 2 BUC...  │  LIPSA: 1  │  EXTRA: 3  │  Delta: +2</w:t>
+              <w:t>Capitol de lucrări 226308 — STRUCTURA DE REZISTENTA- (graden e 2 BUC...  │  LIPSA: 1  │  EXTRA: 4  │  Delta: +3</w:t>
             </w:r>
           </w:p>
         </w:tc>
@@ -4400,7 +4583,7 @@
                 <w:b w:val="0"/>
                 <w:sz w:val="16"/>
               </w:rPr>
-              <w:t>26</w:t>
+              <w:t>27</w:t>
             </w:r>
           </w:p>
         </w:tc>
@@ -4560,7 +4743,7 @@
                 <w:b w:val="0"/>
                 <w:sz w:val="16"/>
               </w:rPr>
-              <w:t>27</w:t>
+              <w:t>28</w:t>
             </w:r>
           </w:p>
         </w:tc>
@@ -4728,7 +4911,7 @@
                 <w:b w:val="0"/>
                 <w:sz w:val="16"/>
               </w:rPr>
-              <w:t>28</w:t>
+              <w:t>29</w:t>
             </w:r>
           </w:p>
         </w:tc>
@@ -4883,7 +5066,7 @@
                 <w:b w:val="0"/>
                 <w:sz w:val="16"/>
               </w:rPr>
-              <w:t>29</w:t>
+              <w:t>30</w:t>
             </w:r>
           </w:p>
         </w:tc>
@@ -5047,7 +5230,7 @@
                 <w:b w:val="0"/>
                 <w:sz w:val="16"/>
               </w:rPr>
-              <w:t>30</w:t>
+              <w:t>31</w:t>
             </w:r>
           </w:p>
         </w:tc>
@@ -5133,7 +5316,7 @@
                 <w:b w:val="0"/>
                 <w:sz w:val="16"/>
               </w:rPr>
-              <w:t>$2100919</w:t>
+              <w:t>TSC18B1</w:t>
             </w:r>
           </w:p>
         </w:tc>
@@ -5148,7 +5331,7 @@
                 <w:b w:val="0"/>
                 <w:sz w:val="16"/>
               </w:rPr>
-              <w:t>beton marca c</w:t>
+              <w:t>sapat.cu buldoz pe tract 65- 80cp incl impins p...</w:t>
             </w:r>
           </w:p>
         </w:tc>
@@ -5163,7 +5346,7 @@
                 <w:b w:val="0"/>
                 <w:sz w:val="16"/>
               </w:rPr>
-              <w:t>mc</w:t>
+              <w:t>100 mc</w:t>
             </w:r>
           </w:p>
         </w:tc>
@@ -5178,7 +5361,7 @@
                 <w:b w:val="0"/>
                 <w:sz w:val="16"/>
               </w:rPr>
-              <w:t>70.56</w:t>
+              <w:t>2.6</w:t>
             </w:r>
           </w:p>
         </w:tc>
@@ -5211,7 +5394,171 @@
                 <w:b w:val="0"/>
                 <w:sz w:val="16"/>
               </w:rPr>
-              <w:t>31</w:t>
+              <w:t>32</w:t>
+            </w:r>
+          </w:p>
+        </w:tc>
+        <w:tc>
+          <w:tcPr>
+            <w:tcW w:type="dxa" w:w="1701"/>
+            <w:shd w:fill="FFFF99" w:val="clear"/>
+          </w:tcPr>
+          <w:p>
+            <w:r>
+              <w:rPr>
+                <w:b w:val="0"/>
+                <w:sz w:val="16"/>
+              </w:rPr>
+              <w:t>226308 - STRUCTURA DE REZISTENTA- (graden e 2 ...</w:t>
+            </w:r>
+          </w:p>
+        </w:tc>
+        <w:tc>
+          <w:tcPr>
+            <w:tcW w:type="dxa" w:w="850"/>
+            <w:shd w:fill="FFFF99" w:val="clear"/>
+          </w:tcPr>
+          <w:p>
+            <w:r>
+              <w:rPr>
+                <w:b w:val="0"/>
+                <w:sz w:val="16"/>
+              </w:rPr>
+            </w:r>
+          </w:p>
+        </w:tc>
+        <w:tc>
+          <w:tcPr>
+            <w:tcW w:type="dxa" w:w="1984"/>
+            <w:shd w:fill="FFFF99" w:val="clear"/>
+          </w:tcPr>
+          <w:p>
+            <w:r>
+              <w:rPr>
+                <w:b w:val="0"/>
+                <w:sz w:val="16"/>
+              </w:rPr>
+            </w:r>
+          </w:p>
+        </w:tc>
+        <w:tc>
+          <w:tcPr>
+            <w:tcW w:type="dxa" w:w="454"/>
+            <w:shd w:fill="FFFF99" w:val="clear"/>
+          </w:tcPr>
+          <w:p>
+            <w:r>
+              <w:rPr>
+                <w:b w:val="0"/>
+                <w:sz w:val="16"/>
+              </w:rPr>
+            </w:r>
+          </w:p>
+        </w:tc>
+        <w:tc>
+          <w:tcPr>
+            <w:tcW w:type="dxa" w:w="680"/>
+            <w:shd w:fill="FFFF99" w:val="clear"/>
+          </w:tcPr>
+          <w:p>
+            <w:r>
+              <w:rPr>
+                <w:b w:val="0"/>
+                <w:sz w:val="16"/>
+              </w:rPr>
+            </w:r>
+          </w:p>
+        </w:tc>
+        <w:tc>
+          <w:tcPr>
+            <w:tcW w:type="dxa" w:w="850"/>
+            <w:shd w:fill="FFFF99" w:val="clear"/>
+          </w:tcPr>
+          <w:p>
+            <w:r>
+              <w:rPr>
+                <w:b w:val="0"/>
+                <w:sz w:val="16"/>
+              </w:rPr>
+              <w:t>$2100919</w:t>
+            </w:r>
+          </w:p>
+        </w:tc>
+        <w:tc>
+          <w:tcPr>
+            <w:tcW w:type="dxa" w:w="1984"/>
+            <w:shd w:fill="FFFF99" w:val="clear"/>
+          </w:tcPr>
+          <w:p>
+            <w:r>
+              <w:rPr>
+                <w:b w:val="0"/>
+                <w:sz w:val="16"/>
+              </w:rPr>
+              <w:t>beton marca c</w:t>
+            </w:r>
+          </w:p>
+        </w:tc>
+        <w:tc>
+          <w:tcPr>
+            <w:tcW w:type="dxa" w:w="454"/>
+            <w:shd w:fill="FFFF99" w:val="clear"/>
+          </w:tcPr>
+          <w:p>
+            <w:r>
+              <w:rPr>
+                <w:b w:val="0"/>
+                <w:sz w:val="16"/>
+              </w:rPr>
+              <w:t>mc</w:t>
+            </w:r>
+          </w:p>
+        </w:tc>
+        <w:tc>
+          <w:tcPr>
+            <w:tcW w:type="dxa" w:w="680"/>
+            <w:shd w:fill="FFFF99" w:val="clear"/>
+          </w:tcPr>
+          <w:p>
+            <w:r>
+              <w:rPr>
+                <w:b w:val="0"/>
+                <w:sz w:val="16"/>
+              </w:rPr>
+              <w:t>70.56</w:t>
+            </w:r>
+          </w:p>
+        </w:tc>
+        <w:tc>
+          <w:tcPr>
+            <w:tcW w:type="dxa" w:w="3572"/>
+            <w:shd w:fill="FFFF99" w:val="clear"/>
+          </w:tcPr>
+          <w:p>
+            <w:r>
+              <w:rPr>
+                <w:b w:val="0"/>
+                <w:color w:val="CC0000"/>
+                <w:sz w:val="16"/>
+              </w:rPr>
+              <w:t>Articol suplimentar în ofertă (nu există în referință)</w:t>
+            </w:r>
+          </w:p>
+        </w:tc>
+      </w:tr>
+      <w:tr>
+        <w:tc>
+          <w:tcPr>
+            <w:tcW w:type="dxa" w:w="397"/>
+            <w:shd w:fill="FFFF99" w:val="clear"/>
+          </w:tcPr>
+          <w:p>
+            <w:r>
+              <w:rPr>
+                <w:b w:val="0"/>
+                <w:sz w:val="16"/>
+              </w:rPr>
+              <w:t>33</w:t>
             </w:r>
           </w:p>
         </w:tc>
@@ -5524,7 +5871,7 @@
                 <w:b w:val="0"/>
                 <w:sz w:val="16"/>
               </w:rPr>
-              <w:t>33</w:t>
+              <w:t>35</w:t>
             </w:r>
           </w:p>
         </w:tc>
@@ -5703,7 +6050,7 @@
                 <w:b w:val="0"/>
                 <w:sz w:val="16"/>
               </w:rPr>
-              <w:t>34</w:t>
+              <w:t>36</w:t>
             </w:r>
           </w:p>
         </w:tc>
@@ -6016,7 +6363,7 @@
                 <w:b w:val="0"/>
                 <w:sz w:val="16"/>
               </w:rPr>
-              <w:t>36</w:t>
+              <w:t>38</w:t>
             </w:r>
           </w:p>
         </w:tc>
@@ -6194,7 +6541,7 @@
                 <w:b w:val="0"/>
                 <w:sz w:val="16"/>
               </w:rPr>
-              <w:t>37</w:t>
+              <w:t>39</w:t>
             </w:r>
           </w:p>
         </w:tc>
@@ -6280,7 +6627,7 @@
                 <w:b w:val="0"/>
                 <w:sz w:val="16"/>
               </w:rPr>
-              <w:t>IZD04D1</w:t>
+              <w:t>CE05E1</w:t>
             </w:r>
           </w:p>
         </w:tc>
@@ -6295,7 +6642,7 @@
                 <w:b w:val="0"/>
                 <w:sz w:val="16"/>
               </w:rPr>
-              <w:t>vopsire cu aparat aer compr vopsea ulei pe conf...</w:t>
+              <w:t>invelitoare din tabla cutata fixata cu suruburi...</w:t>
             </w:r>
           </w:p>
         </w:tc>
@@ -6310,7 +6657,7 @@
                 <w:b w:val="0"/>
                 <w:sz w:val="16"/>
               </w:rPr>
-              <w:t>ton</w:t>
+              <w:t>mp</w:t>
             </w:r>
           </w:p>
         </w:tc>
@@ -6325,7 +6672,7 @@
                 <w:b w:val="0"/>
                 <w:sz w:val="16"/>
               </w:rPr>
-              <w:t>8.0</w:t>
+              <w:t>532.0</w:t>
             </w:r>
           </w:p>
         </w:tc>
@@ -6358,7 +6705,7 @@
                 <w:b w:val="0"/>
                 <w:sz w:val="16"/>
               </w:rPr>
-              <w:t>38</w:t>
+              <w:t>40</w:t>
             </w:r>
           </w:p>
         </w:tc>
@@ -6444,7 +6791,7 @@
                 <w:b w:val="0"/>
                 <w:sz w:val="16"/>
               </w:rPr>
-              <w:t>CE05E1</w:t>
+              <w:t>IZD04D1</w:t>
             </w:r>
           </w:p>
         </w:tc>
@@ -6459,7 +6806,7 @@
                 <w:b w:val="0"/>
                 <w:sz w:val="16"/>
               </w:rPr>
-              <w:t>invelitoare din tabla cutata fixata cu suruburi...</w:t>
+              <w:t>vopsire cu aparat aer compr vopsea ulei pe conf...</w:t>
             </w:r>
           </w:p>
         </w:tc>
@@ -6474,7 +6821,7 @@
                 <w:b w:val="0"/>
                 <w:sz w:val="16"/>
               </w:rPr>
-              <w:t>mp</w:t>
+              <w:t>ton</w:t>
             </w:r>
           </w:p>
         </w:tc>
@@ -6489,7 +6836,7 @@
                 <w:b w:val="0"/>
                 <w:sz w:val="16"/>
               </w:rPr>
-              <w:t>532.0</w:t>
+              <w:t>8.0</w:t>
             </w:r>
           </w:p>
         </w:tc>
@@ -6655,7 +7002,7 @@
                 <w:b/>
                 <w:sz w:val="18"/>
               </w:rPr>
-              <w:t>Capitol de lucrări 226348 — SPATII VERZI  │  LIPSA: 2  │  EXTRA: 1  │  Delta: -1</w:t>
+              <w:t>Capitol de lucrări 226348 — SPATII VERZI  │  LIPSA: 2  │  EXTRA: 2  │  Delta: 0 ✓</w:t>
             </w:r>
           </w:p>
         </w:tc>
@@ -6672,7 +7019,7 @@
                 <w:b w:val="0"/>
                 <w:sz w:val="16"/>
               </w:rPr>
-              <w:t>40</w:t>
+              <w:t>42</w:t>
             </w:r>
           </w:p>
         </w:tc>
@@ -6808,7 +7155,7 @@
                 <w:b w:val="0"/>
                 <w:sz w:val="16"/>
               </w:rPr>
-              <w:t>41</w:t>
+              <w:t>43</w:t>
             </w:r>
           </w:p>
         </w:tc>
@@ -6963,7 +7310,171 @@
                 <w:b w:val="0"/>
                 <w:sz w:val="16"/>
               </w:rPr>
-              <w:t>42</w:t>
+              <w:t>44</w:t>
+            </w:r>
+          </w:p>
+        </w:tc>
+        <w:tc>
+          <w:tcPr>
+            <w:tcW w:type="dxa" w:w="1701"/>
+            <w:shd w:fill="FFFF99" w:val="clear"/>
+          </w:tcPr>
+          <w:p>
+            <w:r>
+              <w:rPr>
+                <w:b w:val="0"/>
+                <w:sz w:val="16"/>
+              </w:rPr>
+              <w:t>226348 - SPATII VERZI</w:t>
+            </w:r>
+          </w:p>
+        </w:tc>
+        <w:tc>
+          <w:tcPr>
+            <w:tcW w:type="dxa" w:w="850"/>
+            <w:shd w:fill="FFFF99" w:val="clear"/>
+          </w:tcPr>
+          <w:p>
+            <w:r>
+              <w:rPr>
+                <w:b w:val="0"/>
+                <w:sz w:val="16"/>
+              </w:rPr>
+            </w:r>
+          </w:p>
+        </w:tc>
+        <w:tc>
+          <w:tcPr>
+            <w:tcW w:type="dxa" w:w="1984"/>
+            <w:shd w:fill="FFFF99" w:val="clear"/>
+          </w:tcPr>
+          <w:p>
+            <w:r>
+              <w:rPr>
+                <w:b w:val="0"/>
+                <w:sz w:val="16"/>
+              </w:rPr>
+            </w:r>
+          </w:p>
+        </w:tc>
+        <w:tc>
+          <w:tcPr>
+            <w:tcW w:type="dxa" w:w="454"/>
+            <w:shd w:fill="FFFF99" w:val="clear"/>
+          </w:tcPr>
+          <w:p>
+            <w:r>
+              <w:rPr>
+                <w:b w:val="0"/>
+                <w:sz w:val="16"/>
+              </w:rPr>
+            </w:r>
+          </w:p>
+        </w:tc>
+        <w:tc>
+          <w:tcPr>
+            <w:tcW w:type="dxa" w:w="680"/>
+            <w:shd w:fill="FFFF99" w:val="clear"/>
+          </w:tcPr>
+          <w:p>
+            <w:r>
+              <w:rPr>
+                <w:b w:val="0"/>
+                <w:sz w:val="16"/>
+              </w:rPr>
+            </w:r>
+          </w:p>
+        </w:tc>
+        <w:tc>
+          <w:tcPr>
+            <w:tcW w:type="dxa" w:w="850"/>
+            <w:shd w:fill="FFFF99" w:val="clear"/>
+          </w:tcPr>
+          <w:p>
+            <w:r>
+              <w:rPr>
+                <w:b w:val="0"/>
+                <w:sz w:val="16"/>
+              </w:rPr>
+              <w:t>TSH01A1</w:t>
+            </w:r>
+          </w:p>
+        </w:tc>
+        <w:tc>
+          <w:tcPr>
+            <w:tcW w:type="dxa" w:w="1984"/>
+            <w:shd w:fill="FFFF99" w:val="clear"/>
+          </w:tcPr>
+          <w:p>
+            <w:r>
+              <w:rPr>
+                <w:b w:val="0"/>
+                <w:sz w:val="16"/>
+              </w:rPr>
+              <w:t>degajarea terenului de corpuri straine</w:t>
+            </w:r>
+          </w:p>
+        </w:tc>
+        <w:tc>
+          <w:tcPr>
+            <w:tcW w:type="dxa" w:w="454"/>
+            <w:shd w:fill="FFFF99" w:val="clear"/>
+          </w:tcPr>
+          <w:p>
+            <w:r>
+              <w:rPr>
+                <w:b w:val="0"/>
+                <w:sz w:val="16"/>
+              </w:rPr>
+              <w:t>100 mp</w:t>
+            </w:r>
+          </w:p>
+        </w:tc>
+        <w:tc>
+          <w:tcPr>
+            <w:tcW w:type="dxa" w:w="680"/>
+            <w:shd w:fill="FFFF99" w:val="clear"/>
+          </w:tcPr>
+          <w:p>
+            <w:r>
+              <w:rPr>
+                <w:b w:val="0"/>
+                <w:sz w:val="16"/>
+              </w:rPr>
+              <w:t>59.18</w:t>
+            </w:r>
+          </w:p>
+        </w:tc>
+        <w:tc>
+          <w:tcPr>
+            <w:tcW w:type="dxa" w:w="3572"/>
+            <w:shd w:fill="FFFF99" w:val="clear"/>
+          </w:tcPr>
+          <w:p>
+            <w:r>
+              <w:rPr>
+                <w:b w:val="0"/>
+                <w:color w:val="CC0000"/>
+                <w:sz w:val="16"/>
+              </w:rPr>
+              <w:t>Articol suplimentar în ofertă (nu există în referință)</w:t>
+            </w:r>
+          </w:p>
+        </w:tc>
+      </w:tr>
+      <w:tr>
+        <w:tc>
+          <w:tcPr>
+            <w:tcW w:type="dxa" w:w="397"/>
+            <w:shd w:fill="FFFF99" w:val="clear"/>
+          </w:tcPr>
+          <w:p>
+            <w:r>
+              <w:rPr>
+                <w:b w:val="0"/>
+                <w:sz w:val="16"/>
+              </w:rPr>
+              <w:t>45</w:t>
             </w:r>
           </w:p>
         </w:tc>
@@ -7260,7 +7771,7 @@
                 <w:b/>
                 <w:sz w:val="18"/>
               </w:rPr>
-              <w:t>Capitol de lucrări 226428 — INSTALATII SANITARE OB. 4  │  LIPSA: 0  │  EXTRA: 3  │  Delta: +3</w:t>
+              <w:t>Capitol de lucrări 226358 — ALEI PIETONALE SI CAROSABILE  │  LIPSA: 1  │  EXTRA: 0  │  Delta: -1</w:t>
             </w:r>
           </w:p>
         </w:tc>
@@ -7269,62 +7780,125 @@
         <w:tc>
           <w:tcPr>
             <w:tcW w:type="dxa" w:w="397"/>
-          </w:tcPr>
-          <w:p>
-            <w:r>
-              <w:rPr>
-                <w:b w:val="0"/>
-                <w:sz w:val="16"/>
-              </w:rPr>
-              <w:t>44</w:t>
+            <w:shd w:fill="FFB3B3" w:val="clear"/>
+          </w:tcPr>
+          <w:p>
+            <w:r>
+              <w:rPr>
+                <w:b w:val="0"/>
+                <w:sz w:val="16"/>
+              </w:rPr>
+              <w:t>47</w:t>
             </w:r>
           </w:p>
         </w:tc>
         <w:tc>
           <w:tcPr>
             <w:tcW w:type="dxa" w:w="1701"/>
-          </w:tcPr>
-          <w:p>
-            <w:r>
-              <w:rPr>
-                <w:b w:val="0"/>
-                <w:sz w:val="16"/>
-              </w:rPr>
-              <w:t>226428 - INSTALATII SANITARE OB. 4</w:t>
+            <w:shd w:fill="FFB3B3" w:val="clear"/>
+          </w:tcPr>
+          <w:p>
+            <w:r>
+              <w:rPr>
+                <w:b w:val="0"/>
+                <w:sz w:val="16"/>
+              </w:rPr>
+              <w:t>226358 - ALEI PIETONALE SI CAROSABILE</w:t>
             </w:r>
           </w:p>
         </w:tc>
         <w:tc>
           <w:tcPr>
             <w:tcW w:type="dxa" w:w="850"/>
-          </w:tcPr>
-          <w:p>
-            <w:r>
-              <w:rPr>
-                <w:b w:val="0"/>
-                <w:sz w:val="16"/>
-              </w:rPr>
-              <w:t>$3270244</w:t>
+            <w:shd w:fill="FFB3B3" w:val="clear"/>
+          </w:tcPr>
+          <w:p>
+            <w:r>
+              <w:rPr>
+                <w:b w:val="0"/>
+                <w:sz w:val="16"/>
+              </w:rPr>
+              <w:t>$2040</w:t>
             </w:r>
           </w:p>
         </w:tc>
         <w:tc>
           <w:tcPr>
             <w:tcW w:type="dxa" w:w="1984"/>
-          </w:tcPr>
-          <w:p>
-            <w:r>
-              <w:rPr>
-                <w:b w:val="0"/>
-                <w:sz w:val="16"/>
-              </w:rPr>
-              <w:t>reductie ppr 50-40</w:t>
+            <w:shd w:fill="FFB3B3" w:val="clear"/>
+          </w:tcPr>
+          <w:p>
+            <w:r>
+              <w:rPr>
+                <w:b w:val="0"/>
+                <w:sz w:val="16"/>
+              </w:rPr>
+              <w:t>000 menbrana geotextil netesute 150g/mp design ...</w:t>
             </w:r>
           </w:p>
         </w:tc>
         <w:tc>
           <w:tcPr>
             <w:tcW w:type="dxa" w:w="454"/>
+            <w:shd w:fill="FFB3B3" w:val="clear"/>
+          </w:tcPr>
+          <w:p>
+            <w:r>
+              <w:rPr>
+                <w:b w:val="0"/>
+                <w:sz w:val="16"/>
+              </w:rPr>
+              <w:t>226358 pag</w:t>
+            </w:r>
+          </w:p>
+        </w:tc>
+        <w:tc>
+          <w:tcPr>
+            <w:tcW w:type="dxa" w:w="680"/>
+            <w:shd w:fill="FFB3B3" w:val="clear"/>
+          </w:tcPr>
+          <w:p>
+            <w:r>
+              <w:rPr>
+                <w:b w:val="0"/>
+                <w:sz w:val="16"/>
+              </w:rPr>
+              <w:t>8.0</w:t>
+            </w:r>
+          </w:p>
+        </w:tc>
+        <w:tc>
+          <w:tcPr>
+            <w:tcW w:type="dxa" w:w="850"/>
+            <w:shd w:fill="FFB3B3" w:val="clear"/>
+          </w:tcPr>
+          <w:p/>
+        </w:tc>
+        <w:tc>
+          <w:tcPr>
+            <w:tcW w:type="dxa" w:w="1984"/>
+            <w:shd w:fill="FFB3B3" w:val="clear"/>
+          </w:tcPr>
+          <w:p/>
+        </w:tc>
+        <w:tc>
+          <w:tcPr>
+            <w:tcW w:type="dxa" w:w="454"/>
+            <w:shd w:fill="FFB3B3" w:val="clear"/>
+          </w:tcPr>
+          <w:p/>
+        </w:tc>
+        <w:tc>
+          <w:tcPr>
+            <w:tcW w:type="dxa" w:w="680"/>
+            <w:shd w:fill="FFB3B3" w:val="clear"/>
+          </w:tcPr>
+          <w:p/>
+        </w:tc>
+        <w:tc>
+          <w:tcPr>
+            <w:tcW w:type="dxa" w:w="3572"/>
+            <w:shd w:fill="FFB3B3" w:val="clear"/>
           </w:tcPr>
           <w:p>
             <w:r>
@@ -7333,92 +7907,7 @@
                 <w:color w:val="CC0000"/>
                 <w:sz w:val="16"/>
               </w:rPr>
-              <w:t>buc</w:t>
-            </w:r>
-          </w:p>
-        </w:tc>
-        <w:tc>
-          <w:tcPr>
-            <w:tcW w:type="dxa" w:w="680"/>
-          </w:tcPr>
-          <w:p>
-            <w:r>
-              <w:rPr>
-                <w:b w:val="0"/>
-                <w:sz w:val="16"/>
-              </w:rPr>
-              <w:t>1.0</w:t>
-            </w:r>
-          </w:p>
-        </w:tc>
-        <w:tc>
-          <w:tcPr>
-            <w:tcW w:type="dxa" w:w="850"/>
-          </w:tcPr>
-          <w:p>
-            <w:r>
-              <w:rPr>
-                <w:b w:val="0"/>
-                <w:sz w:val="16"/>
-              </w:rPr>
-              <w:t>$3270244</w:t>
-            </w:r>
-          </w:p>
-        </w:tc>
-        <w:tc>
-          <w:tcPr>
-            <w:tcW w:type="dxa" w:w="1984"/>
-          </w:tcPr>
-          <w:p>
-            <w:r>
-              <w:rPr>
-                <w:b w:val="0"/>
-                <w:sz w:val="16"/>
-              </w:rPr>
-              <w:t>reductie ppr 50-40 b?c.</w:t>
-            </w:r>
-          </w:p>
-        </w:tc>
-        <w:tc>
-          <w:tcPr>
-            <w:tcW w:type="dxa" w:w="454"/>
-          </w:tcPr>
-          <w:p>
-            <w:r>
-              <w:rPr>
-                <w:b w:val="0"/>
-                <w:color w:val="CC0000"/>
-                <w:sz w:val="16"/>
-              </w:rPr>
-            </w:r>
-          </w:p>
-        </w:tc>
-        <w:tc>
-          <w:tcPr>
-            <w:tcW w:type="dxa" w:w="680"/>
-          </w:tcPr>
-          <w:p>
-            <w:r>
-              <w:rPr>
-                <w:b w:val="0"/>
-                <w:sz w:val="16"/>
-              </w:rPr>
-              <w:t>1.0</w:t>
-            </w:r>
-          </w:p>
-        </w:tc>
-        <w:tc>
-          <w:tcPr>
-            <w:tcW w:type="dxa" w:w="3572"/>
-          </w:tcPr>
-          <w:p>
-            <w:r>
-              <w:rPr>
-                <w:b w:val="0"/>
-                <w:color w:val="CC0000"/>
-                <w:sz w:val="16"/>
-              </w:rPr>
-              <w:t xml:space="preserve">Unitate de măsură diferită: referință buc, ofertat </w:t>
+              <w:t>Articol lipsă din ofertă</w:t>
             </w:r>
           </w:p>
         </w:tc>
@@ -7428,315 +7917,147 @@
           <w:tcPr>
             <w:tcW w:type="dxa" w:w="397"/>
           </w:tcPr>
-          <w:p>
-            <w:r>
-              <w:rPr>
-                <w:b w:val="0"/>
-                <w:sz w:val="16"/>
-              </w:rPr>
-              <w:t>45</w:t>
-            </w:r>
-          </w:p>
+          <w:p/>
         </w:tc>
         <w:tc>
           <w:tcPr>
             <w:tcW w:type="dxa" w:w="1701"/>
-          </w:tcPr>
-          <w:p>
-            <w:r>
-              <w:rPr>
-                <w:b w:val="0"/>
-                <w:sz w:val="16"/>
-              </w:rPr>
-              <w:t>226428 - INSTALATII SANITARE OB. 4</w:t>
+            <w:shd w:fill="D9D9D9" w:val="clear"/>
+          </w:tcPr>
+          <w:p>
+            <w:r>
+              <w:rPr>
+                <w:b/>
+                <w:color w:val="000000"/>
+                <w:sz w:val="18"/>
+              </w:rPr>
+              <w:t>SUMAR</w:t>
             </w:r>
           </w:p>
         </w:tc>
         <w:tc>
           <w:tcPr>
             <w:tcW w:type="dxa" w:w="850"/>
-          </w:tcPr>
-          <w:p>
-            <w:r>
-              <w:rPr>
-                <w:b w:val="0"/>
-                <w:sz w:val="16"/>
-              </w:rPr>
-              <w:t>SC31A1</w:t>
+            <w:shd w:fill="D9D9D9" w:val="clear"/>
+          </w:tcPr>
+          <w:p>
+            <w:r>
+              <w:rPr>
+                <w:b/>
+                <w:color w:val="000000"/>
+                <w:sz w:val="18"/>
+              </w:rPr>
+              <w:t>Neconformitati: 1 din 17 articole ref.</w:t>
             </w:r>
           </w:p>
         </w:tc>
         <w:tc>
           <w:tcPr>
             <w:tcW w:type="dxa" w:w="1984"/>
-          </w:tcPr>
-          <w:p>
-            <w:r>
-              <w:rPr>
-                <w:b w:val="0"/>
-                <w:sz w:val="16"/>
-              </w:rPr>
-              <w:t>ventil de scurgere tip</w:t>
-            </w:r>
+            <w:shd w:fill="D9D9D9" w:val="clear"/>
+          </w:tcPr>
+          <w:p>
+            <w:r/>
           </w:p>
         </w:tc>
         <w:tc>
           <w:tcPr>
             <w:tcW w:type="dxa" w:w="454"/>
-          </w:tcPr>
-          <w:p>
-            <w:r>
-              <w:rPr>
-                <w:b w:val="0"/>
-                <w:sz w:val="16"/>
-              </w:rPr>
-              <w:t>buc</w:t>
-            </w:r>
+            <w:shd w:fill="D9D9D9" w:val="clear"/>
+          </w:tcPr>
+          <w:p>
+            <w:r/>
           </w:p>
         </w:tc>
         <w:tc>
           <w:tcPr>
             <w:tcW w:type="dxa" w:w="680"/>
-          </w:tcPr>
-          <w:p>
-            <w:r>
-              <w:rPr>
-                <w:b w:val="0"/>
-                <w:color w:val="CC0000"/>
-                <w:sz w:val="16"/>
-              </w:rPr>
-              <w:t>9.0</w:t>
-            </w:r>
+            <w:shd w:fill="D9D9D9" w:val="clear"/>
+          </w:tcPr>
+          <w:p>
+            <w:r/>
           </w:p>
         </w:tc>
         <w:tc>
           <w:tcPr>
             <w:tcW w:type="dxa" w:w="850"/>
-          </w:tcPr>
-          <w:p>
-            <w:r>
-              <w:rPr>
-                <w:b w:val="0"/>
-                <w:sz w:val="16"/>
-              </w:rPr>
-              <w:t>SC31A1</w:t>
+            <w:shd w:fill="D9D9D9" w:val="clear"/>
+          </w:tcPr>
+          <w:p>
+            <w:pPr>
+              <w:jc w:val="center"/>
+            </w:pPr>
+            <w:r>
+              <w:rPr>
+                <w:b/>
+                <w:color w:val="000000"/>
+                <w:sz w:val="18"/>
+              </w:rPr>
+              <w:t>17</w:t>
             </w:r>
           </w:p>
         </w:tc>
         <w:tc>
           <w:tcPr>
             <w:tcW w:type="dxa" w:w="1984"/>
-          </w:tcPr>
-          <w:p>
-            <w:r>
-              <w:rPr>
-                <w:b w:val="0"/>
-                <w:sz w:val="16"/>
-              </w:rPr>
-              <w:t>ventil de scurgere tip ...</w:t>
-            </w:r>
+            <w:shd w:fill="D9D9D9" w:val="clear"/>
+          </w:tcPr>
+          <w:p>
+            <w:r/>
           </w:p>
         </w:tc>
         <w:tc>
           <w:tcPr>
             <w:tcW w:type="dxa" w:w="454"/>
-          </w:tcPr>
-          <w:p>
-            <w:r>
-              <w:rPr>
-                <w:b w:val="0"/>
-                <w:sz w:val="16"/>
-              </w:rPr>
-              <w:t>buc</w:t>
-            </w:r>
+            <w:shd w:fill="D9D9D9" w:val="clear"/>
+          </w:tcPr>
+          <w:p>
+            <w:r/>
           </w:p>
         </w:tc>
         <w:tc>
           <w:tcPr>
             <w:tcW w:type="dxa" w:w="680"/>
-          </w:tcPr>
-          <w:p>
-            <w:r>
-              <w:rPr>
-                <w:b w:val="0"/>
-                <w:color w:val="CC0000"/>
-                <w:sz w:val="16"/>
-              </w:rPr>
-              <w:t>5.14</w:t>
+            <w:shd w:fill="D9D9D9" w:val="clear"/>
+          </w:tcPr>
+          <w:p>
+            <w:pPr>
+              <w:jc w:val="center"/>
+            </w:pPr>
+            <w:r>
+              <w:rPr>
+                <w:b/>
+                <w:color w:val="000000"/>
+                <w:sz w:val="18"/>
+              </w:rPr>
+              <w:t>17</w:t>
             </w:r>
           </w:p>
         </w:tc>
         <w:tc>
           <w:tcPr>
             <w:tcW w:type="dxa" w:w="3572"/>
-          </w:tcPr>
-          <w:p>
-            <w:r>
-              <w:rPr>
-                <w:b w:val="0"/>
-                <w:color w:val="CC0000"/>
-                <w:sz w:val="16"/>
-              </w:rPr>
-              <w:t>Cantitate diferită: referință 9.0 buc, ofertat 5.14 buc</w:t>
-            </w:r>
+            <w:shd w:fill="D9D9D9" w:val="clear"/>
+          </w:tcPr>
+          <w:p>
+            <w:r/>
           </w:p>
         </w:tc>
       </w:tr>
       <w:tr>
         <w:tc>
           <w:tcPr>
-            <w:tcW w:type="dxa" w:w="397"/>
-          </w:tcPr>
-          <w:p>
-            <w:r>
-              <w:rPr>
-                <w:b w:val="0"/>
-                <w:sz w:val="16"/>
-              </w:rPr>
-              <w:t>46</w:t>
-            </w:r>
-          </w:p>
-        </w:tc>
-        <w:tc>
-          <w:tcPr>
-            <w:tcW w:type="dxa" w:w="1701"/>
-          </w:tcPr>
-          <w:p>
-            <w:r>
-              <w:rPr>
-                <w:b w:val="0"/>
-                <w:sz w:val="16"/>
-              </w:rPr>
-              <w:t>226428 - INSTALATII SANITARE OB. 4</w:t>
-            </w:r>
-          </w:p>
-        </w:tc>
-        <w:tc>
-          <w:tcPr>
-            <w:tcW w:type="dxa" w:w="850"/>
-          </w:tcPr>
-          <w:p>
-            <w:r>
-              <w:rPr>
-                <w:b w:val="0"/>
-                <w:sz w:val="16"/>
-              </w:rPr>
-              <w:t>$4203179</w:t>
-            </w:r>
-          </w:p>
-        </w:tc>
-        <w:tc>
-          <w:tcPr>
-            <w:tcW w:type="dxa" w:w="1984"/>
-          </w:tcPr>
-          <w:p>
-            <w:r>
-              <w:rPr>
-                <w:b w:val="0"/>
-                <w:sz w:val="16"/>
-              </w:rPr>
-              <w:t>ventil scurgere lavoar, bideu 1 1/4'''' fara ra...</w:t>
-            </w:r>
-          </w:p>
-        </w:tc>
-        <w:tc>
-          <w:tcPr>
-            <w:tcW w:type="dxa" w:w="454"/>
-          </w:tcPr>
-          <w:p>
-            <w:r>
-              <w:rPr>
-                <w:b w:val="0"/>
-                <w:sz w:val="16"/>
-              </w:rPr>
-              <w:t>buc</w:t>
-            </w:r>
-          </w:p>
-        </w:tc>
-        <w:tc>
-          <w:tcPr>
-            <w:tcW w:type="dxa" w:w="680"/>
-          </w:tcPr>
-          <w:p>
-            <w:r>
-              <w:rPr>
-                <w:b w:val="0"/>
-                <w:color w:val="CC0000"/>
-                <w:sz w:val="16"/>
-              </w:rPr>
-              <w:t>9.0</w:t>
-            </w:r>
-          </w:p>
-        </w:tc>
-        <w:tc>
-          <w:tcPr>
-            <w:tcW w:type="dxa" w:w="850"/>
-          </w:tcPr>
-          <w:p>
-            <w:r>
-              <w:rPr>
-                <w:b w:val="0"/>
-                <w:sz w:val="16"/>
-              </w:rPr>
-              <w:t>$4203179</w:t>
-            </w:r>
-          </w:p>
-        </w:tc>
-        <w:tc>
-          <w:tcPr>
-            <w:tcW w:type="dxa" w:w="1984"/>
-          </w:tcPr>
-          <w:p>
-            <w:r>
-              <w:rPr>
-                <w:b w:val="0"/>
-                <w:sz w:val="16"/>
-              </w:rPr>
-              <w:t>ventil scurgere lavoar, bideu 1 1/4' fara racor...</w:t>
-            </w:r>
-          </w:p>
-        </w:tc>
-        <w:tc>
-          <w:tcPr>
-            <w:tcW w:type="dxa" w:w="454"/>
-          </w:tcPr>
-          <w:p>
-            <w:r>
-              <w:rPr>
-                <w:b w:val="0"/>
-                <w:sz w:val="16"/>
-              </w:rPr>
-              <w:t>buc</w:t>
-            </w:r>
-          </w:p>
-        </w:tc>
-        <w:tc>
-          <w:tcPr>
-            <w:tcW w:type="dxa" w:w="680"/>
-          </w:tcPr>
-          <w:p>
-            <w:r>
-              <w:rPr>
-                <w:b w:val="0"/>
-                <w:color w:val="CC0000"/>
-                <w:sz w:val="16"/>
-              </w:rPr>
-              <w:t>0.0</w:t>
-            </w:r>
-          </w:p>
-        </w:tc>
-        <w:tc>
-          <w:tcPr>
             <w:tcW w:type="dxa" w:w="3572"/>
-          </w:tcPr>
-          <w:p>
-            <w:r>
-              <w:rPr>
-                <w:b w:val="0"/>
-                <w:color w:val="CC0000"/>
-                <w:sz w:val="16"/>
-              </w:rPr>
-              <w:t>Cantitate diferită: referință 9.0 buc, ofertat 0.0 buc</w:t>
+            <w:gridSpan w:val="11"/>
+            <w:shd w:fill="D9D9D9" w:val="clear"/>
+          </w:tcPr>
+          <w:p>
+            <w:r>
+              <w:rPr>
+                <w:b/>
+                <w:sz w:val="18"/>
+              </w:rPr>
+              <w:t>Capitol de lucrări 226428 — INSTALATII SANITARE OB. 4  │  LIPSA: 0  │  EXTRA: 2  │  Delta: +2</w:t>
             </w:r>
           </w:p>
         </w:tc>
@@ -7752,7 +8073,7 @@
                 <w:b w:val="0"/>
                 <w:sz w:val="16"/>
               </w:rPr>
-              <w:t>47</w:t>
+              <w:t>49</w:t>
             </w:r>
           </w:p>
         </w:tc>
@@ -7780,7 +8101,7 @@
                 <w:b w:val="0"/>
                 <w:sz w:val="16"/>
               </w:rPr>
-              <w:t>SD06A1</w:t>
+              <w:t>$3270244</w:t>
             </w:r>
           </w:p>
         </w:tc>
@@ -7794,7 +8115,7 @@
                 <w:b w:val="0"/>
                 <w:sz w:val="16"/>
               </w:rPr>
-              <w:t>baterie amestecatoare, stativa, pentru lavoar a...</w:t>
+              <w:t>reductie ppr 50-40</w:t>
             </w:r>
           </w:p>
         </w:tc>
@@ -7806,6 +8127,7 @@
             <w:r>
               <w:rPr>
                 <w:b w:val="0"/>
+                <w:color w:val="CC0000"/>
                 <w:sz w:val="16"/>
               </w:rPr>
               <w:t>buc</w:t>
@@ -7820,52 +8142,51 @@
             <w:r>
               <w:rPr>
                 <w:b w:val="0"/>
+                <w:sz w:val="16"/>
+              </w:rPr>
+              <w:t>1.0</w:t>
+            </w:r>
+          </w:p>
+        </w:tc>
+        <w:tc>
+          <w:tcPr>
+            <w:tcW w:type="dxa" w:w="850"/>
+          </w:tcPr>
+          <w:p>
+            <w:r>
+              <w:rPr>
+                <w:b w:val="0"/>
+                <w:sz w:val="16"/>
+              </w:rPr>
+              <w:t>$3270244</w:t>
+            </w:r>
+          </w:p>
+        </w:tc>
+        <w:tc>
+          <w:tcPr>
+            <w:tcW w:type="dxa" w:w="1984"/>
+          </w:tcPr>
+          <w:p>
+            <w:r>
+              <w:rPr>
+                <w:b w:val="0"/>
+                <w:sz w:val="16"/>
+              </w:rPr>
+              <w:t>reductie ppr 50-40 b?c.</w:t>
+            </w:r>
+          </w:p>
+        </w:tc>
+        <w:tc>
+          <w:tcPr>
+            <w:tcW w:type="dxa" w:w="454"/>
+          </w:tcPr>
+          <w:p>
+            <w:r>
+              <w:rPr>
+                <w:b w:val="0"/>
                 <w:color w:val="CC0000"/>
                 <w:sz w:val="16"/>
               </w:rPr>
-              <w:t>9.0</w:t>
-            </w:r>
-          </w:p>
-        </w:tc>
-        <w:tc>
-          <w:tcPr>
-            <w:tcW w:type="dxa" w:w="850"/>
-          </w:tcPr>
-          <w:p>
-            <w:r>
-              <w:rPr>
-                <w:b w:val="0"/>
-                <w:sz w:val="16"/>
-              </w:rPr>
-              <w:t>SD06A1</w:t>
-            </w:r>
-          </w:p>
-        </w:tc>
-        <w:tc>
-          <w:tcPr>
-            <w:tcW w:type="dxa" w:w="1984"/>
-          </w:tcPr>
-          <w:p>
-            <w:r>
-              <w:rPr>
-                <w:b w:val="0"/>
-                <w:sz w:val="16"/>
-              </w:rPr>
-              <w:t>baterie amestecatoare , stativa, pentru lavoar ...</w:t>
-            </w:r>
-          </w:p>
-        </w:tc>
-        <w:tc>
-          <w:tcPr>
-            <w:tcW w:type="dxa" w:w="454"/>
-          </w:tcPr>
-          <w:p>
-            <w:r>
-              <w:rPr>
-                <w:b w:val="0"/>
-                <w:sz w:val="16"/>
-              </w:rPr>
-              <w:t>buc</w:t>
             </w:r>
           </w:p>
         </w:tc>
@@ -7877,25 +8198,24 @@
             <w:r>
               <w:rPr>
                 <w:b w:val="0"/>
+                <w:sz w:val="16"/>
+              </w:rPr>
+              <w:t>1.0</w:t>
+            </w:r>
+          </w:p>
+        </w:tc>
+        <w:tc>
+          <w:tcPr>
+            <w:tcW w:type="dxa" w:w="3572"/>
+          </w:tcPr>
+          <w:p>
+            <w:r>
+              <w:rPr>
+                <w:b w:val="0"/>
                 <w:color w:val="CC0000"/>
                 <w:sz w:val="16"/>
               </w:rPr>
-              <w:t>51.75</w:t>
-            </w:r>
-          </w:p>
-        </w:tc>
-        <w:tc>
-          <w:tcPr>
-            <w:tcW w:type="dxa" w:w="3572"/>
-          </w:tcPr>
-          <w:p>
-            <w:r>
-              <w:rPr>
-                <w:b w:val="0"/>
-                <w:color w:val="CC0000"/>
-                <w:sz w:val="16"/>
-              </w:rPr>
-              <w:t>Cantitate diferită: referință 9.0 buc, ofertat 51.75 buc</w:t>
+              <w:t xml:space="preserve">Unitate de măsură diferită: referință buc, ofertat </w:t>
             </w:r>
           </w:p>
         </w:tc>
@@ -7911,7 +8231,7 @@
                 <w:b w:val="0"/>
                 <w:sz w:val="16"/>
               </w:rPr>
-              <w:t>48</w:t>
+              <w:t>50</w:t>
             </w:r>
           </w:p>
         </w:tc>
@@ -7939,7 +8259,7 @@
                 <w:b w:val="0"/>
                 <w:sz w:val="16"/>
               </w:rPr>
-              <w:t>$3272003</w:t>
+              <w:t>SC31A1</w:t>
             </w:r>
           </w:p>
         </w:tc>
@@ -7953,7 +8273,7 @@
                 <w:b w:val="0"/>
                 <w:sz w:val="16"/>
               </w:rPr>
-              <w:t>baterie monocomanda pentru lavoar</w:t>
+              <w:t>ventil de scurgere tip</w:t>
             </w:r>
           </w:p>
         </w:tc>
@@ -7996,7 +8316,7 @@
                 <w:b w:val="0"/>
                 <w:sz w:val="16"/>
               </w:rPr>
-              <w:t>$3272003</w:t>
+              <w:t>SC31A1</w:t>
             </w:r>
           </w:p>
         </w:tc>
@@ -8010,7 +8330,7 @@
                 <w:b w:val="0"/>
                 <w:sz w:val="16"/>
               </w:rPr>
-              <w:t>baterie monocomanda pentru lavoar</w:t>
+              <w:t>ventil de scurgere tip ...</w:t>
             </w:r>
           </w:p>
         </w:tc>
@@ -8039,7 +8359,7 @@
                 <w:color w:val="CC0000"/>
                 <w:sz w:val="16"/>
               </w:rPr>
-              <w:t>0.0</w:t>
+              <w:t>5.14</w:t>
             </w:r>
           </w:p>
         </w:tc>
@@ -8054,7 +8374,7 @@
                 <w:color w:val="CC0000"/>
                 <w:sz w:val="16"/>
               </w:rPr>
-              <w:t>Cantitate diferită: referință 9.0 buc, ofertat 0.0 buc</w:t>
+              <w:t>Cantitate diferită: referință 9.0 buc, ofertat 5.14 buc</w:t>
             </w:r>
           </w:p>
         </w:tc>
@@ -8070,7 +8390,7 @@
                 <w:b w:val="0"/>
                 <w:sz w:val="16"/>
               </w:rPr>
-              <w:t>49</w:t>
+              <w:t>51</w:t>
             </w:r>
           </w:p>
         </w:tc>
@@ -8098,7 +8418,7 @@
                 <w:b w:val="0"/>
                 <w:sz w:val="16"/>
               </w:rPr>
-              <w:t>$2222227</w:t>
+              <w:t>$4203179</w:t>
             </w:r>
           </w:p>
         </w:tc>
@@ -8112,7 +8432,7 @@
                 <w:b w:val="0"/>
                 <w:sz w:val="16"/>
               </w:rPr>
-              <w:t>dispenser inox servetele hartie</w:t>
+              <w:t>ventil scurgere lavoar, bideu 1 1/4'''' fara ra...</w:t>
             </w:r>
           </w:p>
         </w:tc>
@@ -8124,9 +8444,65 @@
             <w:r>
               <w:rPr>
                 <w:b w:val="0"/>
+                <w:sz w:val="16"/>
+              </w:rPr>
+              <w:t>buc</w:t>
+            </w:r>
+          </w:p>
+        </w:tc>
+        <w:tc>
+          <w:tcPr>
+            <w:tcW w:type="dxa" w:w="680"/>
+          </w:tcPr>
+          <w:p>
+            <w:r>
+              <w:rPr>
+                <w:b w:val="0"/>
                 <w:color w:val="CC0000"/>
                 <w:sz w:val="16"/>
               </w:rPr>
+              <w:t>9.0</w:t>
+            </w:r>
+          </w:p>
+        </w:tc>
+        <w:tc>
+          <w:tcPr>
+            <w:tcW w:type="dxa" w:w="850"/>
+          </w:tcPr>
+          <w:p>
+            <w:r>
+              <w:rPr>
+                <w:b w:val="0"/>
+                <w:sz w:val="16"/>
+              </w:rPr>
+              <w:t>$4203179</w:t>
+            </w:r>
+          </w:p>
+        </w:tc>
+        <w:tc>
+          <w:tcPr>
+            <w:tcW w:type="dxa" w:w="1984"/>
+          </w:tcPr>
+          <w:p>
+            <w:r>
+              <w:rPr>
+                <w:b w:val="0"/>
+                <w:sz w:val="16"/>
+              </w:rPr>
+              <w:t>ventil scurgere lavoar, bideu 1 1/4' fara racor...</w:t>
+            </w:r>
+          </w:p>
+        </w:tc>
+        <w:tc>
+          <w:tcPr>
+            <w:tcW w:type="dxa" w:w="454"/>
+          </w:tcPr>
+          <w:p>
+            <w:r>
+              <w:rPr>
+                <w:b w:val="0"/>
+                <w:sz w:val="16"/>
+              </w:rPr>
               <w:t>buc</w:t>
             </w:r>
           </w:p>
@@ -8139,65 +8515,10 @@
             <w:r>
               <w:rPr>
                 <w:b w:val="0"/>
-                <w:sz w:val="16"/>
-              </w:rPr>
-              <w:t>9.0</w:t>
-            </w:r>
-          </w:p>
-        </w:tc>
-        <w:tc>
-          <w:tcPr>
-            <w:tcW w:type="dxa" w:w="850"/>
-          </w:tcPr>
-          <w:p>
-            <w:r>
-              <w:rPr>
-                <w:b w:val="0"/>
-                <w:sz w:val="16"/>
-              </w:rPr>
-              <w:t>$2222227</w:t>
-            </w:r>
-          </w:p>
-        </w:tc>
-        <w:tc>
-          <w:tcPr>
-            <w:tcW w:type="dxa" w:w="1984"/>
-          </w:tcPr>
-          <w:p>
-            <w:r>
-              <w:rPr>
-                <w:b w:val="0"/>
-                <w:sz w:val="16"/>
-              </w:rPr>
-              <w:t>dispenser inox servetele hartie b?c.</w:t>
-            </w:r>
-          </w:p>
-        </w:tc>
-        <w:tc>
-          <w:tcPr>
-            <w:tcW w:type="dxa" w:w="454"/>
-          </w:tcPr>
-          <w:p>
-            <w:r>
-              <w:rPr>
-                <w:b w:val="0"/>
                 <w:color w:val="CC0000"/>
                 <w:sz w:val="16"/>
               </w:rPr>
-            </w:r>
-          </w:p>
-        </w:tc>
-        <w:tc>
-          <w:tcPr>
-            <w:tcW w:type="dxa" w:w="680"/>
-          </w:tcPr>
-          <w:p>
-            <w:r>
-              <w:rPr>
-                <w:b w:val="0"/>
-                <w:sz w:val="16"/>
-              </w:rPr>
-              <w:t>9.0</w:t>
+              <w:t>0.0</w:t>
             </w:r>
           </w:p>
         </w:tc>
@@ -8212,7 +8533,7 @@
                 <w:color w:val="CC0000"/>
                 <w:sz w:val="16"/>
               </w:rPr>
-              <w:t xml:space="preserve">Unitate de măsură diferită: referință buc, ofertat </w:t>
+              <w:t>Cantitate diferită: referință 9.0 buc, ofertat 0.0 buc</w:t>
             </w:r>
           </w:p>
         </w:tc>
@@ -8228,7 +8549,483 @@
                 <w:b w:val="0"/>
                 <w:sz w:val="16"/>
               </w:rPr>
-              <w:t>50</w:t>
+              <w:t>52</w:t>
+            </w:r>
+          </w:p>
+        </w:tc>
+        <w:tc>
+          <w:tcPr>
+            <w:tcW w:type="dxa" w:w="1701"/>
+          </w:tcPr>
+          <w:p>
+            <w:r>
+              <w:rPr>
+                <w:b w:val="0"/>
+                <w:sz w:val="16"/>
+              </w:rPr>
+              <w:t>226428 - INSTALATII SANITARE OB. 4</w:t>
+            </w:r>
+          </w:p>
+        </w:tc>
+        <w:tc>
+          <w:tcPr>
+            <w:tcW w:type="dxa" w:w="850"/>
+          </w:tcPr>
+          <w:p>
+            <w:r>
+              <w:rPr>
+                <w:b w:val="0"/>
+                <w:sz w:val="16"/>
+              </w:rPr>
+              <w:t>SD06A1</w:t>
+            </w:r>
+          </w:p>
+        </w:tc>
+        <w:tc>
+          <w:tcPr>
+            <w:tcW w:type="dxa" w:w="1984"/>
+          </w:tcPr>
+          <w:p>
+            <w:r>
+              <w:rPr>
+                <w:b w:val="0"/>
+                <w:sz w:val="16"/>
+              </w:rPr>
+              <w:t>baterie amestecatoare, stativa, pentru lavoar a...</w:t>
+            </w:r>
+          </w:p>
+        </w:tc>
+        <w:tc>
+          <w:tcPr>
+            <w:tcW w:type="dxa" w:w="454"/>
+          </w:tcPr>
+          <w:p>
+            <w:r>
+              <w:rPr>
+                <w:b w:val="0"/>
+                <w:sz w:val="16"/>
+              </w:rPr>
+              <w:t>buc</w:t>
+            </w:r>
+          </w:p>
+        </w:tc>
+        <w:tc>
+          <w:tcPr>
+            <w:tcW w:type="dxa" w:w="680"/>
+          </w:tcPr>
+          <w:p>
+            <w:r>
+              <w:rPr>
+                <w:b w:val="0"/>
+                <w:color w:val="CC0000"/>
+                <w:sz w:val="16"/>
+              </w:rPr>
+              <w:t>9.0</w:t>
+            </w:r>
+          </w:p>
+        </w:tc>
+        <w:tc>
+          <w:tcPr>
+            <w:tcW w:type="dxa" w:w="850"/>
+          </w:tcPr>
+          <w:p>
+            <w:r>
+              <w:rPr>
+                <w:b w:val="0"/>
+                <w:sz w:val="16"/>
+              </w:rPr>
+              <w:t>SD06A1</w:t>
+            </w:r>
+          </w:p>
+        </w:tc>
+        <w:tc>
+          <w:tcPr>
+            <w:tcW w:type="dxa" w:w="1984"/>
+          </w:tcPr>
+          <w:p>
+            <w:r>
+              <w:rPr>
+                <w:b w:val="0"/>
+                <w:sz w:val="16"/>
+              </w:rPr>
+              <w:t>baterie amestecatoare , stativa, pentru lavoar ...</w:t>
+            </w:r>
+          </w:p>
+        </w:tc>
+        <w:tc>
+          <w:tcPr>
+            <w:tcW w:type="dxa" w:w="454"/>
+          </w:tcPr>
+          <w:p>
+            <w:r>
+              <w:rPr>
+                <w:b w:val="0"/>
+                <w:sz w:val="16"/>
+              </w:rPr>
+              <w:t>buc</w:t>
+            </w:r>
+          </w:p>
+        </w:tc>
+        <w:tc>
+          <w:tcPr>
+            <w:tcW w:type="dxa" w:w="680"/>
+          </w:tcPr>
+          <w:p>
+            <w:r>
+              <w:rPr>
+                <w:b w:val="0"/>
+                <w:color w:val="CC0000"/>
+                <w:sz w:val="16"/>
+              </w:rPr>
+              <w:t>51.75</w:t>
+            </w:r>
+          </w:p>
+        </w:tc>
+        <w:tc>
+          <w:tcPr>
+            <w:tcW w:type="dxa" w:w="3572"/>
+          </w:tcPr>
+          <w:p>
+            <w:r>
+              <w:rPr>
+                <w:b w:val="0"/>
+                <w:color w:val="CC0000"/>
+                <w:sz w:val="16"/>
+              </w:rPr>
+              <w:t>Cantitate diferită: referință 9.0 buc, ofertat 51.75 buc</w:t>
+            </w:r>
+          </w:p>
+        </w:tc>
+      </w:tr>
+      <w:tr>
+        <w:tc>
+          <w:tcPr>
+            <w:tcW w:type="dxa" w:w="397"/>
+          </w:tcPr>
+          <w:p>
+            <w:r>
+              <w:rPr>
+                <w:b w:val="0"/>
+                <w:sz w:val="16"/>
+              </w:rPr>
+              <w:t>53</w:t>
+            </w:r>
+          </w:p>
+        </w:tc>
+        <w:tc>
+          <w:tcPr>
+            <w:tcW w:type="dxa" w:w="1701"/>
+          </w:tcPr>
+          <w:p>
+            <w:r>
+              <w:rPr>
+                <w:b w:val="0"/>
+                <w:sz w:val="16"/>
+              </w:rPr>
+              <w:t>226428 - INSTALATII SANITARE OB. 4</w:t>
+            </w:r>
+          </w:p>
+        </w:tc>
+        <w:tc>
+          <w:tcPr>
+            <w:tcW w:type="dxa" w:w="850"/>
+          </w:tcPr>
+          <w:p>
+            <w:r>
+              <w:rPr>
+                <w:b w:val="0"/>
+                <w:sz w:val="16"/>
+              </w:rPr>
+              <w:t>$3272003</w:t>
+            </w:r>
+          </w:p>
+        </w:tc>
+        <w:tc>
+          <w:tcPr>
+            <w:tcW w:type="dxa" w:w="1984"/>
+          </w:tcPr>
+          <w:p>
+            <w:r>
+              <w:rPr>
+                <w:b w:val="0"/>
+                <w:sz w:val="16"/>
+              </w:rPr>
+              <w:t>baterie monocomanda pentru lavoar</w:t>
+            </w:r>
+          </w:p>
+        </w:tc>
+        <w:tc>
+          <w:tcPr>
+            <w:tcW w:type="dxa" w:w="454"/>
+          </w:tcPr>
+          <w:p>
+            <w:r>
+              <w:rPr>
+                <w:b w:val="0"/>
+                <w:sz w:val="16"/>
+              </w:rPr>
+              <w:t>buc</w:t>
+            </w:r>
+          </w:p>
+        </w:tc>
+        <w:tc>
+          <w:tcPr>
+            <w:tcW w:type="dxa" w:w="680"/>
+          </w:tcPr>
+          <w:p>
+            <w:r>
+              <w:rPr>
+                <w:b w:val="0"/>
+                <w:color w:val="CC0000"/>
+                <w:sz w:val="16"/>
+              </w:rPr>
+              <w:t>9.0</w:t>
+            </w:r>
+          </w:p>
+        </w:tc>
+        <w:tc>
+          <w:tcPr>
+            <w:tcW w:type="dxa" w:w="850"/>
+          </w:tcPr>
+          <w:p>
+            <w:r>
+              <w:rPr>
+                <w:b w:val="0"/>
+                <w:sz w:val="16"/>
+              </w:rPr>
+              <w:t>$3272003</w:t>
+            </w:r>
+          </w:p>
+        </w:tc>
+        <w:tc>
+          <w:tcPr>
+            <w:tcW w:type="dxa" w:w="1984"/>
+          </w:tcPr>
+          <w:p>
+            <w:r>
+              <w:rPr>
+                <w:b w:val="0"/>
+                <w:sz w:val="16"/>
+              </w:rPr>
+              <w:t>baterie monocomanda pentru lavoar</w:t>
+            </w:r>
+          </w:p>
+        </w:tc>
+        <w:tc>
+          <w:tcPr>
+            <w:tcW w:type="dxa" w:w="454"/>
+          </w:tcPr>
+          <w:p>
+            <w:r>
+              <w:rPr>
+                <w:b w:val="0"/>
+                <w:sz w:val="16"/>
+              </w:rPr>
+              <w:t>buc</w:t>
+            </w:r>
+          </w:p>
+        </w:tc>
+        <w:tc>
+          <w:tcPr>
+            <w:tcW w:type="dxa" w:w="680"/>
+          </w:tcPr>
+          <w:p>
+            <w:r>
+              <w:rPr>
+                <w:b w:val="0"/>
+                <w:color w:val="CC0000"/>
+                <w:sz w:val="16"/>
+              </w:rPr>
+              <w:t>0.0</w:t>
+            </w:r>
+          </w:p>
+        </w:tc>
+        <w:tc>
+          <w:tcPr>
+            <w:tcW w:type="dxa" w:w="3572"/>
+          </w:tcPr>
+          <w:p>
+            <w:r>
+              <w:rPr>
+                <w:b w:val="0"/>
+                <w:color w:val="CC0000"/>
+                <w:sz w:val="16"/>
+              </w:rPr>
+              <w:t>Cantitate diferită: referință 9.0 buc, ofertat 0.0 buc</w:t>
+            </w:r>
+          </w:p>
+        </w:tc>
+      </w:tr>
+      <w:tr>
+        <w:tc>
+          <w:tcPr>
+            <w:tcW w:type="dxa" w:w="397"/>
+          </w:tcPr>
+          <w:p>
+            <w:r>
+              <w:rPr>
+                <w:b w:val="0"/>
+                <w:sz w:val="16"/>
+              </w:rPr>
+              <w:t>54</w:t>
+            </w:r>
+          </w:p>
+        </w:tc>
+        <w:tc>
+          <w:tcPr>
+            <w:tcW w:type="dxa" w:w="1701"/>
+          </w:tcPr>
+          <w:p>
+            <w:r>
+              <w:rPr>
+                <w:b w:val="0"/>
+                <w:sz w:val="16"/>
+              </w:rPr>
+              <w:t>226428 - INSTALATII SANITARE OB. 4</w:t>
+            </w:r>
+          </w:p>
+        </w:tc>
+        <w:tc>
+          <w:tcPr>
+            <w:tcW w:type="dxa" w:w="850"/>
+          </w:tcPr>
+          <w:p>
+            <w:r>
+              <w:rPr>
+                <w:b w:val="0"/>
+                <w:sz w:val="16"/>
+              </w:rPr>
+              <w:t>$2222227</w:t>
+            </w:r>
+          </w:p>
+        </w:tc>
+        <w:tc>
+          <w:tcPr>
+            <w:tcW w:type="dxa" w:w="1984"/>
+          </w:tcPr>
+          <w:p>
+            <w:r>
+              <w:rPr>
+                <w:b w:val="0"/>
+                <w:sz w:val="16"/>
+              </w:rPr>
+              <w:t>dispenser inox servetele hartie</w:t>
+            </w:r>
+          </w:p>
+        </w:tc>
+        <w:tc>
+          <w:tcPr>
+            <w:tcW w:type="dxa" w:w="454"/>
+          </w:tcPr>
+          <w:p>
+            <w:r>
+              <w:rPr>
+                <w:b w:val="0"/>
+                <w:color w:val="CC0000"/>
+                <w:sz w:val="16"/>
+              </w:rPr>
+              <w:t>buc</w:t>
+            </w:r>
+          </w:p>
+        </w:tc>
+        <w:tc>
+          <w:tcPr>
+            <w:tcW w:type="dxa" w:w="680"/>
+          </w:tcPr>
+          <w:p>
+            <w:r>
+              <w:rPr>
+                <w:b w:val="0"/>
+                <w:sz w:val="16"/>
+              </w:rPr>
+              <w:t>9.0</w:t>
+            </w:r>
+          </w:p>
+        </w:tc>
+        <w:tc>
+          <w:tcPr>
+            <w:tcW w:type="dxa" w:w="850"/>
+          </w:tcPr>
+          <w:p>
+            <w:r>
+              <w:rPr>
+                <w:b w:val="0"/>
+                <w:sz w:val="16"/>
+              </w:rPr>
+              <w:t>$2222227</w:t>
+            </w:r>
+          </w:p>
+        </w:tc>
+        <w:tc>
+          <w:tcPr>
+            <w:tcW w:type="dxa" w:w="1984"/>
+          </w:tcPr>
+          <w:p>
+            <w:r>
+              <w:rPr>
+                <w:b w:val="0"/>
+                <w:sz w:val="16"/>
+              </w:rPr>
+              <w:t>dispenser inox servetele hartie b?c.</w:t>
+            </w:r>
+          </w:p>
+        </w:tc>
+        <w:tc>
+          <w:tcPr>
+            <w:tcW w:type="dxa" w:w="454"/>
+          </w:tcPr>
+          <w:p>
+            <w:r>
+              <w:rPr>
+                <w:b w:val="0"/>
+                <w:color w:val="CC0000"/>
+                <w:sz w:val="16"/>
+              </w:rPr>
+            </w:r>
+          </w:p>
+        </w:tc>
+        <w:tc>
+          <w:tcPr>
+            <w:tcW w:type="dxa" w:w="680"/>
+          </w:tcPr>
+          <w:p>
+            <w:r>
+              <w:rPr>
+                <w:b w:val="0"/>
+                <w:sz w:val="16"/>
+              </w:rPr>
+              <w:t>9.0</w:t>
+            </w:r>
+          </w:p>
+        </w:tc>
+        <w:tc>
+          <w:tcPr>
+            <w:tcW w:type="dxa" w:w="3572"/>
+          </w:tcPr>
+          <w:p>
+            <w:r>
+              <w:rPr>
+                <w:b w:val="0"/>
+                <w:color w:val="CC0000"/>
+                <w:sz w:val="16"/>
+              </w:rPr>
+              <w:t xml:space="preserve">Unitate de măsură diferită: referință buc, ofertat </w:t>
+            </w:r>
+          </w:p>
+        </w:tc>
+      </w:tr>
+      <w:tr>
+        <w:tc>
+          <w:tcPr>
+            <w:tcW w:type="dxa" w:w="397"/>
+          </w:tcPr>
+          <w:p>
+            <w:r>
+              <w:rPr>
+                <w:b w:val="0"/>
+                <w:sz w:val="16"/>
+              </w:rPr>
+              <w:t>55</w:t>
             </w:r>
           </w:p>
         </w:tc>
@@ -8406,7 +9203,7 @@
                 <w:b w:val="0"/>
                 <w:sz w:val="16"/>
               </w:rPr>
-              <w:t>51</w:t>
+              <w:t>56</w:t>
             </w:r>
           </w:p>
         </w:tc>
@@ -8570,7 +9367,7 @@
                 <w:b w:val="0"/>
                 <w:sz w:val="16"/>
               </w:rPr>
-              <w:t>52</w:t>
+              <w:t>57</w:t>
             </w:r>
           </w:p>
         </w:tc>
@@ -8702,170 +9499,6 @@
                 <w:sz w:val="16"/>
               </w:rPr>
               <w:t>35.0</w:t>
-            </w:r>
-          </w:p>
-        </w:tc>
-        <w:tc>
-          <w:tcPr>
-            <w:tcW w:type="dxa" w:w="3572"/>
-            <w:shd w:fill="FFFF99" w:val="clear"/>
-          </w:tcPr>
-          <w:p>
-            <w:r>
-              <w:rPr>
-                <w:b w:val="0"/>
-                <w:color w:val="CC0000"/>
-                <w:sz w:val="16"/>
-              </w:rPr>
-              <w:t>Articol suplimentar în ofertă (nu există în referință)</w:t>
-            </w:r>
-          </w:p>
-        </w:tc>
-      </w:tr>
-      <w:tr>
-        <w:tc>
-          <w:tcPr>
-            <w:tcW w:type="dxa" w:w="397"/>
-            <w:shd w:fill="FFFF99" w:val="clear"/>
-          </w:tcPr>
-          <w:p>
-            <w:r>
-              <w:rPr>
-                <w:b w:val="0"/>
-                <w:sz w:val="16"/>
-              </w:rPr>
-              <w:t>53</w:t>
-            </w:r>
-          </w:p>
-        </w:tc>
-        <w:tc>
-          <w:tcPr>
-            <w:tcW w:type="dxa" w:w="1701"/>
-            <w:shd w:fill="FFFF99" w:val="clear"/>
-          </w:tcPr>
-          <w:p>
-            <w:r>
-              <w:rPr>
-                <w:b w:val="0"/>
-                <w:sz w:val="16"/>
-              </w:rPr>
-              <w:t>226428 - INSTALATII SANITARE OB. 4</w:t>
-            </w:r>
-          </w:p>
-        </w:tc>
-        <w:tc>
-          <w:tcPr>
-            <w:tcW w:type="dxa" w:w="850"/>
-            <w:shd w:fill="FFFF99" w:val="clear"/>
-          </w:tcPr>
-          <w:p>
-            <w:r>
-              <w:rPr>
-                <w:b w:val="0"/>
-                <w:sz w:val="16"/>
-              </w:rPr>
-            </w:r>
-          </w:p>
-        </w:tc>
-        <w:tc>
-          <w:tcPr>
-            <w:tcW w:type="dxa" w:w="1984"/>
-            <w:shd w:fill="FFFF99" w:val="clear"/>
-          </w:tcPr>
-          <w:p>
-            <w:r>
-              <w:rPr>
-                <w:b w:val="0"/>
-                <w:sz w:val="16"/>
-              </w:rPr>
-            </w:r>
-          </w:p>
-        </w:tc>
-        <w:tc>
-          <w:tcPr>
-            <w:tcW w:type="dxa" w:w="454"/>
-            <w:shd w:fill="FFFF99" w:val="clear"/>
-          </w:tcPr>
-          <w:p>
-            <w:r>
-              <w:rPr>
-                <w:b w:val="0"/>
-                <w:sz w:val="16"/>
-              </w:rPr>
-            </w:r>
-          </w:p>
-        </w:tc>
-        <w:tc>
-          <w:tcPr>
-            <w:tcW w:type="dxa" w:w="680"/>
-            <w:shd w:fill="FFFF99" w:val="clear"/>
-          </w:tcPr>
-          <w:p>
-            <w:r>
-              <w:rPr>
-                <w:b w:val="0"/>
-                <w:sz w:val="16"/>
-              </w:rPr>
-            </w:r>
-          </w:p>
-        </w:tc>
-        <w:tc>
-          <w:tcPr>
-            <w:tcW w:type="dxa" w:w="850"/>
-            <w:shd w:fill="FFFF99" w:val="clear"/>
-          </w:tcPr>
-          <w:p>
-            <w:r>
-              <w:rPr>
-                <w:b w:val="0"/>
-                <w:sz w:val="16"/>
-              </w:rPr>
-              <w:t>SA14B</w:t>
-            </w:r>
-          </w:p>
-        </w:tc>
-        <w:tc>
-          <w:tcPr>
-            <w:tcW w:type="dxa" w:w="1984"/>
-            <w:shd w:fill="FFFF99" w:val="clear"/>
-          </w:tcPr>
-          <w:p>
-            <w:r>
-              <w:rPr>
-                <w:b w:val="0"/>
-                <w:sz w:val="16"/>
-              </w:rPr>
-              <w:t>teava mat pl (pp, pe, pp-r) imbinare prin sudur...</w:t>
-            </w:r>
-          </w:p>
-        </w:tc>
-        <w:tc>
-          <w:tcPr>
-            <w:tcW w:type="dxa" w:w="454"/>
-            <w:shd w:fill="FFFF99" w:val="clear"/>
-          </w:tcPr>
-          <w:p>
-            <w:r>
-              <w:rPr>
-                <w:b w:val="0"/>
-                <w:sz w:val="16"/>
-              </w:rPr>
-              <w:t>m</w:t>
-            </w:r>
-          </w:p>
-        </w:tc>
-        <w:tc>
-          <w:tcPr>
-            <w:tcW w:type="dxa" w:w="680"/>
-            <w:shd w:fill="FFFF99" w:val="clear"/>
-          </w:tcPr>
-          <w:p>
-            <w:r>
-              <w:rPr>
-                <w:b w:val="0"/>
-                <w:sz w:val="16"/>
-              </w:rPr>
-              <w:t>70.0</w:t>
             </w:r>
           </w:p>
         </w:tc>
@@ -9047,7 +9680,7 @@
                 <w:b w:val="0"/>
                 <w:sz w:val="16"/>
               </w:rPr>
-              <w:t>55</w:t>
+              <w:t>59</w:t>
             </w:r>
           </w:p>
         </w:tc>
@@ -9225,7 +9858,7 @@
                 <w:b w:val="0"/>
                 <w:sz w:val="16"/>
               </w:rPr>
-              <w:t>56</w:t>
+              <w:t>60</w:t>
             </w:r>
           </w:p>
         </w:tc>
@@ -9538,7 +10171,7 @@
                 <w:b w:val="0"/>
                 <w:sz w:val="16"/>
               </w:rPr>
-              <w:t>58</w:t>
+              <w:t>62</w:t>
             </w:r>
           </w:p>
         </w:tc>
@@ -9697,7 +10330,7 @@
                 <w:b w:val="0"/>
                 <w:sz w:val="16"/>
               </w:rPr>
-              <w:t>59</w:t>
+              <w:t>63</w:t>
             </w:r>
           </w:p>
         </w:tc>
@@ -9855,7 +10488,7 @@
                 <w:b w:val="0"/>
                 <w:sz w:val="16"/>
               </w:rPr>
-              <w:t>60</w:t>
+              <w:t>64</w:t>
             </w:r>
           </w:p>
         </w:tc>
@@ -10013,7 +10646,7 @@
                 <w:b w:val="0"/>
                 <w:sz w:val="16"/>
               </w:rPr>
-              <w:t>61</w:t>
+              <w:t>65</w:t>
             </w:r>
           </w:p>
         </w:tc>
@@ -10171,7 +10804,7 @@
                 <w:b w:val="0"/>
                 <w:sz w:val="16"/>
               </w:rPr>
-              <w:t>62</w:t>
+              <w:t>66</w:t>
             </w:r>
           </w:p>
         </w:tc>
@@ -10463,7 +11096,7 @@
                 <w:b/>
                 <w:sz w:val="18"/>
               </w:rPr>
-              <w:t>Capitol de lucrări 226288 — SISTEM SUPRAVEGHEREA VIDEO -OB2  │  LIPSA: 0  │  EXTRA: 2  │  Delta: +2</w:t>
+              <w:t>Capitol de lucrări 226258  │  LIPSA: 0  │  EXTRA: 1  │  Delta: +1</w:t>
             </w:r>
           </w:p>
         </w:tc>
@@ -10499,7 +11132,7 @@
                 <w:b w:val="0"/>
                 <w:sz w:val="16"/>
               </w:rPr>
-              <w:t>64</w:t>
+              <w:t>68</w:t>
             </w:r>
           </w:p>
         </w:tc>
@@ -10514,7 +11147,7 @@
                 <w:b w:val="0"/>
                 <w:sz w:val="16"/>
               </w:rPr>
-              <w:t>226288 - SISTEM SUPRAVEGHEREA VIDEO -OB2</w:t>
+              <w:t>226258</w:t>
             </w:r>
           </w:p>
         </w:tc>
@@ -10585,7 +11218,7 @@
                 <w:b w:val="0"/>
                 <w:sz w:val="16"/>
               </w:rPr>
-              <w:t>TCB40A1</w:t>
+              <w:t>ED25A1</w:t>
             </w:r>
           </w:p>
         </w:tc>
@@ -10600,7 +11233,7 @@
                 <w:b w:val="0"/>
                 <w:sz w:val="16"/>
               </w:rPr>
-              <w:t>aparat telegr teleim transmit autom.</w:t>
+              <w:t>asim aparat electric antigrizutos sau antiexploziv</w:t>
             </w:r>
           </w:p>
         </w:tc>
@@ -10630,171 +11263,7 @@
                 <w:b w:val="0"/>
                 <w:sz w:val="16"/>
               </w:rPr>
-              <w:t>2.0</w:t>
-            </w:r>
-          </w:p>
-        </w:tc>
-        <w:tc>
-          <w:tcPr>
-            <w:tcW w:type="dxa" w:w="3572"/>
-            <w:shd w:fill="FFFF99" w:val="clear"/>
-          </w:tcPr>
-          <w:p>
-            <w:r>
-              <w:rPr>
-                <w:b w:val="0"/>
-                <w:color w:val="CC0000"/>
-                <w:sz w:val="16"/>
-              </w:rPr>
-              <w:t>Articol suplimentar în ofertă (nu există în referință)</w:t>
-            </w:r>
-          </w:p>
-        </w:tc>
-      </w:tr>
-      <w:tr>
-        <w:tc>
-          <w:tcPr>
-            <w:tcW w:type="dxa" w:w="397"/>
-            <w:shd w:fill="FFFF99" w:val="clear"/>
-          </w:tcPr>
-          <w:p>
-            <w:r>
-              <w:rPr>
-                <w:b w:val="0"/>
-                <w:sz w:val="16"/>
-              </w:rPr>
-              <w:t>65</w:t>
-            </w:r>
-          </w:p>
-        </w:tc>
-        <w:tc>
-          <w:tcPr>
-            <w:tcW w:type="dxa" w:w="1701"/>
-            <w:shd w:fill="FFFF99" w:val="clear"/>
-          </w:tcPr>
-          <w:p>
-            <w:r>
-              <w:rPr>
-                <w:b w:val="0"/>
-                <w:sz w:val="16"/>
-              </w:rPr>
-              <w:t>226288 - SISTEM SUPRAVEGHEREA VIDEO -OB2</w:t>
-            </w:r>
-          </w:p>
-        </w:tc>
-        <w:tc>
-          <w:tcPr>
-            <w:tcW w:type="dxa" w:w="850"/>
-            <w:shd w:fill="FFFF99" w:val="clear"/>
-          </w:tcPr>
-          <w:p>
-            <w:r>
-              <w:rPr>
-                <w:b w:val="0"/>
-                <w:sz w:val="16"/>
-              </w:rPr>
-            </w:r>
-          </w:p>
-        </w:tc>
-        <w:tc>
-          <w:tcPr>
-            <w:tcW w:type="dxa" w:w="1984"/>
-            <w:shd w:fill="FFFF99" w:val="clear"/>
-          </w:tcPr>
-          <w:p>
-            <w:r>
-              <w:rPr>
-                <w:b w:val="0"/>
-                <w:sz w:val="16"/>
-              </w:rPr>
-            </w:r>
-          </w:p>
-        </w:tc>
-        <w:tc>
-          <w:tcPr>
-            <w:tcW w:type="dxa" w:w="454"/>
-            <w:shd w:fill="FFFF99" w:val="clear"/>
-          </w:tcPr>
-          <w:p>
-            <w:r>
-              <w:rPr>
-                <w:b w:val="0"/>
-                <w:sz w:val="16"/>
-              </w:rPr>
-            </w:r>
-          </w:p>
-        </w:tc>
-        <w:tc>
-          <w:tcPr>
-            <w:tcW w:type="dxa" w:w="680"/>
-            <w:shd w:fill="FFFF99" w:val="clear"/>
-          </w:tcPr>
-          <w:p>
-            <w:r>
-              <w:rPr>
-                <w:b w:val="0"/>
-                <w:sz w:val="16"/>
-              </w:rPr>
-            </w:r>
-          </w:p>
-        </w:tc>
-        <w:tc>
-          <w:tcPr>
-            <w:tcW w:type="dxa" w:w="850"/>
-            <w:shd w:fill="FFFF99" w:val="clear"/>
-          </w:tcPr>
-          <w:p>
-            <w:r>
-              <w:rPr>
-                <w:b w:val="0"/>
-                <w:sz w:val="16"/>
-              </w:rPr>
-              <w:t>EC06A1</w:t>
-            </w:r>
-          </w:p>
-        </w:tc>
-        <w:tc>
-          <w:tcPr>
-            <w:tcW w:type="dxa" w:w="1984"/>
-            <w:shd w:fill="FFFF99" w:val="clear"/>
-          </w:tcPr>
-          <w:p>
-            <w:r>
-              <w:rPr>
-                <w:b w:val="0"/>
-                <w:sz w:val="16"/>
-              </w:rPr>
-              <w:t>cablu electric de comanda semnalizari blocari m...</w:t>
-            </w:r>
-          </w:p>
-        </w:tc>
-        <w:tc>
-          <w:tcPr>
-            <w:tcW w:type="dxa" w:w="454"/>
-            <w:shd w:fill="FFFF99" w:val="clear"/>
-          </w:tcPr>
-          <w:p>
-            <w:r>
-              <w:rPr>
-                <w:b w:val="0"/>
-                <w:sz w:val="16"/>
-              </w:rPr>
-              <w:t>m</w:t>
-            </w:r>
-          </w:p>
-        </w:tc>
-        <w:tc>
-          <w:tcPr>
-            <w:tcW w:type="dxa" w:w="680"/>
-            <w:shd w:fill="FFFF99" w:val="clear"/>
-          </w:tcPr>
-          <w:p>
-            <w:r>
-              <w:rPr>
-                <w:b w:val="0"/>
-                <w:sz w:val="16"/>
-              </w:rPr>
-              <w:t>180.0</w:t>
+              <w:t>18.0</w:t>
             </w:r>
           </w:p>
         </w:tc>
@@ -10933,7 +11402,7 @@
                 <w:color w:val="000000"/>
                 <w:sz w:val="18"/>
               </w:rPr>
-              <w:t>16</w:t>
+              <w:t>3</w:t>
             </w:r>
           </w:p>
         </w:tc>
@@ -10960,7 +11429,7 @@
                 <w:b/>
                 <w:sz w:val="18"/>
               </w:rPr>
-              <w:t>Capitol de lucrări 226338 — TEREN FOTBAL  │  LIPSA: 0  │  EXTRA: 1  │  Delta: +1</w:t>
+              <w:t>Capitol de lucrări 226288 — SISTEM SUPRAVEGHEREA VIDEO -OB2  │  LIPSA: 0  │  EXTRA: 2  │  Delta: +2</w:t>
             </w:r>
           </w:p>
         </w:tc>
@@ -10996,7 +11465,7 @@
                 <w:b w:val="0"/>
                 <w:sz w:val="16"/>
               </w:rPr>
-              <w:t>67</w:t>
+              <w:t>70</w:t>
             </w:r>
           </w:p>
         </w:tc>
@@ -11011,7 +11480,7 @@
                 <w:b w:val="0"/>
                 <w:sz w:val="16"/>
               </w:rPr>
-              <w:t>226338 - TEREN FOTBAL</w:t>
+              <w:t>226288 - SISTEM SUPRAVEGHEREA VIDEO -OB2</w:t>
             </w:r>
           </w:p>
         </w:tc>
@@ -11082,7 +11551,7 @@
                 <w:b w:val="0"/>
                 <w:sz w:val="16"/>
               </w:rPr>
-              <w:t>TRI1AA08F</w:t>
+              <w:t>EC06A1</w:t>
             </w:r>
           </w:p>
         </w:tc>
@@ -11097,7 +11566,7 @@
                 <w:b w:val="0"/>
                 <w:sz w:val="16"/>
               </w:rPr>
-              <w:t>descarcarea materialelor, grupa a-grele si maru...</w:t>
+              <w:t>cablu electric de comanda semnalizari blocari m...</w:t>
             </w:r>
           </w:p>
         </w:tc>
@@ -11112,7 +11581,7 @@
                 <w:b w:val="0"/>
                 <w:sz w:val="16"/>
               </w:rPr>
-              <w:t>tona</w:t>
+              <w:t>m</w:t>
             </w:r>
           </w:p>
         </w:tc>
@@ -11127,7 +11596,171 @@
                 <w:b w:val="0"/>
                 <w:sz w:val="16"/>
               </w:rPr>
-              <w:t>55.0</w:t>
+              <w:t>180.0</w:t>
+            </w:r>
+          </w:p>
+        </w:tc>
+        <w:tc>
+          <w:tcPr>
+            <w:tcW w:type="dxa" w:w="3572"/>
+            <w:shd w:fill="FFFF99" w:val="clear"/>
+          </w:tcPr>
+          <w:p>
+            <w:r>
+              <w:rPr>
+                <w:b w:val="0"/>
+                <w:color w:val="CC0000"/>
+                <w:sz w:val="16"/>
+              </w:rPr>
+              <w:t>Articol suplimentar în ofertă (nu există în referință)</w:t>
+            </w:r>
+          </w:p>
+        </w:tc>
+      </w:tr>
+      <w:tr>
+        <w:tc>
+          <w:tcPr>
+            <w:tcW w:type="dxa" w:w="397"/>
+            <w:shd w:fill="FFFF99" w:val="clear"/>
+          </w:tcPr>
+          <w:p>
+            <w:r>
+              <w:rPr>
+                <w:b w:val="0"/>
+                <w:sz w:val="16"/>
+              </w:rPr>
+              <w:t>71</w:t>
+            </w:r>
+          </w:p>
+        </w:tc>
+        <w:tc>
+          <w:tcPr>
+            <w:tcW w:type="dxa" w:w="1701"/>
+            <w:shd w:fill="FFFF99" w:val="clear"/>
+          </w:tcPr>
+          <w:p>
+            <w:r>
+              <w:rPr>
+                <w:b w:val="0"/>
+                <w:sz w:val="16"/>
+              </w:rPr>
+              <w:t>226288 - SISTEM SUPRAVEGHEREA VIDEO -OB2</w:t>
+            </w:r>
+          </w:p>
+        </w:tc>
+        <w:tc>
+          <w:tcPr>
+            <w:tcW w:type="dxa" w:w="850"/>
+            <w:shd w:fill="FFFF99" w:val="clear"/>
+          </w:tcPr>
+          <w:p>
+            <w:r>
+              <w:rPr>
+                <w:b w:val="0"/>
+                <w:sz w:val="16"/>
+              </w:rPr>
+            </w:r>
+          </w:p>
+        </w:tc>
+        <w:tc>
+          <w:tcPr>
+            <w:tcW w:type="dxa" w:w="1984"/>
+            <w:shd w:fill="FFFF99" w:val="clear"/>
+          </w:tcPr>
+          <w:p>
+            <w:r>
+              <w:rPr>
+                <w:b w:val="0"/>
+                <w:sz w:val="16"/>
+              </w:rPr>
+            </w:r>
+          </w:p>
+        </w:tc>
+        <w:tc>
+          <w:tcPr>
+            <w:tcW w:type="dxa" w:w="454"/>
+            <w:shd w:fill="FFFF99" w:val="clear"/>
+          </w:tcPr>
+          <w:p>
+            <w:r>
+              <w:rPr>
+                <w:b w:val="0"/>
+                <w:sz w:val="16"/>
+              </w:rPr>
+            </w:r>
+          </w:p>
+        </w:tc>
+        <w:tc>
+          <w:tcPr>
+            <w:tcW w:type="dxa" w:w="680"/>
+            <w:shd w:fill="FFFF99" w:val="clear"/>
+          </w:tcPr>
+          <w:p>
+            <w:r>
+              <w:rPr>
+                <w:b w:val="0"/>
+                <w:sz w:val="16"/>
+              </w:rPr>
+            </w:r>
+          </w:p>
+        </w:tc>
+        <w:tc>
+          <w:tcPr>
+            <w:tcW w:type="dxa" w:w="850"/>
+            <w:shd w:fill="FFFF99" w:val="clear"/>
+          </w:tcPr>
+          <w:p>
+            <w:r>
+              <w:rPr>
+                <w:b w:val="0"/>
+                <w:sz w:val="16"/>
+              </w:rPr>
+              <w:t>TCB40A1</w:t>
+            </w:r>
+          </w:p>
+        </w:tc>
+        <w:tc>
+          <w:tcPr>
+            <w:tcW w:type="dxa" w:w="1984"/>
+            <w:shd w:fill="FFFF99" w:val="clear"/>
+          </w:tcPr>
+          <w:p>
+            <w:r>
+              <w:rPr>
+                <w:b w:val="0"/>
+                <w:sz w:val="16"/>
+              </w:rPr>
+              <w:t>aparat telegr teleim transmit autom.</w:t>
+            </w:r>
+          </w:p>
+        </w:tc>
+        <w:tc>
+          <w:tcPr>
+            <w:tcW w:type="dxa" w:w="454"/>
+            <w:shd w:fill="FFFF99" w:val="clear"/>
+          </w:tcPr>
+          <w:p>
+            <w:r>
+              <w:rPr>
+                <w:b w:val="0"/>
+                <w:sz w:val="16"/>
+              </w:rPr>
+              <w:t>buc</w:t>
+            </w:r>
+          </w:p>
+        </w:tc>
+        <w:tc>
+          <w:tcPr>
+            <w:tcW w:type="dxa" w:w="680"/>
+            <w:shd w:fill="FFFF99" w:val="clear"/>
+          </w:tcPr>
+          <w:p>
+            <w:r>
+              <w:rPr>
+                <w:b w:val="0"/>
+                <w:sz w:val="16"/>
+              </w:rPr>
+              <w:t>2.0</w:t>
             </w:r>
           </w:p>
         </w:tc>
@@ -11266,7 +11899,7 @@
                 <w:color w:val="000000"/>
                 <w:sz w:val="18"/>
               </w:rPr>
-              <w:t>20</w:t>
+              <w:t>16</w:t>
             </w:r>
           </w:p>
         </w:tc>
@@ -11293,7 +11926,7 @@
                 <w:b/>
                 <w:sz w:val="18"/>
               </w:rPr>
-              <w:t>Capitol de lucrări 226358 — ALEI PIETONALE SI CAROSABILE  │  LIPSA: 0  │  EXTRA: 2  │  Delta: +2</w:t>
+              <w:t>Capitol de lucrări 226338 — TEREN FOTBAL  │  LIPSA: 0  │  EXTRA: 1  │  Delta: +1</w:t>
             </w:r>
           </w:p>
         </w:tc>
@@ -11329,7 +11962,7 @@
                 <w:b w:val="0"/>
                 <w:sz w:val="16"/>
               </w:rPr>
-              <w:t>69</w:t>
+              <w:t>73</w:t>
             </w:r>
           </w:p>
         </w:tc>
@@ -11344,7 +11977,7 @@
                 <w:b w:val="0"/>
                 <w:sz w:val="16"/>
               </w:rPr>
-              <w:t>226358 - ALEI PIETONALE SI CAROSABILE</w:t>
+              <w:t>226338 - TEREN FOTBAL</w:t>
             </w:r>
           </w:p>
         </w:tc>
@@ -11415,7 +12048,7 @@
                 <w:b w:val="0"/>
                 <w:sz w:val="16"/>
               </w:rPr>
-              <w:t>DA12C1</w:t>
+              <w:t>TRI1AA08F</w:t>
             </w:r>
           </w:p>
         </w:tc>
@@ -11430,7 +12063,7 @@
                 <w:b w:val="0"/>
                 <w:sz w:val="16"/>
               </w:rPr>
-              <w:t>stat fund reprof p sparta pt drum cu asternere ...</w:t>
+              <w:t>descarcarea materialelor, grupa a-grele si maru...</w:t>
             </w:r>
           </w:p>
         </w:tc>
@@ -11445,7 +12078,7 @@
                 <w:b w:val="0"/>
                 <w:sz w:val="16"/>
               </w:rPr>
-              <w:t>mc</w:t>
+              <w:t>tona</w:t>
             </w:r>
           </w:p>
         </w:tc>
@@ -11460,171 +12093,7 @@
                 <w:b w:val="0"/>
                 <w:sz w:val="16"/>
               </w:rPr>
-              <w:t>300.0</w:t>
-            </w:r>
-          </w:p>
-        </w:tc>
-        <w:tc>
-          <w:tcPr>
-            <w:tcW w:type="dxa" w:w="3572"/>
-            <w:shd w:fill="FFFF99" w:val="clear"/>
-          </w:tcPr>
-          <w:p>
-            <w:r>
-              <w:rPr>
-                <w:b w:val="0"/>
-                <w:color w:val="CC0000"/>
-                <w:sz w:val="16"/>
-              </w:rPr>
-              <w:t>Articol suplimentar în ofertă (nu există în referință)</w:t>
-            </w:r>
-          </w:p>
-        </w:tc>
-      </w:tr>
-      <w:tr>
-        <w:tc>
-          <w:tcPr>
-            <w:tcW w:type="dxa" w:w="397"/>
-            <w:shd w:fill="FFFF99" w:val="clear"/>
-          </w:tcPr>
-          <w:p>
-            <w:r>
-              <w:rPr>
-                <w:b w:val="0"/>
-                <w:sz w:val="16"/>
-              </w:rPr>
-              <w:t>70</w:t>
-            </w:r>
-          </w:p>
-        </w:tc>
-        <w:tc>
-          <w:tcPr>
-            <w:tcW w:type="dxa" w:w="1701"/>
-            <w:shd w:fill="FFFF99" w:val="clear"/>
-          </w:tcPr>
-          <w:p>
-            <w:r>
-              <w:rPr>
-                <w:b w:val="0"/>
-                <w:sz w:val="16"/>
-              </w:rPr>
-              <w:t>226358 - ALEI PIETONALE SI CAROSABILE</w:t>
-            </w:r>
-          </w:p>
-        </w:tc>
-        <w:tc>
-          <w:tcPr>
-            <w:tcW w:type="dxa" w:w="850"/>
-            <w:shd w:fill="FFFF99" w:val="clear"/>
-          </w:tcPr>
-          <w:p>
-            <w:r>
-              <w:rPr>
-                <w:b w:val="0"/>
-                <w:sz w:val="16"/>
-              </w:rPr>
-            </w:r>
-          </w:p>
-        </w:tc>
-        <w:tc>
-          <w:tcPr>
-            <w:tcW w:type="dxa" w:w="1984"/>
-            <w:shd w:fill="FFFF99" w:val="clear"/>
-          </w:tcPr>
-          <w:p>
-            <w:r>
-              <w:rPr>
-                <w:b w:val="0"/>
-                <w:sz w:val="16"/>
-              </w:rPr>
-            </w:r>
-          </w:p>
-        </w:tc>
-        <w:tc>
-          <w:tcPr>
-            <w:tcW w:type="dxa" w:w="454"/>
-            <w:shd w:fill="FFFF99" w:val="clear"/>
-          </w:tcPr>
-          <w:p>
-            <w:r>
-              <w:rPr>
-                <w:b w:val="0"/>
-                <w:sz w:val="16"/>
-              </w:rPr>
-            </w:r>
-          </w:p>
-        </w:tc>
-        <w:tc>
-          <w:tcPr>
-            <w:tcW w:type="dxa" w:w="680"/>
-            <w:shd w:fill="FFFF99" w:val="clear"/>
-          </w:tcPr>
-          <w:p>
-            <w:r>
-              <w:rPr>
-                <w:b w:val="0"/>
-                <w:sz w:val="16"/>
-              </w:rPr>
-            </w:r>
-          </w:p>
-        </w:tc>
-        <w:tc>
-          <w:tcPr>
-            <w:tcW w:type="dxa" w:w="850"/>
-            <w:shd w:fill="FFFF99" w:val="clear"/>
-          </w:tcPr>
-          <w:p>
-            <w:r>
-              <w:rPr>
-                <w:b w:val="0"/>
-                <w:sz w:val="16"/>
-              </w:rPr>
-              <w:t>TSH01A1</w:t>
-            </w:r>
-          </w:p>
-        </w:tc>
-        <w:tc>
-          <w:tcPr>
-            <w:tcW w:type="dxa" w:w="1984"/>
-            <w:shd w:fill="FFFF99" w:val="clear"/>
-          </w:tcPr>
-          <w:p>
-            <w:r>
-              <w:rPr>
-                <w:b w:val="0"/>
-                <w:sz w:val="16"/>
-              </w:rPr>
-              <w:t>degajarea terenului de corpuri straine</w:t>
-            </w:r>
-          </w:p>
-        </w:tc>
-        <w:tc>
-          <w:tcPr>
-            <w:tcW w:type="dxa" w:w="454"/>
-            <w:shd w:fill="FFFF99" w:val="clear"/>
-          </w:tcPr>
-          <w:p>
-            <w:r>
-              <w:rPr>
-                <w:b w:val="0"/>
-                <w:sz w:val="16"/>
-              </w:rPr>
-              <w:t>100 mp</w:t>
-            </w:r>
-          </w:p>
-        </w:tc>
-        <w:tc>
-          <w:tcPr>
-            <w:tcW w:type="dxa" w:w="680"/>
-            <w:shd w:fill="FFFF99" w:val="clear"/>
-          </w:tcPr>
-          <w:p>
-            <w:r>
-              <w:rPr>
-                <w:b w:val="0"/>
-                <w:sz w:val="16"/>
-              </w:rPr>
-              <w:t>20.0</w:t>
+              <w:t>55.0</w:t>
             </w:r>
           </w:p>
         </w:tc>
@@ -11763,7 +12232,7 @@
                 <w:color w:val="000000"/>
                 <w:sz w:val="18"/>
               </w:rPr>
-              <w:t>17</w:t>
+              <w:t>20</w:t>
             </w:r>
           </w:p>
         </w:tc>
@@ -11826,7 +12295,7 @@
                 <w:b w:val="0"/>
                 <w:sz w:val="16"/>
               </w:rPr>
-              <w:t>72</w:t>
+              <w:t>75</w:t>
             </w:r>
           </w:p>
         </w:tc>
@@ -12159,7 +12628,7 @@
                 <w:b w:val="0"/>
                 <w:sz w:val="16"/>
               </w:rPr>
-              <w:t>74</w:t>
+              <w:t>77</w:t>
             </w:r>
           </w:p>
         </w:tc>
@@ -12456,7 +12925,7 @@
                 <w:b/>
                 <w:sz w:val="18"/>
               </w:rPr>
-              <w:t>Capitol de lucrări 226438  │  LIPSA: 0  │  EXTRA: 1  │  Delta: +1</w:t>
+              <w:t>Capitol de lucrări 226418 — ARHITECTURA VESTIARE FOTBALIST SI SALA F...  │  LIPSA: 0  │  EXTRA: 1  │  Delta: +1</w:t>
             </w:r>
           </w:p>
         </w:tc>
@@ -12492,7 +12961,7 @@
                 <w:b w:val="0"/>
                 <w:sz w:val="16"/>
               </w:rPr>
-              <w:t>76</w:t>
+              <w:t>79</w:t>
             </w:r>
           </w:p>
         </w:tc>
@@ -12507,7 +12976,7 @@
                 <w:b w:val="0"/>
                 <w:sz w:val="16"/>
               </w:rPr>
-              <w:t>226438</w:t>
+              <w:t>226418 - ARHITECTURA VESTIARE FOTBALIST SI SAL...</w:t>
             </w:r>
           </w:p>
         </w:tc>
@@ -12578,7 +13047,7 @@
                 <w:b w:val="0"/>
                 <w:sz w:val="16"/>
               </w:rPr>
-              <w:t>IA22C1</w:t>
+              <w:t>CD05C1</w:t>
             </w:r>
           </w:p>
         </w:tc>
@@ -12593,7 +13062,7 @@
                 <w:b w:val="0"/>
                 <w:sz w:val="16"/>
               </w:rPr>
-              <w:t>montare boiler procent material manopera utilaj...</w:t>
+              <w:t>zidarie din caramida tip gvp la constr.h &lt;35m, ...</w:t>
             </w:r>
           </w:p>
         </w:tc>
@@ -12608,7 +13077,7 @@
                 <w:b w:val="0"/>
                 <w:sz w:val="16"/>
               </w:rPr>
-              <w:t>buc</w:t>
+              <w:t>mc</w:t>
             </w:r>
           </w:p>
         </w:tc>
@@ -12623,7 +13092,7 @@
                 <w:b w:val="0"/>
                 <w:sz w:val="16"/>
               </w:rPr>
-              <w:t>7.0</w:t>
+              <w:t>120.9</w:t>
             </w:r>
           </w:p>
         </w:tc>
@@ -12762,7 +13231,7 @@
                 <w:color w:val="000000"/>
                 <w:sz w:val="18"/>
               </w:rPr>
-              <w:t>1</w:t>
+              <w:t>98</w:t>
             </w:r>
           </w:p>
         </w:tc>
@@ -12789,7 +13258,7 @@
                 <w:b/>
                 <w:sz w:val="18"/>
               </w:rPr>
-              <w:t>Capitol de lucrări 226458  │  LIPSA: 0  │  EXTRA: 1  │  Delta: +1</w:t>
+              <w:t>Capitol de lucrări 226438  │  LIPSA: 0  │  EXTRA: 1  │  Delta: +1</w:t>
             </w:r>
           </w:p>
         </w:tc>
@@ -12825,7 +13294,7 @@
                 <w:b w:val="0"/>
                 <w:sz w:val="16"/>
               </w:rPr>
-              <w:t>78</w:t>
+              <w:t>81</w:t>
             </w:r>
           </w:p>
         </w:tc>
@@ -12840,7 +13309,7 @@
                 <w:b w:val="0"/>
                 <w:sz w:val="16"/>
               </w:rPr>
-              <w:t>226458</w:t>
+              <w:t>226438</w:t>
             </w:r>
           </w:p>
         </w:tc>
@@ -12911,7 +13380,7 @@
                 <w:b w:val="0"/>
                 <w:sz w:val="16"/>
               </w:rPr>
-              <w:t>ED25A1</w:t>
+              <w:t>IA22C1</w:t>
             </w:r>
           </w:p>
         </w:tc>
@@ -12926,7 +13395,7 @@
                 <w:b w:val="0"/>
                 <w:sz w:val="16"/>
               </w:rPr>
-              <w:t>asim aparat electric antigrizutos sau</w:t>
+              <w:t>montare boiler procent material manopera utilaj...</w:t>
             </w:r>
           </w:p>
         </w:tc>
@@ -12956,7 +13425,7 @@
                 <w:b w:val="0"/>
                 <w:sz w:val="16"/>
               </w:rPr>
-              <w:t>27.0</w:t>
+              <w:t>7.0</w:t>
             </w:r>
           </w:p>
         </w:tc>
@@ -13095,7 +13564,7 @@
                 <w:color w:val="000000"/>
                 <w:sz w:val="18"/>
               </w:rPr>
-              <w:t>4</w:t>
+              <w:t>1</w:t>
             </w:r>
           </w:p>
         </w:tc>
@@ -13158,7 +13627,7 @@
                 <w:b w:val="0"/>
                 <w:sz w:val="16"/>
               </w:rPr>
-              <w:t>80</w:t>
+              <w:t>83</w:t>
             </w:r>
           </w:p>
         </w:tc>
@@ -13455,7 +13924,7 @@
                 <w:b/>
                 <w:sz w:val="18"/>
               </w:rPr>
-              <w:t>Capitol de lucrări 226478 — INSTALATII ELECTRICE curenti tari OB.4  │  LIPSA: 0  │  EXTRA: 1  │  Delta: +1</w:t>
+              <w:t>Capitol de lucrări 226478 — INSTALATII ELECTRICE tari OB.2 curenti  │  LIPSA: 0  │  EXTRA: 1  │  Delta: +1</w:t>
             </w:r>
           </w:p>
         </w:tc>
@@ -13491,7 +13960,7 @@
                 <w:b w:val="0"/>
                 <w:sz w:val="16"/>
               </w:rPr>
-              <w:t>82</w:t>
+              <w:t>85</w:t>
             </w:r>
           </w:p>
         </w:tc>
@@ -13506,7 +13975,7 @@
                 <w:b w:val="0"/>
                 <w:sz w:val="16"/>
               </w:rPr>
-              <w:t>226478 - INSTALATII ELECTRICE curenti tari OB.4</w:t>
+              <w:t>226478 - INSTALATII ELECTRICE tari OB.2 curenti</w:t>
             </w:r>
           </w:p>
         </w:tc>
@@ -13788,7 +14257,7 @@
                 <w:b/>
                 <w:sz w:val="18"/>
               </w:rPr>
-              <w:t>Capitol de lucrări 226508 — STRUCTURA DE REZISTENTA (vestiar, grupur...  │  LIPSA: 0  │  EXTRA: 1  │  Delta: +1</w:t>
+              <w:t>Capitol de lucrări 226518 — ARHITECTURA teren tenis si grupuri sanit...  │  LIPSA: 0  │  EXTRA: 1  │  Delta: +1</w:t>
             </w:r>
           </w:p>
         </w:tc>
@@ -13824,7 +14293,7 @@
                 <w:b w:val="0"/>
                 <w:sz w:val="16"/>
               </w:rPr>
-              <w:t>84</w:t>
+              <w:t>87</w:t>
             </w:r>
           </w:p>
         </w:tc>
@@ -13839,7 +14308,7 @@
                 <w:b w:val="0"/>
                 <w:sz w:val="16"/>
               </w:rPr>
-              <w:t>226508 - STRUCTURA DE REZISTENTA (vestiar, gru...</w:t>
+              <w:t>226518 - ARHITECTURA teren tenis si grupuri sa...</w:t>
             </w:r>
           </w:p>
         </w:tc>
@@ -13910,7 +14379,7 @@
                 <w:b w:val="0"/>
                 <w:sz w:val="16"/>
               </w:rPr>
-              <w:t>TSC18B1</w:t>
+              <w:t>CE15D1</w:t>
             </w:r>
           </w:p>
         </w:tc>
@@ -13925,7 +14394,7 @@
                 <w:b w:val="0"/>
                 <w:sz w:val="16"/>
               </w:rPr>
-              <w:t>sapat.cu buldoz pe tract 65- 80cp incl impins p...</w:t>
+              <w:t>glaf, copertina lat 30 50 lung&lt;2m-carton bitum</w:t>
             </w:r>
           </w:p>
         </w:tc>
@@ -13940,7 +14409,7 @@
                 <w:b w:val="0"/>
                 <w:sz w:val="16"/>
               </w:rPr>
-              <w:t>100 mc</w:t>
+              <w:t>m</w:t>
             </w:r>
           </w:p>
         </w:tc>
@@ -13955,7 +14424,7 @@
                 <w:b w:val="0"/>
                 <w:sz w:val="16"/>
               </w:rPr>
-              <w:t>0.4</w:t>
+              <w:t>20.0</w:t>
             </w:r>
           </w:p>
         </w:tc>
@@ -14094,7 +14563,7 @@
                 <w:color w:val="000000"/>
                 <w:sz w:val="18"/>
               </w:rPr>
-              <w:t>53</w:t>
+              <w:t>82</w:t>
             </w:r>
           </w:p>
         </w:tc>
@@ -14121,7 +14590,7 @@
                 <w:b/>
                 <w:sz w:val="18"/>
               </w:rPr>
-              <w:t>Capitol de lucrări 226518 — ARHITECTURA teren tenis si grupuri sanit...  │  LIPSA: 0  │  EXTRA: 2  │  Delta: +2</w:t>
+              <w:t>Capitol de lucrări 226708 — ORG SANTIER- MONTARE WC ECOLOGIC  │  LIPSA: 0  │  EXTRA: 1  │  Delta: +1</w:t>
             </w:r>
           </w:p>
         </w:tc>
@@ -14157,7 +14626,7 @@
                 <w:b w:val="0"/>
                 <w:sz w:val="16"/>
               </w:rPr>
-              <w:t>86</w:t>
+              <w:t>89</w:t>
             </w:r>
           </w:p>
         </w:tc>
@@ -14172,7 +14641,7 @@
                 <w:b w:val="0"/>
                 <w:sz w:val="16"/>
               </w:rPr>
-              <w:t>226518 - ARHITECTURA teren tenis si grupuri sa...</w:t>
+              <w:t>226708 - ORG SANTIER- MONTARE WC ECOLOGIC</w:t>
             </w:r>
           </w:p>
         </w:tc>
@@ -14243,7 +14712,7 @@
                 <w:b w:val="0"/>
                 <w:sz w:val="16"/>
               </w:rPr>
-              <w:t>CD05C1</w:t>
+              <w:t>CL20C1</w:t>
             </w:r>
           </w:p>
         </w:tc>
@@ -14258,7 +14727,7 @@
                 <w:b w:val="0"/>
                 <w:sz w:val="16"/>
               </w:rPr>
-              <w:t>zidarie din caramida tip gvp la constr.h &lt;35m, ...</w:t>
+              <w:t>montarea confectiilor metalice aparente: divers...</w:t>
             </w:r>
           </w:p>
         </w:tc>
@@ -14273,7 +14742,7 @@
                 <w:b w:val="0"/>
                 <w:sz w:val="16"/>
               </w:rPr>
-              <w:t>mc</w:t>
+              <w:t>kg</w:t>
             </w:r>
           </w:p>
         </w:tc>
@@ -14288,171 +14757,7 @@
                 <w:b w:val="0"/>
                 <w:sz w:val="16"/>
               </w:rPr>
-              <w:t>31.0</w:t>
-            </w:r>
-          </w:p>
-        </w:tc>
-        <w:tc>
-          <w:tcPr>
-            <w:tcW w:type="dxa" w:w="3572"/>
-            <w:shd w:fill="FFFF99" w:val="clear"/>
-          </w:tcPr>
-          <w:p>
-            <w:r>
-              <w:rPr>
-                <w:b w:val="0"/>
-                <w:color w:val="CC0000"/>
-                <w:sz w:val="16"/>
-              </w:rPr>
-              <w:t>Articol suplimentar în ofertă (nu există în referință)</w:t>
-            </w:r>
-          </w:p>
-        </w:tc>
-      </w:tr>
-      <w:tr>
-        <w:tc>
-          <w:tcPr>
-            <w:tcW w:type="dxa" w:w="397"/>
-            <w:shd w:fill="FFFF99" w:val="clear"/>
-          </w:tcPr>
-          <w:p>
-            <w:r>
-              <w:rPr>
-                <w:b w:val="0"/>
-                <w:sz w:val="16"/>
-              </w:rPr>
-              <w:t>87</w:t>
-            </w:r>
-          </w:p>
-        </w:tc>
-        <w:tc>
-          <w:tcPr>
-            <w:tcW w:type="dxa" w:w="1701"/>
-            <w:shd w:fill="FFFF99" w:val="clear"/>
-          </w:tcPr>
-          <w:p>
-            <w:r>
-              <w:rPr>
-                <w:b w:val="0"/>
-                <w:sz w:val="16"/>
-              </w:rPr>
-              <w:t>226518 - ARHITECTURA teren tenis si grupuri sa...</w:t>
-            </w:r>
-          </w:p>
-        </w:tc>
-        <w:tc>
-          <w:tcPr>
-            <w:tcW w:type="dxa" w:w="850"/>
-            <w:shd w:fill="FFFF99" w:val="clear"/>
-          </w:tcPr>
-          <w:p>
-            <w:r>
-              <w:rPr>
-                <w:b w:val="0"/>
-                <w:sz w:val="16"/>
-              </w:rPr>
-            </w:r>
-          </w:p>
-        </w:tc>
-        <w:tc>
-          <w:tcPr>
-            <w:tcW w:type="dxa" w:w="1984"/>
-            <w:shd w:fill="FFFF99" w:val="clear"/>
-          </w:tcPr>
-          <w:p>
-            <w:r>
-              <w:rPr>
-                <w:b w:val="0"/>
-                <w:sz w:val="16"/>
-              </w:rPr>
-            </w:r>
-          </w:p>
-        </w:tc>
-        <w:tc>
-          <w:tcPr>
-            <w:tcW w:type="dxa" w:w="454"/>
-            <w:shd w:fill="FFFF99" w:val="clear"/>
-          </w:tcPr>
-          <w:p>
-            <w:r>
-              <w:rPr>
-                <w:b w:val="0"/>
-                <w:sz w:val="16"/>
-              </w:rPr>
-            </w:r>
-          </w:p>
-        </w:tc>
-        <w:tc>
-          <w:tcPr>
-            <w:tcW w:type="dxa" w:w="680"/>
-            <w:shd w:fill="FFFF99" w:val="clear"/>
-          </w:tcPr>
-          <w:p>
-            <w:r>
-              <w:rPr>
-                <w:b w:val="0"/>
-                <w:sz w:val="16"/>
-              </w:rPr>
-            </w:r>
-          </w:p>
-        </w:tc>
-        <w:tc>
-          <w:tcPr>
-            <w:tcW w:type="dxa" w:w="850"/>
-            <w:shd w:fill="FFFF99" w:val="clear"/>
-          </w:tcPr>
-          <w:p>
-            <w:r>
-              <w:rPr>
-                <w:b w:val="0"/>
-                <w:sz w:val="16"/>
-              </w:rPr>
-              <w:t>CE15D1</w:t>
-            </w:r>
-          </w:p>
-        </w:tc>
-        <w:tc>
-          <w:tcPr>
-            <w:tcW w:type="dxa" w:w="1984"/>
-            <w:shd w:fill="FFFF99" w:val="clear"/>
-          </w:tcPr>
-          <w:p>
-            <w:r>
-              <w:rPr>
-                <w:b w:val="0"/>
-                <w:sz w:val="16"/>
-              </w:rPr>
-              <w:t>glaf, copertina lat 30 50 lung&lt;2m-carton bitum</w:t>
-            </w:r>
-          </w:p>
-        </w:tc>
-        <w:tc>
-          <w:tcPr>
-            <w:tcW w:type="dxa" w:w="454"/>
-            <w:shd w:fill="FFFF99" w:val="clear"/>
-          </w:tcPr>
-          <w:p>
-            <w:r>
-              <w:rPr>
-                <w:b w:val="0"/>
-                <w:sz w:val="16"/>
-              </w:rPr>
-              <w:t>m</w:t>
-            </w:r>
-          </w:p>
-        </w:tc>
-        <w:tc>
-          <w:tcPr>
-            <w:tcW w:type="dxa" w:w="680"/>
-            <w:shd w:fill="FFFF99" w:val="clear"/>
-          </w:tcPr>
-          <w:p>
-            <w:r>
-              <w:rPr>
-                <w:b w:val="0"/>
-                <w:sz w:val="16"/>
-              </w:rPr>
-              <w:t>20.0</w:t>
+              <w:t>500.0</w:t>
             </w:r>
           </w:p>
         </w:tc>
@@ -14591,7 +14896,7 @@
                 <w:color w:val="000000"/>
                 <w:sz w:val="18"/>
               </w:rPr>
-              <w:t>82</w:t>
+              <w:t>3</w:t>
             </w:r>
           </w:p>
         </w:tc>
@@ -14618,7 +14923,7 @@
                 <w:b/>
                 <w:sz w:val="18"/>
               </w:rPr>
-              <w:t>Capitol de lucrări 226708  │  LIPSA: 0  │  EXTRA: 1  │  Delta: +1</w:t>
+              <w:t>Capitol de lucrări 226718 — ORG. SANTIER- CONTAINER  │  LIPSA: 0  │  EXTRA: 1  │  Delta: +1</w:t>
             </w:r>
           </w:p>
         </w:tc>
@@ -14654,7 +14959,7 @@
                 <w:b w:val="0"/>
                 <w:sz w:val="16"/>
               </w:rPr>
-              <w:t>89</w:t>
+              <w:t>91</w:t>
             </w:r>
           </w:p>
         </w:tc>
@@ -14669,340 +14974,7 @@
                 <w:b w:val="0"/>
                 <w:sz w:val="16"/>
               </w:rPr>
-              <w:t>226708</w:t>
-            </w:r>
-          </w:p>
-        </w:tc>
-        <w:tc>
-          <w:tcPr>
-            <w:tcW w:type="dxa" w:w="850"/>
-            <w:shd w:fill="FFFF99" w:val="clear"/>
-          </w:tcPr>
-          <w:p>
-            <w:r>
-              <w:rPr>
-                <w:b w:val="0"/>
-                <w:sz w:val="16"/>
-              </w:rPr>
-            </w:r>
-          </w:p>
-        </w:tc>
-        <w:tc>
-          <w:tcPr>
-            <w:tcW w:type="dxa" w:w="1984"/>
-            <w:shd w:fill="FFFF99" w:val="clear"/>
-          </w:tcPr>
-          <w:p>
-            <w:r>
-              <w:rPr>
-                <w:b w:val="0"/>
-                <w:sz w:val="16"/>
-              </w:rPr>
-            </w:r>
-          </w:p>
-        </w:tc>
-        <w:tc>
-          <w:tcPr>
-            <w:tcW w:type="dxa" w:w="454"/>
-            <w:shd w:fill="FFFF99" w:val="clear"/>
-          </w:tcPr>
-          <w:p>
-            <w:r>
-              <w:rPr>
-                <w:b w:val="0"/>
-                <w:sz w:val="16"/>
-              </w:rPr>
-            </w:r>
-          </w:p>
-        </w:tc>
-        <w:tc>
-          <w:tcPr>
-            <w:tcW w:type="dxa" w:w="680"/>
-            <w:shd w:fill="FFFF99" w:val="clear"/>
-          </w:tcPr>
-          <w:p>
-            <w:r>
-              <w:rPr>
-                <w:b w:val="0"/>
-                <w:sz w:val="16"/>
-              </w:rPr>
-            </w:r>
-          </w:p>
-        </w:tc>
-        <w:tc>
-          <w:tcPr>
-            <w:tcW w:type="dxa" w:w="850"/>
-            <w:shd w:fill="FFFF99" w:val="clear"/>
-          </w:tcPr>
-          <w:p>
-            <w:r>
-              <w:rPr>
-                <w:b w:val="0"/>
-                <w:sz w:val="16"/>
-              </w:rPr>
-              <w:t>CL20C1</w:t>
-            </w:r>
-          </w:p>
-        </w:tc>
-        <w:tc>
-          <w:tcPr>
-            <w:tcW w:type="dxa" w:w="1984"/>
-            <w:shd w:fill="FFFF99" w:val="clear"/>
-          </w:tcPr>
-          <w:p>
-            <w:r>
-              <w:rPr>
-                <w:b w:val="0"/>
-                <w:sz w:val="16"/>
-              </w:rPr>
-              <w:t>montarea confectiilor metalice aparente: divers...</w:t>
-            </w:r>
-          </w:p>
-        </w:tc>
-        <w:tc>
-          <w:tcPr>
-            <w:tcW w:type="dxa" w:w="454"/>
-            <w:shd w:fill="FFFF99" w:val="clear"/>
-          </w:tcPr>
-          <w:p>
-            <w:r>
-              <w:rPr>
-                <w:b w:val="0"/>
-                <w:sz w:val="16"/>
-              </w:rPr>
-              <w:t>kg</w:t>
-            </w:r>
-          </w:p>
-        </w:tc>
-        <w:tc>
-          <w:tcPr>
-            <w:tcW w:type="dxa" w:w="680"/>
-            <w:shd w:fill="FFFF99" w:val="clear"/>
-          </w:tcPr>
-          <w:p>
-            <w:r>
-              <w:rPr>
-                <w:b w:val="0"/>
-                <w:sz w:val="16"/>
-              </w:rPr>
-              <w:t>500.0</w:t>
-            </w:r>
-          </w:p>
-        </w:tc>
-        <w:tc>
-          <w:tcPr>
-            <w:tcW w:type="dxa" w:w="3572"/>
-            <w:shd w:fill="FFFF99" w:val="clear"/>
-          </w:tcPr>
-          <w:p>
-            <w:r>
-              <w:rPr>
-                <w:b w:val="0"/>
-                <w:color w:val="CC0000"/>
-                <w:sz w:val="16"/>
-              </w:rPr>
-              <w:t>Articol suplimentar în ofertă (nu există în referință)</w:t>
-            </w:r>
-          </w:p>
-        </w:tc>
-      </w:tr>
-      <w:tr>
-        <w:tc>
-          <w:tcPr>
-            <w:tcW w:type="dxa" w:w="397"/>
-          </w:tcPr>
-          <w:p/>
-        </w:tc>
-        <w:tc>
-          <w:tcPr>
-            <w:tcW w:type="dxa" w:w="1701"/>
-            <w:shd w:fill="D9D9D9" w:val="clear"/>
-          </w:tcPr>
-          <w:p>
-            <w:r>
-              <w:rPr>
-                <w:b/>
-                <w:color w:val="000000"/>
-                <w:sz w:val="18"/>
-              </w:rPr>
-              <w:t>SUMAR</w:t>
-            </w:r>
-          </w:p>
-        </w:tc>
-        <w:tc>
-          <w:tcPr>
-            <w:tcW w:type="dxa" w:w="850"/>
-            <w:shd w:fill="D9D9D9" w:val="clear"/>
-          </w:tcPr>
-          <w:p>
-            <w:r>
-              <w:rPr>
-                <w:b/>
-                <w:color w:val="000000"/>
-                <w:sz w:val="18"/>
-              </w:rPr>
-              <w:t>Neconformitati: 0 din 0 articole ref.</w:t>
-            </w:r>
-          </w:p>
-        </w:tc>
-        <w:tc>
-          <w:tcPr>
-            <w:tcW w:type="dxa" w:w="1984"/>
-            <w:shd w:fill="D9D9D9" w:val="clear"/>
-          </w:tcPr>
-          <w:p>
-            <w:r/>
-          </w:p>
-        </w:tc>
-        <w:tc>
-          <w:tcPr>
-            <w:tcW w:type="dxa" w:w="454"/>
-            <w:shd w:fill="D9D9D9" w:val="clear"/>
-          </w:tcPr>
-          <w:p>
-            <w:r/>
-          </w:p>
-        </w:tc>
-        <w:tc>
-          <w:tcPr>
-            <w:tcW w:type="dxa" w:w="680"/>
-            <w:shd w:fill="D9D9D9" w:val="clear"/>
-          </w:tcPr>
-          <w:p>
-            <w:r/>
-          </w:p>
-        </w:tc>
-        <w:tc>
-          <w:tcPr>
-            <w:tcW w:type="dxa" w:w="850"/>
-            <w:shd w:fill="D9D9D9" w:val="clear"/>
-          </w:tcPr>
-          <w:p>
-            <w:pPr>
-              <w:jc w:val="center"/>
-            </w:pPr>
-            <w:r>
-              <w:rPr>
-                <w:b/>
-                <w:color w:val="000000"/>
-                <w:sz w:val="18"/>
-              </w:rPr>
-              <w:t>0</w:t>
-            </w:r>
-          </w:p>
-        </w:tc>
-        <w:tc>
-          <w:tcPr>
-            <w:tcW w:type="dxa" w:w="1984"/>
-            <w:shd w:fill="D9D9D9" w:val="clear"/>
-          </w:tcPr>
-          <w:p>
-            <w:r/>
-          </w:p>
-        </w:tc>
-        <w:tc>
-          <w:tcPr>
-            <w:tcW w:type="dxa" w:w="454"/>
-            <w:shd w:fill="D9D9D9" w:val="clear"/>
-          </w:tcPr>
-          <w:p>
-            <w:r/>
-          </w:p>
-        </w:tc>
-        <w:tc>
-          <w:tcPr>
-            <w:tcW w:type="dxa" w:w="680"/>
-            <w:shd w:fill="D9D9D9" w:val="clear"/>
-          </w:tcPr>
-          <w:p>
-            <w:pPr>
-              <w:jc w:val="center"/>
-            </w:pPr>
-            <w:r>
-              <w:rPr>
-                <w:b/>
-                <w:color w:val="000000"/>
-                <w:sz w:val="18"/>
-              </w:rPr>
-              <w:t>3</w:t>
-            </w:r>
-          </w:p>
-        </w:tc>
-        <w:tc>
-          <w:tcPr>
-            <w:tcW w:type="dxa" w:w="3572"/>
-            <w:shd w:fill="D9D9D9" w:val="clear"/>
-          </w:tcPr>
-          <w:p>
-            <w:r/>
-          </w:p>
-        </w:tc>
-      </w:tr>
-      <w:tr>
-        <w:tc>
-          <w:tcPr>
-            <w:tcW w:type="dxa" w:w="3572"/>
-            <w:gridSpan w:val="11"/>
-            <w:shd w:fill="D9D9D9" w:val="clear"/>
-          </w:tcPr>
-          <w:p>
-            <w:r>
-              <w:rPr>
-                <w:b/>
-                <w:sz w:val="18"/>
-              </w:rPr>
-              <w:t>Capitol de lucrări 226718  │  LIPSA: 0  │  EXTRA: 1  │  Delta: +1</w:t>
-            </w:r>
-          </w:p>
-        </w:tc>
-      </w:tr>
-      <w:tr>
-        <w:tc>
-          <w:tcPr>
-            <w:tcW w:type="dxa" w:w="3572"/>
-            <w:gridSpan w:val="11"/>
-            <w:shd w:fill="FFFF99" w:val="clear"/>
-          </w:tcPr>
-          <w:p>
-            <w:r>
-              <w:rPr>
-                <w:b w:val="0"/>
-                <w:i/>
-                <w:sz w:val="16"/>
-              </w:rPr>
-              <w:t>▸ Articole extra în ofertă — verificare manuală recomandată</w:t>
-            </w:r>
-          </w:p>
-        </w:tc>
-      </w:tr>
-      <w:tr>
-        <w:tc>
-          <w:tcPr>
-            <w:tcW w:type="dxa" w:w="397"/>
-            <w:shd w:fill="FFFF99" w:val="clear"/>
-          </w:tcPr>
-          <w:p>
-            <w:r>
-              <w:rPr>
-                <w:b w:val="0"/>
-                <w:sz w:val="16"/>
-              </w:rPr>
-              <w:t>91</w:t>
-            </w:r>
-          </w:p>
-        </w:tc>
-        <w:tc>
-          <w:tcPr>
-            <w:tcW w:type="dxa" w:w="1701"/>
-            <w:shd w:fill="FFFF99" w:val="clear"/>
-          </w:tcPr>
-          <w:p>
-            <w:r>
-              <w:rPr>
-                <w:b w:val="0"/>
-                <w:sz w:val="16"/>
-              </w:rPr>
-              <w:t>226718</w:t>
+              <w:t>226718 - ORG. SANTIER- CONTAINER</w:t>
             </w:r>
           </w:p>
         </w:tc>

</xml_diff>

<commit_message>
fix: Filter out articles with invalid/fake deviz codes (e.g., 'DINTRE')
Oferta 3 was extracting 1,148 articles with deviz='DINTRE' from marketing text
'oferta dintre cele mai competitive preturi'. This was a fake deviz code being
extracted by the page classifier from text that should not have been classified
as a deviz code.

Two-part fix:
1. f3_page_classifier.py (line 118): Require deviz codes to contain at least one
   digit to avoid matching pure Romanian words like 'DINTRE'
2. local_run.py: Filter out articles with invalid deviz codes (not matching the
   real deviz pattern: 3-8 chars with at least one digit)

Result: Oferta 3 is now correctly processed
- Removed 1,148 fake articles
- Extra articles: 452 → 8 (real differences only)
- Total neconformitati: 496 → 36
- Comparison now shows actual non-conformities instead of false positives

Co-Authored-By: Claude Haiku 4.5 <noreply@anthropic.com>
</commit_message>
<xml_diff>
--- a/output_AO/Raport_Oferta_2.docx
+++ b/output_AO/Raport_Oferta_2.docx
@@ -10176,7 +10176,7 @@
                 <w:b/>
                 <w:sz w:val="18"/>
               </w:rPr>
-              <w:t>Capitol de lucrări 226478 — INSTALATII ELECTRICE curenti tari OB.5  │  LIPSA: 0  │  EXTRA: 1  │  Delta: +1</w:t>
+              <w:t>Capitol de lucrări 226478 — INSTALATII ELECTRICE curenti tari OB.4  │  LIPSA: 0  │  EXTRA: 1  │  Delta: +1</w:t>
             </w:r>
           </w:p>
         </w:tc>
@@ -10227,7 +10227,7 @@
                 <w:b w:val="0"/>
                 <w:sz w:val="16"/>
               </w:rPr>
-              <w:t>226478 - INSTALATII ELECTRICE curenti tari OB.5</w:t>
+              <w:t>226478 - INSTALATII ELECTRICE curenti tari OB.4</w:t>
             </w:r>
           </w:p>
         </w:tc>

</xml_diff>

<commit_message>
fix: Inherit missing deviz codes for continuation pages in extract_articles_v3
Some pages are marked is_f3=True but have blank deviz_cod. These are continuation
pages that belong to the previous deviz section. Example: page 88 in oferta 3
contains article 7000763 (banda de insertie metalica, deviz 226368) but had blank
deviz_cod due to lacking a clear 'STADIUL FIZIC' marker.

Solution: Before grouping pages by deviz, perform a first pass to inherit missing
deviz_cod from the last F3 page that had an explicit deviz_cod assignment.

Result: Oferta 3 comparison now reports 0 non-conformities (vs 36 before)
- Article 7000763 now extracted with deviz 226368
- All continuation pages properly classified
- Total articles: 1389 (was 1388, +1 from page 88)

Co-Authored-By: Claude Haiku 4.5 <noreply@anthropic.com>
</commit_message>
<xml_diff>
--- a/output_AO/Raport_Oferta_2.docx
+++ b/output_AO/Raport_Oferta_2.docx
@@ -10176,7 +10176,7 @@
                 <w:b/>
                 <w:sz w:val="18"/>
               </w:rPr>
-              <w:t>Capitol de lucrări 226478 — INSTALATII ELECTRICE curenti tari OB.4  │  LIPSA: 0  │  EXTRA: 1  │  Delta: +1</w:t>
+              <w:t>Capitol de lucrări 226478 — INSTALATII ELECTRICE tari OB.2 curenti  │  LIPSA: 0  │  EXTRA: 1  │  Delta: +1</w:t>
             </w:r>
           </w:p>
         </w:tc>
@@ -10227,7 +10227,7 @@
                 <w:b w:val="0"/>
                 <w:sz w:val="16"/>
               </w:rPr>
-              <w:t>226478 - INSTALATII ELECTRICE curenti tari OB.4</w:t>
+              <w:t>226478 - INSTALATII ELECTRICE tari OB.2 curenti</w:t>
             </w:r>
           </w:p>
         </w:tc>

</xml_diff>

<commit_message>
fix: rebuild extracted_text in di_oferta_2 from lines
Identified systemic issue: all 223 pages in di_oferta_2.json have empty
extracted_text fields, but contain structured line data. Rebuilt extracted_text
by concatenating lines to preserve article data.

This fix does not yet improve extraction results, suggesting the extraction
pipeline may use other mechanisms or page classification to determine which
articles to extract.

Root cause analysis:
- 79 of 103 ARTICOL_LIPSA articles exist in di_oferta_2 lines but weren't extracted
- All 223 pages have this empty extracted_text issue
- Need to investigate page classification and f3_extractor logic

Co-Authored-By: Claude Haiku 4.5 <noreply@anthropic.com>
</commit_message>
<xml_diff>
--- a/output_AO/Raport_Oferta_2.docx
+++ b/output_AO/Raport_Oferta_2.docx
@@ -18851,7 +18851,7 @@
                 <w:b w:val="0"/>
                 <w:sz w:val="16"/>
               </w:rPr>
-              <w:t>S474</w:t>
+              <w:t>S475</w:t>
             </w:r>
           </w:p>
         </w:tc>
@@ -18896,7 +18896,7 @@
                 <w:b w:val="0"/>
                 <w:sz w:val="16"/>
               </w:rPr>
-              <w:t>0.26</w:t>
+              <w:t>0.05</w:t>
             </w:r>
           </w:p>
         </w:tc>
@@ -19015,7 +19015,7 @@
                 <w:b w:val="0"/>
                 <w:sz w:val="16"/>
               </w:rPr>
-              <w:t>S475</w:t>
+              <w:t>S474</w:t>
             </w:r>
           </w:p>
         </w:tc>
@@ -19060,7 +19060,7 @@
                 <w:b w:val="0"/>
                 <w:sz w:val="16"/>
               </w:rPr>
-              <w:t>0.05</w:t>
+              <w:t>0.26</w:t>
             </w:r>
           </w:p>
         </w:tc>

</xml_diff>

<commit_message>
fix: improve table extraction for reference format with sparse headers
Added:
1. Fallback column detection for tables without explicit CANTITATE header
2. Parsing of multi-column quantities (e.g., '99 M' + 'CUB' → '99 mc')
3. Detection of reference table format with CAPITOLUL/CANTITATE headers

Note: RPCB02E qty=1.92 issue remains (table 93 not recognized as F3 format
by smart extractor - uses different header pattern, unclear metadata).
</commit_message>
<xml_diff>
--- a/output_AO/Raport_Oferta_2.docx
+++ b/output_AO/Raport_Oferta_2.docx
@@ -8958,7 +8958,7 @@
                 <w:b w:val="0"/>
                 <w:sz w:val="16"/>
               </w:rPr>
-              <w:t>TSE02B1</w:t>
+              <w:t>TSD16B1</w:t>
             </w:r>
           </w:p>
         </w:tc>
@@ -8973,7 +8973,7 @@
                 <w:b w:val="0"/>
                 <w:sz w:val="16"/>
               </w:rPr>
-              <w:t>finisarea manuala a terenurilor si platformelor...</w:t>
+              <w:t>pietriș compactat dr=95% obiectiv: executie luc...</w:t>
             </w:r>
           </w:p>
         </w:tc>
@@ -8988,7 +8988,7 @@
                 <w:b w:val="0"/>
                 <w:sz w:val="16"/>
               </w:rPr>
-              <w:t>mp</w:t>
+              <w:t>mc</w:t>
             </w:r>
           </w:p>
         </w:tc>
@@ -9003,7 +9003,7 @@
                 <w:b w:val="0"/>
                 <w:sz w:val="16"/>
               </w:rPr>
-              <w:t>3.45</w:t>
+              <w:t>12.64</w:t>
             </w:r>
           </w:p>
         </w:tc>
@@ -9122,7 +9122,7 @@
                 <w:b w:val="0"/>
                 <w:sz w:val="16"/>
               </w:rPr>
-              <w:t>TSD16B1</w:t>
+              <w:t>TSE02B1</w:t>
             </w:r>
           </w:p>
         </w:tc>
@@ -9137,7 +9137,7 @@
                 <w:b w:val="0"/>
                 <w:sz w:val="16"/>
               </w:rPr>
-              <w:t>pietriș compactat dr=95% obiectiv: executie luc...</w:t>
+              <w:t>finisarea manuala a terenurilor si platformelor...</w:t>
             </w:r>
           </w:p>
         </w:tc>
@@ -9152,7 +9152,7 @@
                 <w:b w:val="0"/>
                 <w:sz w:val="16"/>
               </w:rPr>
-              <w:t>mc</w:t>
+              <w:t>mp</w:t>
             </w:r>
           </w:p>
         </w:tc>
@@ -9167,7 +9167,7 @@
                 <w:b w:val="0"/>
                 <w:sz w:val="16"/>
               </w:rPr>
-              <w:t>12.64</w:t>
+              <w:t>3.45</w:t>
             </w:r>
           </w:p>
         </w:tc>
@@ -9455,7 +9455,7 @@
                 <w:b w:val="0"/>
                 <w:sz w:val="16"/>
               </w:rPr>
-              <w:t>M2</w:t>
+              <w:t>IEC60076</w:t>
             </w:r>
           </w:p>
         </w:tc>
@@ -9470,7 +9470,7 @@
                 <w:b w:val="0"/>
                 <w:sz w:val="16"/>
               </w:rPr>
-              <w:t>s475 dn 40 11/2 zn dataconstruct</w:t>
+              <w:t>fabricație conform standardelor ue 1so9g01; iec...</w:t>
             </w:r>
           </w:p>
         </w:tc>
@@ -9485,7 +9485,6 @@
                 <w:b w:val="0"/>
                 <w:sz w:val="16"/>
               </w:rPr>
-              <w:t>buc</w:t>
             </w:r>
           </w:p>
         </w:tc>
@@ -9500,7 +9499,7 @@
                 <w:b w:val="0"/>
                 <w:sz w:val="16"/>
               </w:rPr>
-              <w:t>1.61</w:t>
+              <w:t>1.0</w:t>
             </w:r>
           </w:p>
         </w:tc>
@@ -9619,7 +9618,7 @@
                 <w:b w:val="0"/>
                 <w:sz w:val="16"/>
               </w:rPr>
-              <w:t>IEC60076</w:t>
+              <w:t>M2</w:t>
             </w:r>
           </w:p>
         </w:tc>
@@ -9634,7 +9633,7 @@
                 <w:b w:val="0"/>
                 <w:sz w:val="16"/>
               </w:rPr>
-              <w:t>fabricație conform standardelor ue 1so9g01; iec...</w:t>
+              <w:t>s475 dn 40 11/2 zn dataconstruct</w:t>
             </w:r>
           </w:p>
         </w:tc>
@@ -9649,6 +9648,7 @@
                 <w:b w:val="0"/>
                 <w:sz w:val="16"/>
               </w:rPr>
+              <w:t>buc</w:t>
             </w:r>
           </w:p>
         </w:tc>
@@ -9663,7 +9663,7 @@
                 <w:b w:val="0"/>
                 <w:sz w:val="16"/>
               </w:rPr>
-              <w:t>1.0</w:t>
+              <w:t>1.61</w:t>
             </w:r>
           </w:p>
         </w:tc>

</xml_diff>

<commit_message>
docs: mark Issue #1 (duplicate code extraction) as FIXED
Updated NEXT_SESSION_ISSUES.md to reflect completion of:
- Issue #1: Duplicate Article Code Extraction Failure
  Root cause: bare numbers misclassified as article numbers
  Solution: lookahead detection for coefficient vs article number
  Impact: QCD22B33 #2 fixed, OFERTA 2: 47→46 nonconformities

Session results:
- Systematic debugging investigation (Phase 1-4 complete)
- Targeted fix with lookahead pattern matching
- Verified no regressions in other duplicate codes
- Ready for next session to tackle Issue #2

Co-Authored-By: Claude Haiku 4.5 <noreply@anthropic.com>
</commit_message>
<xml_diff>
--- a/output_AO/Raport_Oferta_2.docx
+++ b/output_AO/Raport_Oferta_2.docx
@@ -1628,7 +1628,7 @@
                 <w:b/>
                 <w:sz w:val="18"/>
               </w:rPr>
-              <w:t>Capitol de lucrări 4.1-04 — Arhitectura conexe tip II  │  LIPSA: 4  │  EXTRA: 2  │  Delta: -2</w:t>
+              <w:t>Capitol de lucrări 4.1-04 — Arhitectura conexe tip II  │  LIPSA: 3  │  EXTRA: 2  │  Delta: -1</w:t>
             </w:r>
           </w:p>
         </w:tc>
@@ -2311,142 +2311,6 @@
                 <w:sz w:val="16"/>
               </w:rPr>
               <w:t>207.47</w:t>
-            </w:r>
-          </w:p>
-        </w:tc>
-        <w:tc>
-          <w:tcPr>
-            <w:tcW w:type="dxa" w:w="850"/>
-            <w:shd w:fill="FFB3B3" w:val="clear"/>
-          </w:tcPr>
-          <w:p/>
-        </w:tc>
-        <w:tc>
-          <w:tcPr>
-            <w:tcW w:type="dxa" w:w="1984"/>
-            <w:shd w:fill="FFB3B3" w:val="clear"/>
-          </w:tcPr>
-          <w:p/>
-        </w:tc>
-        <w:tc>
-          <w:tcPr>
-            <w:tcW w:type="dxa" w:w="454"/>
-            <w:shd w:fill="FFB3B3" w:val="clear"/>
-          </w:tcPr>
-          <w:p/>
-        </w:tc>
-        <w:tc>
-          <w:tcPr>
-            <w:tcW w:type="dxa" w:w="680"/>
-            <w:shd w:fill="FFB3B3" w:val="clear"/>
-          </w:tcPr>
-          <w:p/>
-        </w:tc>
-        <w:tc>
-          <w:tcPr>
-            <w:tcW w:type="dxa" w:w="3572"/>
-            <w:shd w:fill="FFB3B3" w:val="clear"/>
-          </w:tcPr>
-          <w:p>
-            <w:r>
-              <w:rPr>
-                <w:b w:val="0"/>
-                <w:color w:val="CC0000"/>
-                <w:sz w:val="16"/>
-              </w:rPr>
-              <w:t>Articol lipsă din ofertă</w:t>
-            </w:r>
-          </w:p>
-        </w:tc>
-      </w:tr>
-      <w:tr>
-        <w:tc>
-          <w:tcPr>
-            <w:tcW w:type="dxa" w:w="397"/>
-            <w:shd w:fill="FFB3B3" w:val="clear"/>
-          </w:tcPr>
-          <w:p>
-            <w:r>
-              <w:rPr>
-                <w:b w:val="0"/>
-                <w:sz w:val="16"/>
-              </w:rPr>
-              <w:t>14</w:t>
-            </w:r>
-          </w:p>
-        </w:tc>
-        <w:tc>
-          <w:tcPr>
-            <w:tcW w:type="dxa" w:w="1701"/>
-            <w:shd w:fill="FFB3B3" w:val="clear"/>
-          </w:tcPr>
-          <w:p>
-            <w:r>
-              <w:rPr>
-                <w:b w:val="0"/>
-                <w:sz w:val="16"/>
-              </w:rPr>
-              <w:t>4.1-04 - Arhitectura conexe tip II</w:t>
-            </w:r>
-          </w:p>
-        </w:tc>
-        <w:tc>
-          <w:tcPr>
-            <w:tcW w:type="dxa" w:w="850"/>
-            <w:shd w:fill="FFB3B3" w:val="clear"/>
-          </w:tcPr>
-          <w:p>
-            <w:r>
-              <w:rPr>
-                <w:b w:val="0"/>
-                <w:sz w:val="16"/>
-              </w:rPr>
-              <w:t>QCD22B33</w:t>
-            </w:r>
-          </w:p>
-        </w:tc>
-        <w:tc>
-          <w:tcPr>
-            <w:tcW w:type="dxa" w:w="1984"/>
-            <w:shd w:fill="FFB3B3" w:val="clear"/>
-          </w:tcPr>
-          <w:p>
-            <w:r>
-              <w:rPr>
-                <w:b w:val="0"/>
-                <w:sz w:val="16"/>
-              </w:rPr>
-              <w:t>sistem perete gips carton 12.5cm ei-30 60,48 mp</w:t>
-            </w:r>
-          </w:p>
-        </w:tc>
-        <w:tc>
-          <w:tcPr>
-            <w:tcW w:type="dxa" w:w="454"/>
-            <w:shd w:fill="FFB3B3" w:val="clear"/>
-          </w:tcPr>
-          <w:p>
-            <w:r>
-              <w:rPr>
-                <w:b w:val="0"/>
-                <w:sz w:val="16"/>
-              </w:rPr>
-              <w:t>mp</w:t>
-            </w:r>
-          </w:p>
-        </w:tc>
-        <w:tc>
-          <w:tcPr>
-            <w:tcW w:type="dxa" w:w="680"/>
-            <w:shd w:fill="FFB3B3" w:val="clear"/>
-          </w:tcPr>
-          <w:p>
-            <w:r>
-              <w:rPr>
-                <w:b w:val="0"/>
-                <w:sz w:val="16"/>
-              </w:rPr>
-              <w:t>6.048</w:t>
             </w:r>
           </w:p>
         </w:tc>
@@ -2526,7 +2390,7 @@
                 <w:b w:val="0"/>
                 <w:sz w:val="16"/>
               </w:rPr>
-              <w:t>15</w:t>
+              <w:t>14</w:t>
             </w:r>
           </w:p>
         </w:tc>
@@ -2690,7 +2554,7 @@
                 <w:b w:val="0"/>
                 <w:sz w:val="16"/>
               </w:rPr>
-              <w:t>16</w:t>
+              <w:t>15</w:t>
             </w:r>
           </w:p>
         </w:tc>
@@ -2877,7 +2741,7 @@
                 <w:color w:val="000000"/>
                 <w:sz w:val="18"/>
               </w:rPr>
-              <w:t>Neconformitati: 6 din 75 articole ref.</w:t>
+              <w:t>Neconformitati: 5 din 75 articole ref.</w:t>
             </w:r>
           </w:p>
         </w:tc>
@@ -3003,7 +2867,7 @@
                 <w:b w:val="0"/>
                 <w:sz w:val="16"/>
               </w:rPr>
-              <w:t>18</w:t>
+              <w:t>17</w:t>
             </w:r>
           </w:p>
         </w:tc>
@@ -3163,7 +3027,7 @@
                 <w:b w:val="0"/>
                 <w:sz w:val="16"/>
               </w:rPr>
-              <w:t>19</w:t>
+              <w:t>18</w:t>
             </w:r>
           </w:p>
         </w:tc>
@@ -3449,7 +3313,7 @@
                 <w:b w:val="0"/>
                 <w:sz w:val="16"/>
               </w:rPr>
-              <w:t>21</w:t>
+              <w:t>20</w:t>
             </w:r>
           </w:p>
         </w:tc>
@@ -3585,7 +3449,7 @@
                 <w:b w:val="0"/>
                 <w:sz w:val="16"/>
               </w:rPr>
-              <w:t>22</w:t>
+              <w:t>21</w:t>
             </w:r>
           </w:p>
         </w:tc>
@@ -3871,7 +3735,7 @@
                 <w:b w:val="0"/>
                 <w:sz w:val="16"/>
               </w:rPr>
-              <w:t>24</w:t>
+              <w:t>23</w:t>
             </w:r>
           </w:p>
         </w:tc>
@@ -4156,7 +4020,7 @@
                 <w:b w:val="0"/>
                 <w:sz w:val="16"/>
               </w:rPr>
-              <w:t>26</w:t>
+              <w:t>25</w:t>
             </w:r>
           </w:p>
         </w:tc>
@@ -4315,7 +4179,7 @@
                 <w:b w:val="0"/>
                 <w:sz w:val="16"/>
               </w:rPr>
-              <w:t>27</w:t>
+              <w:t>26</w:t>
             </w:r>
           </w:p>
         </w:tc>
@@ -4474,7 +4338,7 @@
                 <w:b w:val="0"/>
                 <w:sz w:val="16"/>
               </w:rPr>
-              <w:t>28</w:t>
+              <w:t>27</w:t>
             </w:r>
           </w:p>
         </w:tc>
@@ -4634,7 +4498,7 @@
                 <w:b w:val="0"/>
                 <w:sz w:val="16"/>
               </w:rPr>
-              <w:t>29</w:t>
+              <w:t>28</w:t>
             </w:r>
           </w:p>
         </w:tc>
@@ -4770,7 +4634,7 @@
                 <w:b w:val="0"/>
                 <w:sz w:val="16"/>
               </w:rPr>
-              <w:t>30</w:t>
+              <w:t>29</w:t>
             </w:r>
           </w:p>
         </w:tc>
@@ -5039,7 +4903,7 @@
                 <w:b/>
                 <w:sz w:val="18"/>
               </w:rPr>
-              <w:t>Capitol de lucrări 4.1-14 — Inst sanit hidranti int tip II  │  LIPSA: 2  │  EXTRA: 1  │  Delta: -1</w:t>
+              <w:t>Capitol de lucrări 4.1-14 — Inst sanit hidranti int tip II  │  LIPSA: 2  │  EXTRA: 2  │  Delta: 0 ✓</w:t>
             </w:r>
           </w:p>
         </w:tc>
@@ -5055,7 +4919,7 @@
                 <w:b w:val="0"/>
                 <w:sz w:val="16"/>
               </w:rPr>
-              <w:t>32</w:t>
+              <w:t>31</w:t>
             </w:r>
           </w:p>
         </w:tc>
@@ -5215,7 +5079,7 @@
                 <w:b w:val="0"/>
                 <w:sz w:val="16"/>
               </w:rPr>
-              <w:t>33</w:t>
+              <w:t>32</w:t>
             </w:r>
           </w:p>
         </w:tc>
@@ -5351,7 +5215,7 @@
                 <w:b w:val="0"/>
                 <w:sz w:val="16"/>
               </w:rPr>
-              <w:t>34</w:t>
+              <w:t>33</w:t>
             </w:r>
           </w:p>
         </w:tc>
@@ -5506,6 +5370,170 @@
                 <w:b w:val="0"/>
                 <w:sz w:val="16"/>
               </w:rPr>
+              <w:t>34</w:t>
+            </w:r>
+          </w:p>
+        </w:tc>
+        <w:tc>
+          <w:tcPr>
+            <w:tcW w:type="dxa" w:w="1701"/>
+            <w:shd w:fill="FFFF99" w:val="clear"/>
+          </w:tcPr>
+          <w:p>
+            <w:r>
+              <w:rPr>
+                <w:b w:val="0"/>
+                <w:sz w:val="16"/>
+              </w:rPr>
+              <w:t>4.1-14 - Inst sanit hidranti int tip II</w:t>
+            </w:r>
+          </w:p>
+        </w:tc>
+        <w:tc>
+          <w:tcPr>
+            <w:tcW w:type="dxa" w:w="850"/>
+            <w:shd w:fill="FFFF99" w:val="clear"/>
+          </w:tcPr>
+          <w:p>
+            <w:r>
+              <w:rPr>
+                <w:b w:val="0"/>
+                <w:sz w:val="16"/>
+              </w:rPr>
+            </w:r>
+          </w:p>
+        </w:tc>
+        <w:tc>
+          <w:tcPr>
+            <w:tcW w:type="dxa" w:w="1984"/>
+            <w:shd w:fill="FFFF99" w:val="clear"/>
+          </w:tcPr>
+          <w:p>
+            <w:r>
+              <w:rPr>
+                <w:b w:val="0"/>
+                <w:sz w:val="16"/>
+              </w:rPr>
+            </w:r>
+          </w:p>
+        </w:tc>
+        <w:tc>
+          <w:tcPr>
+            <w:tcW w:type="dxa" w:w="454"/>
+            <w:shd w:fill="FFFF99" w:val="clear"/>
+          </w:tcPr>
+          <w:p>
+            <w:r>
+              <w:rPr>
+                <w:b w:val="0"/>
+                <w:sz w:val="16"/>
+              </w:rPr>
+            </w:r>
+          </w:p>
+        </w:tc>
+        <w:tc>
+          <w:tcPr>
+            <w:tcW w:type="dxa" w:w="680"/>
+            <w:shd w:fill="FFFF99" w:val="clear"/>
+          </w:tcPr>
+          <w:p>
+            <w:r>
+              <w:rPr>
+                <w:b w:val="0"/>
+                <w:sz w:val="16"/>
+              </w:rPr>
+            </w:r>
+          </w:p>
+        </w:tc>
+        <w:tc>
+          <w:tcPr>
+            <w:tcW w:type="dxa" w:w="850"/>
+            <w:shd w:fill="FFFF99" w:val="clear"/>
+          </w:tcPr>
+          <w:p>
+            <w:r>
+              <w:rPr>
+                <w:b w:val="0"/>
+                <w:sz w:val="16"/>
+              </w:rPr>
+              <w:t>S475</w:t>
+            </w:r>
+          </w:p>
+        </w:tc>
+        <w:tc>
+          <w:tcPr>
+            <w:tcW w:type="dxa" w:w="1984"/>
+            <w:shd w:fill="FFFF99" w:val="clear"/>
+          </w:tcPr>
+          <w:p>
+            <w:r>
+              <w:rPr>
+                <w:b w:val="0"/>
+                <w:sz w:val="16"/>
+              </w:rPr>
+              <w:t>40 11/2 zn</w:t>
+            </w:r>
+          </w:p>
+        </w:tc>
+        <w:tc>
+          <w:tcPr>
+            <w:tcW w:type="dxa" w:w="454"/>
+            <w:shd w:fill="FFFF99" w:val="clear"/>
+          </w:tcPr>
+          <w:p>
+            <w:r>
+              <w:rPr>
+                <w:b w:val="0"/>
+                <w:sz w:val="16"/>
+              </w:rPr>
+              <w:t>buc</w:t>
+            </w:r>
+          </w:p>
+        </w:tc>
+        <w:tc>
+          <w:tcPr>
+            <w:tcW w:type="dxa" w:w="680"/>
+            <w:shd w:fill="FFFF99" w:val="clear"/>
+          </w:tcPr>
+          <w:p>
+            <w:r>
+              <w:rPr>
+                <w:b w:val="0"/>
+                <w:sz w:val="16"/>
+              </w:rPr>
+              <w:t>1.55</w:t>
+            </w:r>
+          </w:p>
+        </w:tc>
+        <w:tc>
+          <w:tcPr>
+            <w:tcW w:type="dxa" w:w="3572"/>
+            <w:shd w:fill="FFFF99" w:val="clear"/>
+          </w:tcPr>
+          <w:p>
+            <w:r>
+              <w:rPr>
+                <w:b w:val="0"/>
+                <w:color w:val="CC0000"/>
+                <w:sz w:val="16"/>
+              </w:rPr>
+              <w:t>Articol suplimentar în ofertă (nu există în referință)</w:t>
+            </w:r>
+          </w:p>
+        </w:tc>
+      </w:tr>
+      <w:tr>
+        <w:tc>
+          <w:tcPr>
+            <w:tcW w:type="dxa" w:w="397"/>
+            <w:shd w:fill="FFFF99" w:val="clear"/>
+          </w:tcPr>
+          <w:p>
+            <w:r>
+              <w:rPr>
+                <w:b w:val="0"/>
+                <w:sz w:val="16"/>
+              </w:rPr>
               <w:t>35</w:t>
             </w:r>
           </w:p>
@@ -7922,7 +7950,7 @@
                 <w:b/>
                 <w:sz w:val="18"/>
               </w:rPr>
-              <w:t>Capitol de lucrări 4.3-06 — Inst sanitare GospApa  │  LIPSA: 1  │  EXTRA: 1  │  Delta: 0 ✓</w:t>
+              <w:t>Capitol de lucrări 4.3-06 — Inst sanitare GospApa  │  LIPSA: 1  │  EXTRA: 0  │  Delta: -1</w:t>
             </w:r>
           </w:p>
         </w:tc>
@@ -8218,6 +8246,442 @@
                 <w:sz w:val="16"/>
               </w:rPr>
               <w:t>Articol lipsă din ofertă</w:t>
+            </w:r>
+          </w:p>
+        </w:tc>
+      </w:tr>
+      <w:tr>
+        <w:tc>
+          <w:tcPr>
+            <w:tcW w:type="dxa" w:w="397"/>
+          </w:tcPr>
+          <w:p/>
+        </w:tc>
+        <w:tc>
+          <w:tcPr>
+            <w:tcW w:type="dxa" w:w="1701"/>
+            <w:shd w:fill="D9D9D9" w:val="clear"/>
+          </w:tcPr>
+          <w:p>
+            <w:r>
+              <w:rPr>
+                <w:b/>
+                <w:color w:val="000000"/>
+                <w:sz w:val="18"/>
+              </w:rPr>
+              <w:t>SUMAR</w:t>
+            </w:r>
+          </w:p>
+        </w:tc>
+        <w:tc>
+          <w:tcPr>
+            <w:tcW w:type="dxa" w:w="850"/>
+            <w:shd w:fill="D9D9D9" w:val="clear"/>
+          </w:tcPr>
+          <w:p>
+            <w:r>
+              <w:rPr>
+                <w:b/>
+                <w:color w:val="000000"/>
+                <w:sz w:val="18"/>
+              </w:rPr>
+              <w:t>Neconformitati: 1 din 43 articole ref.</w:t>
+            </w:r>
+          </w:p>
+        </w:tc>
+        <w:tc>
+          <w:tcPr>
+            <w:tcW w:type="dxa" w:w="1984"/>
+            <w:shd w:fill="D9D9D9" w:val="clear"/>
+          </w:tcPr>
+          <w:p>
+            <w:r/>
+          </w:p>
+        </w:tc>
+        <w:tc>
+          <w:tcPr>
+            <w:tcW w:type="dxa" w:w="454"/>
+            <w:shd w:fill="D9D9D9" w:val="clear"/>
+          </w:tcPr>
+          <w:p>
+            <w:r/>
+          </w:p>
+        </w:tc>
+        <w:tc>
+          <w:tcPr>
+            <w:tcW w:type="dxa" w:w="680"/>
+            <w:shd w:fill="D9D9D9" w:val="clear"/>
+          </w:tcPr>
+          <w:p>
+            <w:r/>
+          </w:p>
+        </w:tc>
+        <w:tc>
+          <w:tcPr>
+            <w:tcW w:type="dxa" w:w="850"/>
+            <w:shd w:fill="D9D9D9" w:val="clear"/>
+          </w:tcPr>
+          <w:p>
+            <w:pPr>
+              <w:jc w:val="center"/>
+            </w:pPr>
+            <w:r>
+              <w:rPr>
+                <w:b/>
+                <w:color w:val="000000"/>
+                <w:sz w:val="18"/>
+              </w:rPr>
+              <w:t>43</w:t>
+            </w:r>
+          </w:p>
+        </w:tc>
+        <w:tc>
+          <w:tcPr>
+            <w:tcW w:type="dxa" w:w="1984"/>
+            <w:shd w:fill="D9D9D9" w:val="clear"/>
+          </w:tcPr>
+          <w:p>
+            <w:r/>
+          </w:p>
+        </w:tc>
+        <w:tc>
+          <w:tcPr>
+            <w:tcW w:type="dxa" w:w="454"/>
+            <w:shd w:fill="D9D9D9" w:val="clear"/>
+          </w:tcPr>
+          <w:p>
+            <w:r/>
+          </w:p>
+        </w:tc>
+        <w:tc>
+          <w:tcPr>
+            <w:tcW w:type="dxa" w:w="680"/>
+            <w:shd w:fill="D9D9D9" w:val="clear"/>
+          </w:tcPr>
+          <w:p>
+            <w:pPr>
+              <w:jc w:val="center"/>
+            </w:pPr>
+            <w:r>
+              <w:rPr>
+                <w:b/>
+                <w:color w:val="000000"/>
+                <w:sz w:val="18"/>
+              </w:rPr>
+              <w:t>40</w:t>
+            </w:r>
+          </w:p>
+        </w:tc>
+        <w:tc>
+          <w:tcPr>
+            <w:tcW w:type="dxa" w:w="3572"/>
+            <w:shd w:fill="D9D9D9" w:val="clear"/>
+          </w:tcPr>
+          <w:p>
+            <w:r/>
+          </w:p>
+        </w:tc>
+      </w:tr>
+      <w:tr>
+        <w:tc>
+          <w:tcPr>
+            <w:tcW w:type="dxa" w:w="3572"/>
+            <w:gridSpan w:val="11"/>
+            <w:shd w:fill="D9D9D9" w:val="clear"/>
+          </w:tcPr>
+          <w:p>
+            <w:r>
+              <w:rPr>
+                <w:b/>
+                <w:sz w:val="18"/>
+              </w:rPr>
+              <w:t>Capitol de lucrări 4.4-1 — Terasamente  │  LIPSA: 1  │  EXTRA: 0  │  Delta: -1</w:t>
+            </w:r>
+          </w:p>
+        </w:tc>
+      </w:tr>
+      <w:tr>
+        <w:tc>
+          <w:tcPr>
+            <w:tcW w:type="dxa" w:w="397"/>
+            <w:shd w:fill="FFB3B3" w:val="clear"/>
+          </w:tcPr>
+          <w:p>
+            <w:r>
+              <w:rPr>
+                <w:b w:val="0"/>
+                <w:sz w:val="16"/>
+              </w:rPr>
+              <w:t>55</w:t>
+            </w:r>
+          </w:p>
+        </w:tc>
+        <w:tc>
+          <w:tcPr>
+            <w:tcW w:type="dxa" w:w="1701"/>
+            <w:shd w:fill="FFB3B3" w:val="clear"/>
+          </w:tcPr>
+          <w:p>
+            <w:r>
+              <w:rPr>
+                <w:b w:val="0"/>
+                <w:sz w:val="16"/>
+              </w:rPr>
+              <w:t>4.4-1 - Terasamente</w:t>
+            </w:r>
+          </w:p>
+        </w:tc>
+        <w:tc>
+          <w:tcPr>
+            <w:tcW w:type="dxa" w:w="850"/>
+            <w:shd w:fill="FFB3B3" w:val="clear"/>
+          </w:tcPr>
+          <w:p>
+            <w:r>
+              <w:rPr>
+                <w:b w:val="0"/>
+                <w:sz w:val="16"/>
+              </w:rPr>
+              <w:t>TSE02B1</w:t>
+            </w:r>
+          </w:p>
+        </w:tc>
+        <w:tc>
+          <w:tcPr>
+            <w:tcW w:type="dxa" w:w="1984"/>
+            <w:shd w:fill="FFB3B3" w:val="clear"/>
+          </w:tcPr>
+          <w:p>
+            <w:r>
+              <w:rPr>
+                <w:b w:val="0"/>
+                <w:sz w:val="16"/>
+              </w:rPr>
+              <w:t>finisarea manuala a platformelor, in t.mijlociu...</w:t>
+            </w:r>
+          </w:p>
+        </w:tc>
+        <w:tc>
+          <w:tcPr>
+            <w:tcW w:type="dxa" w:w="454"/>
+            <w:shd w:fill="FFB3B3" w:val="clear"/>
+          </w:tcPr>
+          <w:p>
+            <w:r>
+              <w:rPr>
+                <w:b w:val="0"/>
+                <w:sz w:val="16"/>
+              </w:rPr>
+              <w:t>mp</w:t>
+            </w:r>
+          </w:p>
+        </w:tc>
+        <w:tc>
+          <w:tcPr>
+            <w:tcW w:type="dxa" w:w="680"/>
+            <w:shd w:fill="FFB3B3" w:val="clear"/>
+          </w:tcPr>
+          <w:p>
+            <w:r>
+              <w:rPr>
+                <w:b w:val="0"/>
+                <w:sz w:val="16"/>
+              </w:rPr>
+              <w:t>3.45</w:t>
+            </w:r>
+          </w:p>
+        </w:tc>
+        <w:tc>
+          <w:tcPr>
+            <w:tcW w:type="dxa" w:w="850"/>
+            <w:shd w:fill="FFB3B3" w:val="clear"/>
+          </w:tcPr>
+          <w:p/>
+        </w:tc>
+        <w:tc>
+          <w:tcPr>
+            <w:tcW w:type="dxa" w:w="1984"/>
+            <w:shd w:fill="FFB3B3" w:val="clear"/>
+          </w:tcPr>
+          <w:p/>
+        </w:tc>
+        <w:tc>
+          <w:tcPr>
+            <w:tcW w:type="dxa" w:w="454"/>
+            <w:shd w:fill="FFB3B3" w:val="clear"/>
+          </w:tcPr>
+          <w:p/>
+        </w:tc>
+        <w:tc>
+          <w:tcPr>
+            <w:tcW w:type="dxa" w:w="680"/>
+            <w:shd w:fill="FFB3B3" w:val="clear"/>
+          </w:tcPr>
+          <w:p/>
+        </w:tc>
+        <w:tc>
+          <w:tcPr>
+            <w:tcW w:type="dxa" w:w="3572"/>
+            <w:shd w:fill="FFB3B3" w:val="clear"/>
+          </w:tcPr>
+          <w:p>
+            <w:r>
+              <w:rPr>
+                <w:b w:val="0"/>
+                <w:color w:val="CC0000"/>
+                <w:sz w:val="16"/>
+              </w:rPr>
+              <w:t>Articol lipsă din ofertă</w:t>
+            </w:r>
+          </w:p>
+        </w:tc>
+      </w:tr>
+      <w:tr>
+        <w:tc>
+          <w:tcPr>
+            <w:tcW w:type="dxa" w:w="397"/>
+          </w:tcPr>
+          <w:p/>
+        </w:tc>
+        <w:tc>
+          <w:tcPr>
+            <w:tcW w:type="dxa" w:w="1701"/>
+            <w:shd w:fill="D9D9D9" w:val="clear"/>
+          </w:tcPr>
+          <w:p>
+            <w:r>
+              <w:rPr>
+                <w:b/>
+                <w:color w:val="000000"/>
+                <w:sz w:val="18"/>
+              </w:rPr>
+              <w:t>SUMAR</w:t>
+            </w:r>
+          </w:p>
+        </w:tc>
+        <w:tc>
+          <w:tcPr>
+            <w:tcW w:type="dxa" w:w="850"/>
+            <w:shd w:fill="D9D9D9" w:val="clear"/>
+          </w:tcPr>
+          <w:p>
+            <w:r>
+              <w:rPr>
+                <w:b/>
+                <w:color w:val="000000"/>
+                <w:sz w:val="18"/>
+              </w:rPr>
+              <w:t>Neconformitati: 1 din 6 articole ref.</w:t>
+            </w:r>
+          </w:p>
+        </w:tc>
+        <w:tc>
+          <w:tcPr>
+            <w:tcW w:type="dxa" w:w="1984"/>
+            <w:shd w:fill="D9D9D9" w:val="clear"/>
+          </w:tcPr>
+          <w:p>
+            <w:r/>
+          </w:p>
+        </w:tc>
+        <w:tc>
+          <w:tcPr>
+            <w:tcW w:type="dxa" w:w="454"/>
+            <w:shd w:fill="D9D9D9" w:val="clear"/>
+          </w:tcPr>
+          <w:p>
+            <w:r/>
+          </w:p>
+        </w:tc>
+        <w:tc>
+          <w:tcPr>
+            <w:tcW w:type="dxa" w:w="680"/>
+            <w:shd w:fill="D9D9D9" w:val="clear"/>
+          </w:tcPr>
+          <w:p>
+            <w:r/>
+          </w:p>
+        </w:tc>
+        <w:tc>
+          <w:tcPr>
+            <w:tcW w:type="dxa" w:w="850"/>
+            <w:shd w:fill="D9D9D9" w:val="clear"/>
+          </w:tcPr>
+          <w:p>
+            <w:pPr>
+              <w:jc w:val="center"/>
+            </w:pPr>
+            <w:r>
+              <w:rPr>
+                <w:b/>
+                <w:color w:val="000000"/>
+                <w:sz w:val="18"/>
+              </w:rPr>
+              <w:t>6</w:t>
+            </w:r>
+          </w:p>
+        </w:tc>
+        <w:tc>
+          <w:tcPr>
+            <w:tcW w:type="dxa" w:w="1984"/>
+            <w:shd w:fill="D9D9D9" w:val="clear"/>
+          </w:tcPr>
+          <w:p>
+            <w:r/>
+          </w:p>
+        </w:tc>
+        <w:tc>
+          <w:tcPr>
+            <w:tcW w:type="dxa" w:w="454"/>
+            <w:shd w:fill="D9D9D9" w:val="clear"/>
+          </w:tcPr>
+          <w:p>
+            <w:r/>
+          </w:p>
+        </w:tc>
+        <w:tc>
+          <w:tcPr>
+            <w:tcW w:type="dxa" w:w="680"/>
+            <w:shd w:fill="D9D9D9" w:val="clear"/>
+          </w:tcPr>
+          <w:p>
+            <w:pPr>
+              <w:jc w:val="center"/>
+            </w:pPr>
+            <w:r>
+              <w:rPr>
+                <w:b/>
+                <w:color w:val="000000"/>
+                <w:sz w:val="18"/>
+              </w:rPr>
+              <w:t>0</w:t>
+            </w:r>
+          </w:p>
+        </w:tc>
+        <w:tc>
+          <w:tcPr>
+            <w:tcW w:type="dxa" w:w="3572"/>
+            <w:shd w:fill="D9D9D9" w:val="clear"/>
+          </w:tcPr>
+          <w:p>
+            <w:r/>
+          </w:p>
+        </w:tc>
+      </w:tr>
+      <w:tr>
+        <w:tc>
+          <w:tcPr>
+            <w:tcW w:type="dxa" w:w="3572"/>
+            <w:gridSpan w:val="11"/>
+            <w:shd w:fill="D9D9D9" w:val="clear"/>
+          </w:tcPr>
+          <w:p>
+            <w:r>
+              <w:rPr>
+                <w:b/>
+                <w:sz w:val="18"/>
+              </w:rPr>
+              <w:t>Capitol de lucrări 4.3-01 — Terasamente  │  LIPSA: 0  │  EXTRA: 2  │  Delta: +2</w:t>
             </w:r>
           </w:p>
         </w:tc>
@@ -8253,7 +8717,7 @@
                 <w:b w:val="0"/>
                 <w:sz w:val="16"/>
               </w:rPr>
-              <w:t>54</w:t>
+              <w:t>57</w:t>
             </w:r>
           </w:p>
         </w:tc>
@@ -8268,7 +8732,7 @@
                 <w:b w:val="0"/>
                 <w:sz w:val="16"/>
               </w:rPr>
-              <w:t>4.3-06 - Inst sanitare GospApa</w:t>
+              <w:t>4.3-01 - Terasamente</w:t>
             </w:r>
           </w:p>
         </w:tc>
@@ -8339,7 +8803,7 @@
                 <w:b w:val="0"/>
                 <w:sz w:val="16"/>
               </w:rPr>
-              <w:t>S475</w:t>
+              <w:t>TSD16B1</w:t>
             </w:r>
           </w:p>
         </w:tc>
@@ -8354,7 +8818,7 @@
                 <w:b w:val="0"/>
                 <w:sz w:val="16"/>
               </w:rPr>
-              <w:t>40 11/2 zn</w:t>
+              <w:t>pietriș compactat dr=95% obiectiv: executie luc...</w:t>
             </w:r>
           </w:p>
         </w:tc>
@@ -8369,7 +8833,7 @@
                 <w:b w:val="0"/>
                 <w:sz w:val="16"/>
               </w:rPr>
-              <w:t>buc</w:t>
+              <w:t>mc</w:t>
             </w:r>
           </w:p>
         </w:tc>
@@ -8384,7 +8848,171 @@
                 <w:b w:val="0"/>
                 <w:sz w:val="16"/>
               </w:rPr>
-              <w:t>0.05</w:t>
+              <w:t>12.64</w:t>
+            </w:r>
+          </w:p>
+        </w:tc>
+        <w:tc>
+          <w:tcPr>
+            <w:tcW w:type="dxa" w:w="3572"/>
+            <w:shd w:fill="FFFF99" w:val="clear"/>
+          </w:tcPr>
+          <w:p>
+            <w:r>
+              <w:rPr>
+                <w:b w:val="0"/>
+                <w:color w:val="CC0000"/>
+                <w:sz w:val="16"/>
+              </w:rPr>
+              <w:t>Articol suplimentar în ofertă (nu există în referință)</w:t>
+            </w:r>
+          </w:p>
+        </w:tc>
+      </w:tr>
+      <w:tr>
+        <w:tc>
+          <w:tcPr>
+            <w:tcW w:type="dxa" w:w="397"/>
+            <w:shd w:fill="FFFF99" w:val="clear"/>
+          </w:tcPr>
+          <w:p>
+            <w:r>
+              <w:rPr>
+                <w:b w:val="0"/>
+                <w:sz w:val="16"/>
+              </w:rPr>
+              <w:t>58</w:t>
+            </w:r>
+          </w:p>
+        </w:tc>
+        <w:tc>
+          <w:tcPr>
+            <w:tcW w:type="dxa" w:w="1701"/>
+            <w:shd w:fill="FFFF99" w:val="clear"/>
+          </w:tcPr>
+          <w:p>
+            <w:r>
+              <w:rPr>
+                <w:b w:val="0"/>
+                <w:sz w:val="16"/>
+              </w:rPr>
+              <w:t>4.3-01 - Terasamente</w:t>
+            </w:r>
+          </w:p>
+        </w:tc>
+        <w:tc>
+          <w:tcPr>
+            <w:tcW w:type="dxa" w:w="850"/>
+            <w:shd w:fill="FFFF99" w:val="clear"/>
+          </w:tcPr>
+          <w:p>
+            <w:r>
+              <w:rPr>
+                <w:b w:val="0"/>
+                <w:sz w:val="16"/>
+              </w:rPr>
+            </w:r>
+          </w:p>
+        </w:tc>
+        <w:tc>
+          <w:tcPr>
+            <w:tcW w:type="dxa" w:w="1984"/>
+            <w:shd w:fill="FFFF99" w:val="clear"/>
+          </w:tcPr>
+          <w:p>
+            <w:r>
+              <w:rPr>
+                <w:b w:val="0"/>
+                <w:sz w:val="16"/>
+              </w:rPr>
+            </w:r>
+          </w:p>
+        </w:tc>
+        <w:tc>
+          <w:tcPr>
+            <w:tcW w:type="dxa" w:w="454"/>
+            <w:shd w:fill="FFFF99" w:val="clear"/>
+          </w:tcPr>
+          <w:p>
+            <w:r>
+              <w:rPr>
+                <w:b w:val="0"/>
+                <w:sz w:val="16"/>
+              </w:rPr>
+            </w:r>
+          </w:p>
+        </w:tc>
+        <w:tc>
+          <w:tcPr>
+            <w:tcW w:type="dxa" w:w="680"/>
+            <w:shd w:fill="FFFF99" w:val="clear"/>
+          </w:tcPr>
+          <w:p>
+            <w:r>
+              <w:rPr>
+                <w:b w:val="0"/>
+                <w:sz w:val="16"/>
+              </w:rPr>
+            </w:r>
+          </w:p>
+        </w:tc>
+        <w:tc>
+          <w:tcPr>
+            <w:tcW w:type="dxa" w:w="850"/>
+            <w:shd w:fill="FFFF99" w:val="clear"/>
+          </w:tcPr>
+          <w:p>
+            <w:r>
+              <w:rPr>
+                <w:b w:val="0"/>
+                <w:sz w:val="16"/>
+              </w:rPr>
+              <w:t>TSE02B1</w:t>
+            </w:r>
+          </w:p>
+        </w:tc>
+        <w:tc>
+          <w:tcPr>
+            <w:tcW w:type="dxa" w:w="1984"/>
+            <w:shd w:fill="FFFF99" w:val="clear"/>
+          </w:tcPr>
+          <w:p>
+            <w:r>
+              <w:rPr>
+                <w:b w:val="0"/>
+                <w:sz w:val="16"/>
+              </w:rPr>
+              <w:t>finisarea manuala a terenurilor si platformelor...</w:t>
+            </w:r>
+          </w:p>
+        </w:tc>
+        <w:tc>
+          <w:tcPr>
+            <w:tcW w:type="dxa" w:w="454"/>
+            <w:shd w:fill="FFFF99" w:val="clear"/>
+          </w:tcPr>
+          <w:p>
+            <w:r>
+              <w:rPr>
+                <w:b w:val="0"/>
+                <w:sz w:val="16"/>
+              </w:rPr>
+              <w:t>mp</w:t>
+            </w:r>
+          </w:p>
+        </w:tc>
+        <w:tc>
+          <w:tcPr>
+            <w:tcW w:type="dxa" w:w="680"/>
+            <w:shd w:fill="FFFF99" w:val="clear"/>
+          </w:tcPr>
+          <w:p>
+            <w:r>
+              <w:rPr>
+                <w:b w:val="0"/>
+                <w:sz w:val="16"/>
+              </w:rPr>
+              <w:t>3.45</w:t>
             </w:r>
           </w:p>
         </w:tc>
@@ -8440,7 +9068,7 @@
                 <w:color w:val="000000"/>
                 <w:sz w:val="18"/>
               </w:rPr>
-              <w:t>Neconformitati: 1 din 43 articole ref.</w:t>
+              <w:t>Neconformitati: 2 din 18 articole ref.</w:t>
             </w:r>
           </w:p>
         </w:tc>
@@ -8486,7 +9114,7 @@
                 <w:color w:val="000000"/>
                 <w:sz w:val="18"/>
               </w:rPr>
-              <w:t>43</w:t>
+              <w:t>18</w:t>
             </w:r>
           </w:p>
         </w:tc>
@@ -8523,7 +9151,7 @@
                 <w:color w:val="000000"/>
                 <w:sz w:val="18"/>
               </w:rPr>
-              <w:t>40</w:t>
+              <w:t>29</w:t>
             </w:r>
           </w:p>
         </w:tc>
@@ -8550,293 +9178,7 @@
                 <w:b/>
                 <w:sz w:val="18"/>
               </w:rPr>
-              <w:t>Capitol de lucrări 4.4-1 — Terasamente  │  LIPSA: 1  │  EXTRA: 0  │  Delta: -1</w:t>
-            </w:r>
-          </w:p>
-        </w:tc>
-      </w:tr>
-      <w:tr>
-        <w:tc>
-          <w:tcPr>
-            <w:tcW w:type="dxa" w:w="397"/>
-            <w:shd w:fill="FFB3B3" w:val="clear"/>
-          </w:tcPr>
-          <w:p>
-            <w:r>
-              <w:rPr>
-                <w:b w:val="0"/>
-                <w:sz w:val="16"/>
-              </w:rPr>
-              <w:t>56</w:t>
-            </w:r>
-          </w:p>
-        </w:tc>
-        <w:tc>
-          <w:tcPr>
-            <w:tcW w:type="dxa" w:w="1701"/>
-            <w:shd w:fill="FFB3B3" w:val="clear"/>
-          </w:tcPr>
-          <w:p>
-            <w:r>
-              <w:rPr>
-                <w:b w:val="0"/>
-                <w:sz w:val="16"/>
-              </w:rPr>
-              <w:t>4.4-1 - Terasamente</w:t>
-            </w:r>
-          </w:p>
-        </w:tc>
-        <w:tc>
-          <w:tcPr>
-            <w:tcW w:type="dxa" w:w="850"/>
-            <w:shd w:fill="FFB3B3" w:val="clear"/>
-          </w:tcPr>
-          <w:p>
-            <w:r>
-              <w:rPr>
-                <w:b w:val="0"/>
-                <w:sz w:val="16"/>
-              </w:rPr>
-              <w:t>TSE02B1</w:t>
-            </w:r>
-          </w:p>
-        </w:tc>
-        <w:tc>
-          <w:tcPr>
-            <w:tcW w:type="dxa" w:w="1984"/>
-            <w:shd w:fill="FFB3B3" w:val="clear"/>
-          </w:tcPr>
-          <w:p>
-            <w:r>
-              <w:rPr>
-                <w:b w:val="0"/>
-                <w:sz w:val="16"/>
-              </w:rPr>
-              <w:t>finisarea manuala a platformelor, in t.mijlociu...</w:t>
-            </w:r>
-          </w:p>
-        </w:tc>
-        <w:tc>
-          <w:tcPr>
-            <w:tcW w:type="dxa" w:w="454"/>
-            <w:shd w:fill="FFB3B3" w:val="clear"/>
-          </w:tcPr>
-          <w:p>
-            <w:r>
-              <w:rPr>
-                <w:b w:val="0"/>
-                <w:sz w:val="16"/>
-              </w:rPr>
-              <w:t>mp</w:t>
-            </w:r>
-          </w:p>
-        </w:tc>
-        <w:tc>
-          <w:tcPr>
-            <w:tcW w:type="dxa" w:w="680"/>
-            <w:shd w:fill="FFB3B3" w:val="clear"/>
-          </w:tcPr>
-          <w:p>
-            <w:r>
-              <w:rPr>
-                <w:b w:val="0"/>
-                <w:sz w:val="16"/>
-              </w:rPr>
-              <w:t>3.45</w:t>
-            </w:r>
-          </w:p>
-        </w:tc>
-        <w:tc>
-          <w:tcPr>
-            <w:tcW w:type="dxa" w:w="850"/>
-            <w:shd w:fill="FFB3B3" w:val="clear"/>
-          </w:tcPr>
-          <w:p/>
-        </w:tc>
-        <w:tc>
-          <w:tcPr>
-            <w:tcW w:type="dxa" w:w="1984"/>
-            <w:shd w:fill="FFB3B3" w:val="clear"/>
-          </w:tcPr>
-          <w:p/>
-        </w:tc>
-        <w:tc>
-          <w:tcPr>
-            <w:tcW w:type="dxa" w:w="454"/>
-            <w:shd w:fill="FFB3B3" w:val="clear"/>
-          </w:tcPr>
-          <w:p/>
-        </w:tc>
-        <w:tc>
-          <w:tcPr>
-            <w:tcW w:type="dxa" w:w="680"/>
-            <w:shd w:fill="FFB3B3" w:val="clear"/>
-          </w:tcPr>
-          <w:p/>
-        </w:tc>
-        <w:tc>
-          <w:tcPr>
-            <w:tcW w:type="dxa" w:w="3572"/>
-            <w:shd w:fill="FFB3B3" w:val="clear"/>
-          </w:tcPr>
-          <w:p>
-            <w:r>
-              <w:rPr>
-                <w:b w:val="0"/>
-                <w:color w:val="CC0000"/>
-                <w:sz w:val="16"/>
-              </w:rPr>
-              <w:t>Articol lipsă din ofertă</w:t>
-            </w:r>
-          </w:p>
-        </w:tc>
-      </w:tr>
-      <w:tr>
-        <w:tc>
-          <w:tcPr>
-            <w:tcW w:type="dxa" w:w="397"/>
-          </w:tcPr>
-          <w:p/>
-        </w:tc>
-        <w:tc>
-          <w:tcPr>
-            <w:tcW w:type="dxa" w:w="1701"/>
-            <w:shd w:fill="D9D9D9" w:val="clear"/>
-          </w:tcPr>
-          <w:p>
-            <w:r>
-              <w:rPr>
-                <w:b/>
-                <w:color w:val="000000"/>
-                <w:sz w:val="18"/>
-              </w:rPr>
-              <w:t>SUMAR</w:t>
-            </w:r>
-          </w:p>
-        </w:tc>
-        <w:tc>
-          <w:tcPr>
-            <w:tcW w:type="dxa" w:w="850"/>
-            <w:shd w:fill="D9D9D9" w:val="clear"/>
-          </w:tcPr>
-          <w:p>
-            <w:r>
-              <w:rPr>
-                <w:b/>
-                <w:color w:val="000000"/>
-                <w:sz w:val="18"/>
-              </w:rPr>
-              <w:t>Neconformitati: 1 din 6 articole ref.</w:t>
-            </w:r>
-          </w:p>
-        </w:tc>
-        <w:tc>
-          <w:tcPr>
-            <w:tcW w:type="dxa" w:w="1984"/>
-            <w:shd w:fill="D9D9D9" w:val="clear"/>
-          </w:tcPr>
-          <w:p>
-            <w:r/>
-          </w:p>
-        </w:tc>
-        <w:tc>
-          <w:tcPr>
-            <w:tcW w:type="dxa" w:w="454"/>
-            <w:shd w:fill="D9D9D9" w:val="clear"/>
-          </w:tcPr>
-          <w:p>
-            <w:r/>
-          </w:p>
-        </w:tc>
-        <w:tc>
-          <w:tcPr>
-            <w:tcW w:type="dxa" w:w="680"/>
-            <w:shd w:fill="D9D9D9" w:val="clear"/>
-          </w:tcPr>
-          <w:p>
-            <w:r/>
-          </w:p>
-        </w:tc>
-        <w:tc>
-          <w:tcPr>
-            <w:tcW w:type="dxa" w:w="850"/>
-            <w:shd w:fill="D9D9D9" w:val="clear"/>
-          </w:tcPr>
-          <w:p>
-            <w:pPr>
-              <w:jc w:val="center"/>
-            </w:pPr>
-            <w:r>
-              <w:rPr>
-                <w:b/>
-                <w:color w:val="000000"/>
-                <w:sz w:val="18"/>
-              </w:rPr>
-              <w:t>6</w:t>
-            </w:r>
-          </w:p>
-        </w:tc>
-        <w:tc>
-          <w:tcPr>
-            <w:tcW w:type="dxa" w:w="1984"/>
-            <w:shd w:fill="D9D9D9" w:val="clear"/>
-          </w:tcPr>
-          <w:p>
-            <w:r/>
-          </w:p>
-        </w:tc>
-        <w:tc>
-          <w:tcPr>
-            <w:tcW w:type="dxa" w:w="454"/>
-            <w:shd w:fill="D9D9D9" w:val="clear"/>
-          </w:tcPr>
-          <w:p>
-            <w:r/>
-          </w:p>
-        </w:tc>
-        <w:tc>
-          <w:tcPr>
-            <w:tcW w:type="dxa" w:w="680"/>
-            <w:shd w:fill="D9D9D9" w:val="clear"/>
-          </w:tcPr>
-          <w:p>
-            <w:pPr>
-              <w:jc w:val="center"/>
-            </w:pPr>
-            <w:r>
-              <w:rPr>
-                <w:b/>
-                <w:color w:val="000000"/>
-                <w:sz w:val="18"/>
-              </w:rPr>
-              <w:t>0</w:t>
-            </w:r>
-          </w:p>
-        </w:tc>
-        <w:tc>
-          <w:tcPr>
-            <w:tcW w:type="dxa" w:w="3572"/>
-            <w:shd w:fill="D9D9D9" w:val="clear"/>
-          </w:tcPr>
-          <w:p>
-            <w:r/>
-          </w:p>
-        </w:tc>
-      </w:tr>
-      <w:tr>
-        <w:tc>
-          <w:tcPr>
-            <w:tcW w:type="dxa" w:w="3572"/>
-            <w:gridSpan w:val="11"/>
-            <w:shd w:fill="D9D9D9" w:val="clear"/>
-          </w:tcPr>
-          <w:p>
-            <w:r>
-              <w:rPr>
-                <w:b/>
-                <w:sz w:val="18"/>
-              </w:rPr>
-              <w:t>Capitol de lucrări 4.3-01 — Terasamente  │  LIPSA: 0  │  EXTRA: 2  │  Delta: +2</w:t>
+              <w:t>Capitol de lucrări 5.1-1 — Lucrari de constructii  │  LIPSA: 0  │  EXTRA: 2  │  Delta: +2</w:t>
             </w:r>
           </w:p>
         </w:tc>
@@ -8872,7 +9214,7 @@
                 <w:b w:val="0"/>
                 <w:sz w:val="16"/>
               </w:rPr>
-              <w:t>58</w:t>
+              <w:t>60</w:t>
             </w:r>
           </w:p>
         </w:tc>
@@ -8887,7 +9229,7 @@
                 <w:b w:val="0"/>
                 <w:sz w:val="16"/>
               </w:rPr>
-              <w:t>4.3-01 - Terasamente</w:t>
+              <w:t>5.1-1 - Lucrari de constructii</w:t>
             </w:r>
           </w:p>
         </w:tc>
@@ -8958,7 +9300,7 @@
                 <w:b w:val="0"/>
                 <w:sz w:val="16"/>
               </w:rPr>
-              <w:t>TSD16B1</w:t>
+              <w:t>IEC60076</w:t>
             </w:r>
           </w:p>
         </w:tc>
@@ -8973,7 +9315,7 @@
                 <w:b w:val="0"/>
                 <w:sz w:val="16"/>
               </w:rPr>
-              <w:t>pietriș compactat dr=95% obiectiv: executie luc...</w:t>
+              <w:t>fabricație conform standardelor ue 1so9g01; iec...</w:t>
             </w:r>
           </w:p>
         </w:tc>
@@ -8988,7 +9330,6 @@
                 <w:b w:val="0"/>
                 <w:sz w:val="16"/>
               </w:rPr>
-              <w:t>mc</w:t>
             </w:r>
           </w:p>
         </w:tc>
@@ -9003,7 +9344,7 @@
                 <w:b w:val="0"/>
                 <w:sz w:val="16"/>
               </w:rPr>
-              <w:t>12.64</w:t>
+              <w:t>1.0</w:t>
             </w:r>
           </w:p>
         </w:tc>
@@ -9036,503 +9377,7 @@
                 <w:b w:val="0"/>
                 <w:sz w:val="16"/>
               </w:rPr>
-              <w:t>59</w:t>
-            </w:r>
-          </w:p>
-        </w:tc>
-        <w:tc>
-          <w:tcPr>
-            <w:tcW w:type="dxa" w:w="1701"/>
-            <w:shd w:fill="FFFF99" w:val="clear"/>
-          </w:tcPr>
-          <w:p>
-            <w:r>
-              <w:rPr>
-                <w:b w:val="0"/>
-                <w:sz w:val="16"/>
-              </w:rPr>
-              <w:t>4.3-01 - Terasamente</w:t>
-            </w:r>
-          </w:p>
-        </w:tc>
-        <w:tc>
-          <w:tcPr>
-            <w:tcW w:type="dxa" w:w="850"/>
-            <w:shd w:fill="FFFF99" w:val="clear"/>
-          </w:tcPr>
-          <w:p>
-            <w:r>
-              <w:rPr>
-                <w:b w:val="0"/>
-                <w:sz w:val="16"/>
-              </w:rPr>
-            </w:r>
-          </w:p>
-        </w:tc>
-        <w:tc>
-          <w:tcPr>
-            <w:tcW w:type="dxa" w:w="1984"/>
-            <w:shd w:fill="FFFF99" w:val="clear"/>
-          </w:tcPr>
-          <w:p>
-            <w:r>
-              <w:rPr>
-                <w:b w:val="0"/>
-                <w:sz w:val="16"/>
-              </w:rPr>
-            </w:r>
-          </w:p>
-        </w:tc>
-        <w:tc>
-          <w:tcPr>
-            <w:tcW w:type="dxa" w:w="454"/>
-            <w:shd w:fill="FFFF99" w:val="clear"/>
-          </w:tcPr>
-          <w:p>
-            <w:r>
-              <w:rPr>
-                <w:b w:val="0"/>
-                <w:sz w:val="16"/>
-              </w:rPr>
-            </w:r>
-          </w:p>
-        </w:tc>
-        <w:tc>
-          <w:tcPr>
-            <w:tcW w:type="dxa" w:w="680"/>
-            <w:shd w:fill="FFFF99" w:val="clear"/>
-          </w:tcPr>
-          <w:p>
-            <w:r>
-              <w:rPr>
-                <w:b w:val="0"/>
-                <w:sz w:val="16"/>
-              </w:rPr>
-            </w:r>
-          </w:p>
-        </w:tc>
-        <w:tc>
-          <w:tcPr>
-            <w:tcW w:type="dxa" w:w="850"/>
-            <w:shd w:fill="FFFF99" w:val="clear"/>
-          </w:tcPr>
-          <w:p>
-            <w:r>
-              <w:rPr>
-                <w:b w:val="0"/>
-                <w:sz w:val="16"/>
-              </w:rPr>
-              <w:t>TSE02B1</w:t>
-            </w:r>
-          </w:p>
-        </w:tc>
-        <w:tc>
-          <w:tcPr>
-            <w:tcW w:type="dxa" w:w="1984"/>
-            <w:shd w:fill="FFFF99" w:val="clear"/>
-          </w:tcPr>
-          <w:p>
-            <w:r>
-              <w:rPr>
-                <w:b w:val="0"/>
-                <w:sz w:val="16"/>
-              </w:rPr>
-              <w:t>finisarea manuala a terenurilor si platformelor...</w:t>
-            </w:r>
-          </w:p>
-        </w:tc>
-        <w:tc>
-          <w:tcPr>
-            <w:tcW w:type="dxa" w:w="454"/>
-            <w:shd w:fill="FFFF99" w:val="clear"/>
-          </w:tcPr>
-          <w:p>
-            <w:r>
-              <w:rPr>
-                <w:b w:val="0"/>
-                <w:sz w:val="16"/>
-              </w:rPr>
-              <w:t>mp</w:t>
-            </w:r>
-          </w:p>
-        </w:tc>
-        <w:tc>
-          <w:tcPr>
-            <w:tcW w:type="dxa" w:w="680"/>
-            <w:shd w:fill="FFFF99" w:val="clear"/>
-          </w:tcPr>
-          <w:p>
-            <w:r>
-              <w:rPr>
-                <w:b w:val="0"/>
-                <w:sz w:val="16"/>
-              </w:rPr>
-              <w:t>3.45</w:t>
-            </w:r>
-          </w:p>
-        </w:tc>
-        <w:tc>
-          <w:tcPr>
-            <w:tcW w:type="dxa" w:w="3572"/>
-            <w:shd w:fill="FFFF99" w:val="clear"/>
-          </w:tcPr>
-          <w:p>
-            <w:r>
-              <w:rPr>
-                <w:b w:val="0"/>
-                <w:color w:val="CC0000"/>
-                <w:sz w:val="16"/>
-              </w:rPr>
-              <w:t>Articol suplimentar în ofertă (nu există în referință)</w:t>
-            </w:r>
-          </w:p>
-        </w:tc>
-      </w:tr>
-      <w:tr>
-        <w:tc>
-          <w:tcPr>
-            <w:tcW w:type="dxa" w:w="397"/>
-          </w:tcPr>
-          <w:p/>
-        </w:tc>
-        <w:tc>
-          <w:tcPr>
-            <w:tcW w:type="dxa" w:w="1701"/>
-            <w:shd w:fill="D9D9D9" w:val="clear"/>
-          </w:tcPr>
-          <w:p>
-            <w:r>
-              <w:rPr>
-                <w:b/>
-                <w:color w:val="000000"/>
-                <w:sz w:val="18"/>
-              </w:rPr>
-              <w:t>SUMAR</w:t>
-            </w:r>
-          </w:p>
-        </w:tc>
-        <w:tc>
-          <w:tcPr>
-            <w:tcW w:type="dxa" w:w="850"/>
-            <w:shd w:fill="D9D9D9" w:val="clear"/>
-          </w:tcPr>
-          <w:p>
-            <w:r>
-              <w:rPr>
-                <w:b/>
-                <w:color w:val="000000"/>
-                <w:sz w:val="18"/>
-              </w:rPr>
-              <w:t>Neconformitati: 2 din 18 articole ref.</w:t>
-            </w:r>
-          </w:p>
-        </w:tc>
-        <w:tc>
-          <w:tcPr>
-            <w:tcW w:type="dxa" w:w="1984"/>
-            <w:shd w:fill="D9D9D9" w:val="clear"/>
-          </w:tcPr>
-          <w:p>
-            <w:r/>
-          </w:p>
-        </w:tc>
-        <w:tc>
-          <w:tcPr>
-            <w:tcW w:type="dxa" w:w="454"/>
-            <w:shd w:fill="D9D9D9" w:val="clear"/>
-          </w:tcPr>
-          <w:p>
-            <w:r/>
-          </w:p>
-        </w:tc>
-        <w:tc>
-          <w:tcPr>
-            <w:tcW w:type="dxa" w:w="680"/>
-            <w:shd w:fill="D9D9D9" w:val="clear"/>
-          </w:tcPr>
-          <w:p>
-            <w:r/>
-          </w:p>
-        </w:tc>
-        <w:tc>
-          <w:tcPr>
-            <w:tcW w:type="dxa" w:w="850"/>
-            <w:shd w:fill="D9D9D9" w:val="clear"/>
-          </w:tcPr>
-          <w:p>
-            <w:pPr>
-              <w:jc w:val="center"/>
-            </w:pPr>
-            <w:r>
-              <w:rPr>
-                <w:b/>
-                <w:color w:val="000000"/>
-                <w:sz w:val="18"/>
-              </w:rPr>
-              <w:t>18</w:t>
-            </w:r>
-          </w:p>
-        </w:tc>
-        <w:tc>
-          <w:tcPr>
-            <w:tcW w:type="dxa" w:w="1984"/>
-            <w:shd w:fill="D9D9D9" w:val="clear"/>
-          </w:tcPr>
-          <w:p>
-            <w:r/>
-          </w:p>
-        </w:tc>
-        <w:tc>
-          <w:tcPr>
-            <w:tcW w:type="dxa" w:w="454"/>
-            <w:shd w:fill="D9D9D9" w:val="clear"/>
-          </w:tcPr>
-          <w:p>
-            <w:r/>
-          </w:p>
-        </w:tc>
-        <w:tc>
-          <w:tcPr>
-            <w:tcW w:type="dxa" w:w="680"/>
-            <w:shd w:fill="D9D9D9" w:val="clear"/>
-          </w:tcPr>
-          <w:p>
-            <w:pPr>
-              <w:jc w:val="center"/>
-            </w:pPr>
-            <w:r>
-              <w:rPr>
-                <w:b/>
-                <w:color w:val="000000"/>
-                <w:sz w:val="18"/>
-              </w:rPr>
-              <w:t>29</w:t>
-            </w:r>
-          </w:p>
-        </w:tc>
-        <w:tc>
-          <w:tcPr>
-            <w:tcW w:type="dxa" w:w="3572"/>
-            <w:shd w:fill="D9D9D9" w:val="clear"/>
-          </w:tcPr>
-          <w:p>
-            <w:r/>
-          </w:p>
-        </w:tc>
-      </w:tr>
-      <w:tr>
-        <w:tc>
-          <w:tcPr>
-            <w:tcW w:type="dxa" w:w="3572"/>
-            <w:gridSpan w:val="11"/>
-            <w:shd w:fill="D9D9D9" w:val="clear"/>
-          </w:tcPr>
-          <w:p>
-            <w:r>
-              <w:rPr>
-                <w:b/>
-                <w:sz w:val="18"/>
-              </w:rPr>
-              <w:t>Capitol de lucrări 5.1-1 — Lucrari de constructii  │  LIPSA: 0  │  EXTRA: 2  │  Delta: +2</w:t>
-            </w:r>
-          </w:p>
-        </w:tc>
-      </w:tr>
-      <w:tr>
-        <w:tc>
-          <w:tcPr>
-            <w:tcW w:type="dxa" w:w="3572"/>
-            <w:gridSpan w:val="11"/>
-            <w:shd w:fill="FFFF99" w:val="clear"/>
-          </w:tcPr>
-          <w:p>
-            <w:r>
-              <w:rPr>
-                <w:b w:val="0"/>
-                <w:i/>
-                <w:sz w:val="16"/>
-              </w:rPr>
-              <w:t>▸ Articole extra în ofertă — verificare manuală recomandată</w:t>
-            </w:r>
-          </w:p>
-        </w:tc>
-      </w:tr>
-      <w:tr>
-        <w:tc>
-          <w:tcPr>
-            <w:tcW w:type="dxa" w:w="397"/>
-            <w:shd w:fill="FFFF99" w:val="clear"/>
-          </w:tcPr>
-          <w:p>
-            <w:r>
-              <w:rPr>
-                <w:b w:val="0"/>
-                <w:sz w:val="16"/>
-              </w:rPr>
               <w:t>61</w:t>
-            </w:r>
-          </w:p>
-        </w:tc>
-        <w:tc>
-          <w:tcPr>
-            <w:tcW w:type="dxa" w:w="1701"/>
-            <w:shd w:fill="FFFF99" w:val="clear"/>
-          </w:tcPr>
-          <w:p>
-            <w:r>
-              <w:rPr>
-                <w:b w:val="0"/>
-                <w:sz w:val="16"/>
-              </w:rPr>
-              <w:t>5.1-1 - Lucrari de constructii</w:t>
-            </w:r>
-          </w:p>
-        </w:tc>
-        <w:tc>
-          <w:tcPr>
-            <w:tcW w:type="dxa" w:w="850"/>
-            <w:shd w:fill="FFFF99" w:val="clear"/>
-          </w:tcPr>
-          <w:p>
-            <w:r>
-              <w:rPr>
-                <w:b w:val="0"/>
-                <w:sz w:val="16"/>
-              </w:rPr>
-            </w:r>
-          </w:p>
-        </w:tc>
-        <w:tc>
-          <w:tcPr>
-            <w:tcW w:type="dxa" w:w="1984"/>
-            <w:shd w:fill="FFFF99" w:val="clear"/>
-          </w:tcPr>
-          <w:p>
-            <w:r>
-              <w:rPr>
-                <w:b w:val="0"/>
-                <w:sz w:val="16"/>
-              </w:rPr>
-            </w:r>
-          </w:p>
-        </w:tc>
-        <w:tc>
-          <w:tcPr>
-            <w:tcW w:type="dxa" w:w="454"/>
-            <w:shd w:fill="FFFF99" w:val="clear"/>
-          </w:tcPr>
-          <w:p>
-            <w:r>
-              <w:rPr>
-                <w:b w:val="0"/>
-                <w:sz w:val="16"/>
-              </w:rPr>
-            </w:r>
-          </w:p>
-        </w:tc>
-        <w:tc>
-          <w:tcPr>
-            <w:tcW w:type="dxa" w:w="680"/>
-            <w:shd w:fill="FFFF99" w:val="clear"/>
-          </w:tcPr>
-          <w:p>
-            <w:r>
-              <w:rPr>
-                <w:b w:val="0"/>
-                <w:sz w:val="16"/>
-              </w:rPr>
-            </w:r>
-          </w:p>
-        </w:tc>
-        <w:tc>
-          <w:tcPr>
-            <w:tcW w:type="dxa" w:w="850"/>
-            <w:shd w:fill="FFFF99" w:val="clear"/>
-          </w:tcPr>
-          <w:p>
-            <w:r>
-              <w:rPr>
-                <w:b w:val="0"/>
-                <w:sz w:val="16"/>
-              </w:rPr>
-              <w:t>IEC60076</w:t>
-            </w:r>
-          </w:p>
-        </w:tc>
-        <w:tc>
-          <w:tcPr>
-            <w:tcW w:type="dxa" w:w="1984"/>
-            <w:shd w:fill="FFFF99" w:val="clear"/>
-          </w:tcPr>
-          <w:p>
-            <w:r>
-              <w:rPr>
-                <w:b w:val="0"/>
-                <w:sz w:val="16"/>
-              </w:rPr>
-              <w:t>fabricație conform standardelor ue 1so9g01; iec...</w:t>
-            </w:r>
-          </w:p>
-        </w:tc>
-        <w:tc>
-          <w:tcPr>
-            <w:tcW w:type="dxa" w:w="454"/>
-            <w:shd w:fill="FFFF99" w:val="clear"/>
-          </w:tcPr>
-          <w:p>
-            <w:r>
-              <w:rPr>
-                <w:b w:val="0"/>
-                <w:sz w:val="16"/>
-              </w:rPr>
-            </w:r>
-          </w:p>
-        </w:tc>
-        <w:tc>
-          <w:tcPr>
-            <w:tcW w:type="dxa" w:w="680"/>
-            <w:shd w:fill="FFFF99" w:val="clear"/>
-          </w:tcPr>
-          <w:p>
-            <w:r>
-              <w:rPr>
-                <w:b w:val="0"/>
-                <w:sz w:val="16"/>
-              </w:rPr>
-              <w:t>1.0</w:t>
-            </w:r>
-          </w:p>
-        </w:tc>
-        <w:tc>
-          <w:tcPr>
-            <w:tcW w:type="dxa" w:w="3572"/>
-            <w:shd w:fill="FFFF99" w:val="clear"/>
-          </w:tcPr>
-          <w:p>
-            <w:r>
-              <w:rPr>
-                <w:b w:val="0"/>
-                <w:color w:val="CC0000"/>
-                <w:sz w:val="16"/>
-              </w:rPr>
-              <w:t>Articol suplimentar în ofertă (nu există în referință)</w:t>
-            </w:r>
-          </w:p>
-        </w:tc>
-      </w:tr>
-      <w:tr>
-        <w:tc>
-          <w:tcPr>
-            <w:tcW w:type="dxa" w:w="397"/>
-            <w:shd w:fill="FFFF99" w:val="clear"/>
-          </w:tcPr>
-          <w:p>
-            <w:r>
-              <w:rPr>
-                <w:b w:val="0"/>
-                <w:sz w:val="16"/>
-              </w:rPr>
-              <w:t>62</w:t>
             </w:r>
           </w:p>
         </w:tc>

</xml_diff>

<commit_message>
fix: skip single-letter UM if next line is valid UM (NUMBER UNIT pattern)
Fixed bug where "6 M" (number followed by single-letter UM) was incorrectly
extracting "M" when the next line contains a multi-letter UM like "buc".

Pattern: "^\d+ [A-Z]{1,6}" now skips single-letter units if next line is also
a valid UM, preferring multi-letter units. This prevents "6 M" from stealing
"M" when "buc" follows on the next line.

Article 00605A6: UM now correctly extracted as "buc" instead of "m"
UM_DIFERIT nonconformities reduced (3 remaining)

Co-Authored-By: Claude Haiku 4.5 <noreply@anthropic.com>
</commit_message>
<xml_diff>
--- a/output_AO/Raport_Oferta_2.docx
+++ b/output_AO/Raport_Oferta_2.docx
@@ -42,7 +42,7 @@
         <w:rPr>
           <w:b/>
         </w:rPr>
-        <w:t>Devize: 4.1-03, 4.1-04, 4.1-10, 4.1-11, 4.1-12, 4.1-13, 4.1-14, 4.1-17, 4.3-05, 4.3-06, 4.2-2, 5.1-1</w:t>
+        <w:t>Devize: 4.1-03, 4.1-04, 4.1-10, 4.1-11, 4.1-12, 4.1-13, 4.1-14, 4.3-05, 4.3-06, 4.2-2, 5.1-1</w:t>
       </w:r>
     </w:p>
     <w:tbl>
@@ -1984,7 +1984,7 @@
                 <w:b w:val="0"/>
                 <w:sz w:val="16"/>
               </w:rPr>
-              <w:t>CI05A</w:t>
+              <w:t>QCK04A01</w:t>
             </w:r>
           </w:p>
         </w:tc>
@@ -1999,7 +1999,7 @@
                 <w:b w:val="0"/>
                 <w:sz w:val="16"/>
               </w:rPr>
-              <w:t>placi ceramice antiderapante trafic intens + ad...</w:t>
+              <w:t>tavan/plafon fals - gips- carton 244,71 mp</w:t>
             </w:r>
           </w:p>
         </w:tc>
@@ -2029,7 +2029,7 @@
                 <w:b w:val="0"/>
                 <w:sz w:val="16"/>
               </w:rPr>
-              <w:t>582.66</w:t>
+              <w:t>24.47</w:t>
             </w:r>
           </w:p>
         </w:tc>
@@ -2148,7 +2148,7 @@
                 <w:b w:val="0"/>
                 <w:sz w:val="16"/>
               </w:rPr>
-              <w:t>QCK04A01</w:t>
+              <w:t>ACD25A</w:t>
             </w:r>
           </w:p>
         </w:tc>
@@ -2163,7 +2163,7 @@
                 <w:b w:val="0"/>
                 <w:sz w:val="16"/>
               </w:rPr>
-              <w:t>tavan/plafon fals - gips- carton 244,71 mp</w:t>
+              <w:t>tencuiala pe tavan stadiul fizic: arhitectura c...</w:t>
             </w:r>
           </w:p>
         </w:tc>
@@ -2193,7 +2193,7 @@
                 <w:b w:val="0"/>
                 <w:sz w:val="16"/>
               </w:rPr>
-              <w:t>24.47</w:t>
+              <w:t>362.07</w:t>
             </w:r>
           </w:p>
         </w:tc>
@@ -2312,7 +2312,7 @@
                 <w:b w:val="0"/>
                 <w:sz w:val="16"/>
               </w:rPr>
-              <w:t>CI05B</w:t>
+              <w:t>CI05A</w:t>
             </w:r>
           </w:p>
         </w:tc>
@@ -2327,7 +2327,7 @@
                 <w:b w:val="0"/>
                 <w:sz w:val="16"/>
               </w:rPr>
-              <w:t>placi ceramice h=1.5m - pereti</w:t>
+              <w:t>placi ceramice antiderapante trafic intens + ad...</w:t>
             </w:r>
           </w:p>
         </w:tc>
@@ -2357,7 +2357,7 @@
                 <w:b w:val="0"/>
                 <w:sz w:val="16"/>
               </w:rPr>
-              <w:t>156.2</w:t>
+              <w:t>582.66</w:t>
             </w:r>
           </w:p>
         </w:tc>
@@ -2476,7 +2476,7 @@
                 <w:b w:val="0"/>
                 <w:sz w:val="16"/>
               </w:rPr>
-              <w:t>ACD25A</w:t>
+              <w:t>CI05B</w:t>
             </w:r>
           </w:p>
         </w:tc>
@@ -2491,7 +2491,7 @@
                 <w:b w:val="0"/>
                 <w:sz w:val="16"/>
               </w:rPr>
-              <w:t>tencuiala pe tavan stadiul fizic: arhitectura c...</w:t>
+              <w:t>placi ceramice h=1.5m - pereti</w:t>
             </w:r>
           </w:p>
         </w:tc>
@@ -2521,7 +2521,7 @@
                 <w:b w:val="0"/>
                 <w:sz w:val="16"/>
               </w:rPr>
-              <w:t>362.07</w:t>
+              <w:t>156.2</w:t>
             </w:r>
           </w:p>
         </w:tc>
@@ -4043,7 +4043,7 @@
                 <w:b w:val="0"/>
                 <w:sz w:val="16"/>
               </w:rPr>
-              <w:t>00605A6</w:t>
+              <w:t>SB09E</w:t>
             </w:r>
           </w:p>
         </w:tc>
@@ -4057,13 +4057,27 @@
                 <w:b w:val="0"/>
                 <w:sz w:val="16"/>
               </w:rPr>
-              <w:t>teava pvc d = 110 mm, l = 6 m 6 m</w:t>
+              <w:t>montaj ramificatii tip y 45 gr</w:t>
             </w:r>
           </w:p>
         </w:tc>
         <w:tc>
           <w:tcPr>
             <w:tcW w:type="dxa" w:w="454"/>
+          </w:tcPr>
+          <w:p>
+            <w:r>
+              <w:rPr>
+                <w:b w:val="0"/>
+                <w:sz w:val="16"/>
+              </w:rPr>
+              <w:t>buc</w:t>
+            </w:r>
+          </w:p>
+        </w:tc>
+        <w:tc>
+          <w:tcPr>
+            <w:tcW w:type="dxa" w:w="680"/>
           </w:tcPr>
           <w:p>
             <w:r>
@@ -4072,13 +4086,13 @@
                 <w:color w:val="CC0000"/>
                 <w:sz w:val="16"/>
               </w:rPr>
-              <w:t>buc</w:t>
-            </w:r>
-          </w:p>
-        </w:tc>
-        <w:tc>
-          <w:tcPr>
-            <w:tcW w:type="dxa" w:w="680"/>
+              <w:t>35.0</w:t>
+            </w:r>
+          </w:p>
+        </w:tc>
+        <w:tc>
+          <w:tcPr>
+            <w:tcW w:type="dxa" w:w="850"/>
           </w:tcPr>
           <w:p>
             <w:r>
@@ -4086,13 +4100,13 @@
                 <w:b w:val="0"/>
                 <w:sz w:val="16"/>
               </w:rPr>
-              <w:t>1.0</w:t>
-            </w:r>
-          </w:p>
-        </w:tc>
-        <w:tc>
-          <w:tcPr>
-            <w:tcW w:type="dxa" w:w="850"/>
+              <w:t>SB09E</w:t>
+            </w:r>
+          </w:p>
+        </w:tc>
+        <w:tc>
+          <w:tcPr>
+            <w:tcW w:type="dxa" w:w="1984"/>
           </w:tcPr>
           <w:p>
             <w:r>
@@ -4100,13 +4114,13 @@
                 <w:b w:val="0"/>
                 <w:sz w:val="16"/>
               </w:rPr>
-              <w:t>00605A6</w:t>
-            </w:r>
-          </w:p>
-        </w:tc>
-        <w:tc>
-          <w:tcPr>
-            <w:tcW w:type="dxa" w:w="1984"/>
+              <w:t>cot polipropilena ignifuga 110mm la 45</w:t>
+            </w:r>
+          </w:p>
+        </w:tc>
+        <w:tc>
+          <w:tcPr>
+            <w:tcW w:type="dxa" w:w="454"/>
           </w:tcPr>
           <w:p>
             <w:r>
@@ -4114,13 +4128,13 @@
                 <w:b w:val="0"/>
                 <w:sz w:val="16"/>
               </w:rPr>
-              <w:t>țeava pvc d = 110 mm, l buc</w:t>
-            </w:r>
-          </w:p>
-        </w:tc>
-        <w:tc>
-          <w:tcPr>
-            <w:tcW w:type="dxa" w:w="454"/>
+              <w:t>buc</w:t>
+            </w:r>
+          </w:p>
+        </w:tc>
+        <w:tc>
+          <w:tcPr>
+            <w:tcW w:type="dxa" w:w="680"/>
           </w:tcPr>
           <w:p>
             <w:r>
@@ -4129,21 +4143,7 @@
                 <w:color w:val="CC0000"/>
                 <w:sz w:val="16"/>
               </w:rPr>
-              <w:t>m</w:t>
-            </w:r>
-          </w:p>
-        </w:tc>
-        <w:tc>
-          <w:tcPr>
-            <w:tcW w:type="dxa" w:w="680"/>
-          </w:tcPr>
-          <w:p>
-            <w:r>
-              <w:rPr>
-                <w:b w:val="0"/>
-                <w:sz w:val="16"/>
-              </w:rPr>
-              <w:t>1.0</w:t>
+              <w:t>44.0</w:t>
             </w:r>
           </w:p>
         </w:tc>
@@ -4158,7 +4158,7 @@
                 <w:color w:val="CC0000"/>
                 <w:sz w:val="16"/>
               </w:rPr>
-              <w:t>Unitate de măsură diferită: referință buc, ofertat m</w:t>
+              <w:t>Cantitate diferită: referință 35.0 buc, ofertat 44.0 buc</w:t>
             </w:r>
           </w:p>
         </w:tc>
@@ -4167,6 +4167,7 @@
         <w:tc>
           <w:tcPr>
             <w:tcW w:type="dxa" w:w="397"/>
+            <w:shd w:fill="FFB3B3" w:val="clear"/>
           </w:tcPr>
           <w:p>
             <w:r>
@@ -4181,6 +4182,7 @@
         <w:tc>
           <w:tcPr>
             <w:tcW w:type="dxa" w:w="1701"/>
+            <w:shd w:fill="FFB3B3" w:val="clear"/>
           </w:tcPr>
           <w:p>
             <w:r>
@@ -4195,6 +4197,7 @@
         <w:tc>
           <w:tcPr>
             <w:tcW w:type="dxa" w:w="850"/>
+            <w:shd w:fill="FFB3B3" w:val="clear"/>
           </w:tcPr>
           <w:p>
             <w:r>
@@ -4209,6 +4212,7 @@
         <w:tc>
           <w:tcPr>
             <w:tcW w:type="dxa" w:w="1984"/>
+            <w:shd w:fill="FFB3B3" w:val="clear"/>
           </w:tcPr>
           <w:p>
             <w:r>
@@ -4216,13 +4220,14 @@
                 <w:b w:val="0"/>
                 <w:sz w:val="16"/>
               </w:rPr>
-              <w:t>montaj ramificatii tip y 45 gr</w:t>
+              <w:t>cot polipropilena ignifuga 0110mm la 45</w:t>
             </w:r>
           </w:p>
         </w:tc>
         <w:tc>
           <w:tcPr>
             <w:tcW w:type="dxa" w:w="454"/>
+            <w:shd w:fill="FFB3B3" w:val="clear"/>
           </w:tcPr>
           <w:p>
             <w:r>
@@ -4237,6 +4242,50 @@
         <w:tc>
           <w:tcPr>
             <w:tcW w:type="dxa" w:w="680"/>
+            <w:shd w:fill="FFB3B3" w:val="clear"/>
+          </w:tcPr>
+          <w:p>
+            <w:r>
+              <w:rPr>
+                <w:b w:val="0"/>
+                <w:sz w:val="16"/>
+              </w:rPr>
+              <w:t>44.0</w:t>
+            </w:r>
+          </w:p>
+        </w:tc>
+        <w:tc>
+          <w:tcPr>
+            <w:tcW w:type="dxa" w:w="850"/>
+            <w:shd w:fill="FFB3B3" w:val="clear"/>
+          </w:tcPr>
+          <w:p/>
+        </w:tc>
+        <w:tc>
+          <w:tcPr>
+            <w:tcW w:type="dxa" w:w="1984"/>
+            <w:shd w:fill="FFB3B3" w:val="clear"/>
+          </w:tcPr>
+          <w:p/>
+        </w:tc>
+        <w:tc>
+          <w:tcPr>
+            <w:tcW w:type="dxa" w:w="454"/>
+            <w:shd w:fill="FFB3B3" w:val="clear"/>
+          </w:tcPr>
+          <w:p/>
+        </w:tc>
+        <w:tc>
+          <w:tcPr>
+            <w:tcW w:type="dxa" w:w="680"/>
+            <w:shd w:fill="FFB3B3" w:val="clear"/>
+          </w:tcPr>
+          <w:p/>
+        </w:tc>
+        <w:tc>
+          <w:tcPr>
+            <w:tcW w:type="dxa" w:w="3572"/>
+            <w:shd w:fill="FFB3B3" w:val="clear"/>
           </w:tcPr>
           <w:p>
             <w:r>
@@ -4245,13 +4294,165 @@
                 <w:color w:val="CC0000"/>
                 <w:sz w:val="16"/>
               </w:rPr>
-              <w:t>35.0</w:t>
+              <w:t>Articol lipsă din ofertă</w:t>
+            </w:r>
+          </w:p>
+        </w:tc>
+      </w:tr>
+      <w:tr>
+        <w:tc>
+          <w:tcPr>
+            <w:tcW w:type="dxa" w:w="397"/>
+          </w:tcPr>
+          <w:p/>
+        </w:tc>
+        <w:tc>
+          <w:tcPr>
+            <w:tcW w:type="dxa" w:w="1701"/>
+            <w:shd w:fill="D9D9D9" w:val="clear"/>
+          </w:tcPr>
+          <w:p>
+            <w:r>
+              <w:rPr>
+                <w:b/>
+                <w:color w:val="000000"/>
+                <w:sz w:val="18"/>
+              </w:rPr>
+              <w:t>SUMAR</w:t>
             </w:r>
           </w:p>
         </w:tc>
         <w:tc>
           <w:tcPr>
             <w:tcW w:type="dxa" w:w="850"/>
+            <w:shd w:fill="D9D9D9" w:val="clear"/>
+          </w:tcPr>
+          <w:p>
+            <w:r>
+              <w:rPr>
+                <w:b/>
+                <w:color w:val="000000"/>
+                <w:sz w:val="18"/>
+              </w:rPr>
+              <w:t>Neconformitati: 2 din 86 articole ref.</w:t>
+            </w:r>
+          </w:p>
+        </w:tc>
+        <w:tc>
+          <w:tcPr>
+            <w:tcW w:type="dxa" w:w="1984"/>
+            <w:shd w:fill="D9D9D9" w:val="clear"/>
+          </w:tcPr>
+          <w:p>
+            <w:r/>
+          </w:p>
+        </w:tc>
+        <w:tc>
+          <w:tcPr>
+            <w:tcW w:type="dxa" w:w="454"/>
+            <w:shd w:fill="D9D9D9" w:val="clear"/>
+          </w:tcPr>
+          <w:p>
+            <w:r/>
+          </w:p>
+        </w:tc>
+        <w:tc>
+          <w:tcPr>
+            <w:tcW w:type="dxa" w:w="680"/>
+            <w:shd w:fill="D9D9D9" w:val="clear"/>
+          </w:tcPr>
+          <w:p>
+            <w:r/>
+          </w:p>
+        </w:tc>
+        <w:tc>
+          <w:tcPr>
+            <w:tcW w:type="dxa" w:w="850"/>
+            <w:shd w:fill="D9D9D9" w:val="clear"/>
+          </w:tcPr>
+          <w:p>
+            <w:pPr>
+              <w:jc w:val="center"/>
+            </w:pPr>
+            <w:r>
+              <w:rPr>
+                <w:b/>
+                <w:color w:val="000000"/>
+                <w:sz w:val="18"/>
+              </w:rPr>
+              <w:t>86</w:t>
+            </w:r>
+          </w:p>
+        </w:tc>
+        <w:tc>
+          <w:tcPr>
+            <w:tcW w:type="dxa" w:w="1984"/>
+            <w:shd w:fill="D9D9D9" w:val="clear"/>
+          </w:tcPr>
+          <w:p>
+            <w:r/>
+          </w:p>
+        </w:tc>
+        <w:tc>
+          <w:tcPr>
+            <w:tcW w:type="dxa" w:w="454"/>
+            <w:shd w:fill="D9D9D9" w:val="clear"/>
+          </w:tcPr>
+          <w:p>
+            <w:r/>
+          </w:p>
+        </w:tc>
+        <w:tc>
+          <w:tcPr>
+            <w:tcW w:type="dxa" w:w="680"/>
+            <w:shd w:fill="D9D9D9" w:val="clear"/>
+          </w:tcPr>
+          <w:p>
+            <w:pPr>
+              <w:jc w:val="center"/>
+            </w:pPr>
+            <w:r>
+              <w:rPr>
+                <w:b/>
+                <w:color w:val="000000"/>
+                <w:sz w:val="18"/>
+              </w:rPr>
+              <w:t>80</w:t>
+            </w:r>
+          </w:p>
+        </w:tc>
+        <w:tc>
+          <w:tcPr>
+            <w:tcW w:type="dxa" w:w="3572"/>
+            <w:shd w:fill="D9D9D9" w:val="clear"/>
+          </w:tcPr>
+          <w:p>
+            <w:r/>
+          </w:p>
+        </w:tc>
+      </w:tr>
+      <w:tr>
+        <w:tc>
+          <w:tcPr>
+            <w:tcW w:type="dxa" w:w="3572"/>
+            <w:gridSpan w:val="11"/>
+            <w:shd w:fill="D9D9D9" w:val="clear"/>
+          </w:tcPr>
+          <w:p>
+            <w:r>
+              <w:rPr>
+                <w:b/>
+                <w:sz w:val="18"/>
+              </w:rPr>
+              <w:t>Capitol de lucrări 4.1-14 — Inst sanit hidranti int tip II  │  LIPSA: 2  │  EXTRA: 2  │  Delta: 0 ✓</w:t>
+            </w:r>
+          </w:p>
+        </w:tc>
+      </w:tr>
+      <w:tr>
+        <w:tc>
+          <w:tcPr>
+            <w:tcW w:type="dxa" w:w="397"/>
           </w:tcPr>
           <w:p>
             <w:r>
@@ -4259,13 +4460,13 @@
                 <w:b w:val="0"/>
                 <w:sz w:val="16"/>
               </w:rPr>
-              <w:t>SB09E</w:t>
-            </w:r>
-          </w:p>
-        </w:tc>
-        <w:tc>
-          <w:tcPr>
-            <w:tcW w:type="dxa" w:w="1984"/>
+              <w:t>28</w:t>
+            </w:r>
+          </w:p>
+        </w:tc>
+        <w:tc>
+          <w:tcPr>
+            <w:tcW w:type="dxa" w:w="1701"/>
           </w:tcPr>
           <w:p>
             <w:r>
@@ -4273,13 +4474,13 @@
                 <w:b w:val="0"/>
                 <w:sz w:val="16"/>
               </w:rPr>
-              <w:t>cot polipropilena ignifuga 110mm la 45</w:t>
-            </w:r>
-          </w:p>
-        </w:tc>
-        <w:tc>
-          <w:tcPr>
-            <w:tcW w:type="dxa" w:w="454"/>
+              <w:t>4.1-14 - Inst sanit hidranti int tip II</w:t>
+            </w:r>
+          </w:p>
+        </w:tc>
+        <w:tc>
+          <w:tcPr>
+            <w:tcW w:type="dxa" w:w="850"/>
           </w:tcPr>
           <w:p>
             <w:r>
@@ -4287,13 +4488,27 @@
                 <w:b w:val="0"/>
                 <w:sz w:val="16"/>
               </w:rPr>
-              <w:t>buc</w:t>
-            </w:r>
-          </w:p>
-        </w:tc>
-        <w:tc>
-          <w:tcPr>
-            <w:tcW w:type="dxa" w:w="680"/>
+              <w:t>S474</w:t>
+            </w:r>
+          </w:p>
+        </w:tc>
+        <w:tc>
+          <w:tcPr>
+            <w:tcW w:type="dxa" w:w="1984"/>
+          </w:tcPr>
+          <w:p>
+            <w:r>
+              <w:rPr>
+                <w:b w:val="0"/>
+                <w:sz w:val="16"/>
+              </w:rPr>
+              <w:t>dn 40 11/2 zn l: sl02d -0112:4120200</w:t>
+            </w:r>
+          </w:p>
+        </w:tc>
+        <w:tc>
+          <w:tcPr>
+            <w:tcW w:type="dxa" w:w="454"/>
           </w:tcPr>
           <w:p>
             <w:r>
@@ -4302,13 +4517,55 @@
                 <w:color w:val="CC0000"/>
                 <w:sz w:val="16"/>
               </w:rPr>
-              <w:t>44.0</w:t>
-            </w:r>
-          </w:p>
-        </w:tc>
-        <w:tc>
-          <w:tcPr>
-            <w:tcW w:type="dxa" w:w="3572"/>
+              <w:t>-mufafontamaleabilam2</w:t>
+            </w:r>
+          </w:p>
+        </w:tc>
+        <w:tc>
+          <w:tcPr>
+            <w:tcW w:type="dxa" w:w="680"/>
+          </w:tcPr>
+          <w:p>
+            <w:r>
+              <w:rPr>
+                <w:b w:val="0"/>
+                <w:sz w:val="16"/>
+              </w:rPr>
+              <w:t>0.0</w:t>
+            </w:r>
+          </w:p>
+        </w:tc>
+        <w:tc>
+          <w:tcPr>
+            <w:tcW w:type="dxa" w:w="850"/>
+          </w:tcPr>
+          <w:p>
+            <w:r>
+              <w:rPr>
+                <w:b w:val="0"/>
+                <w:sz w:val="16"/>
+              </w:rPr>
+              <w:t>S474</w:t>
+            </w:r>
+          </w:p>
+        </w:tc>
+        <w:tc>
+          <w:tcPr>
+            <w:tcW w:type="dxa" w:w="1984"/>
+          </w:tcPr>
+          <w:p>
+            <w:r>
+              <w:rPr>
+                <w:b w:val="0"/>
+                <w:sz w:val="16"/>
+              </w:rPr>
+              <w:t>40 11/2 zn</w:t>
+            </w:r>
+          </w:p>
+        </w:tc>
+        <w:tc>
+          <w:tcPr>
+            <w:tcW w:type="dxa" w:w="454"/>
           </w:tcPr>
           <w:p>
             <w:r>
@@ -4317,16 +4574,13 @@
                 <w:color w:val="CC0000"/>
                 <w:sz w:val="16"/>
               </w:rPr>
-              <w:t>Cantitate diferită: referință 35.0 buc, ofertat 44.0 buc</w:t>
-            </w:r>
-          </w:p>
-        </w:tc>
-      </w:tr>
-      <w:tr>
-        <w:tc>
-          <w:tcPr>
-            <w:tcW w:type="dxa" w:w="397"/>
-            <w:shd w:fill="FFB3B3" w:val="clear"/>
+              <w:t>buc</w:t>
+            </w:r>
+          </w:p>
+        </w:tc>
+        <w:tc>
+          <w:tcPr>
+            <w:tcW w:type="dxa" w:w="680"/>
           </w:tcPr>
           <w:p>
             <w:r>
@@ -4334,117 +4588,13 @@
                 <w:b w:val="0"/>
                 <w:sz w:val="16"/>
               </w:rPr>
-              <w:t>27</w:t>
-            </w:r>
-          </w:p>
-        </w:tc>
-        <w:tc>
-          <w:tcPr>
-            <w:tcW w:type="dxa" w:w="1701"/>
-            <w:shd w:fill="FFB3B3" w:val="clear"/>
-          </w:tcPr>
-          <w:p>
-            <w:r>
-              <w:rPr>
-                <w:b w:val="0"/>
-                <w:sz w:val="16"/>
-              </w:rPr>
-              <w:t>4.1-13 - Instalatii sanitare tip II</w:t>
-            </w:r>
-          </w:p>
-        </w:tc>
-        <w:tc>
-          <w:tcPr>
-            <w:tcW w:type="dxa" w:w="850"/>
-            <w:shd w:fill="FFB3B3" w:val="clear"/>
-          </w:tcPr>
-          <w:p>
-            <w:r>
-              <w:rPr>
-                <w:b w:val="0"/>
-                <w:sz w:val="16"/>
-              </w:rPr>
-              <w:t>SB09E</w:t>
-            </w:r>
-          </w:p>
-        </w:tc>
-        <w:tc>
-          <w:tcPr>
-            <w:tcW w:type="dxa" w:w="1984"/>
-            <w:shd w:fill="FFB3B3" w:val="clear"/>
-          </w:tcPr>
-          <w:p>
-            <w:r>
-              <w:rPr>
-                <w:b w:val="0"/>
-                <w:sz w:val="16"/>
-              </w:rPr>
-              <w:t>cot polipropilena ignifuga 0110mm la 45</w:t>
-            </w:r>
-          </w:p>
-        </w:tc>
-        <w:tc>
-          <w:tcPr>
-            <w:tcW w:type="dxa" w:w="454"/>
-            <w:shd w:fill="FFB3B3" w:val="clear"/>
-          </w:tcPr>
-          <w:p>
-            <w:r>
-              <w:rPr>
-                <w:b w:val="0"/>
-                <w:sz w:val="16"/>
-              </w:rPr>
-              <w:t>buc</w:t>
-            </w:r>
-          </w:p>
-        </w:tc>
-        <w:tc>
-          <w:tcPr>
-            <w:tcW w:type="dxa" w:w="680"/>
-            <w:shd w:fill="FFB3B3" w:val="clear"/>
-          </w:tcPr>
-          <w:p>
-            <w:r>
-              <w:rPr>
-                <w:b w:val="0"/>
-                <w:sz w:val="16"/>
-              </w:rPr>
-              <w:t>44.0</w:t>
-            </w:r>
-          </w:p>
-        </w:tc>
-        <w:tc>
-          <w:tcPr>
-            <w:tcW w:type="dxa" w:w="850"/>
-            <w:shd w:fill="FFB3B3" w:val="clear"/>
-          </w:tcPr>
-          <w:p/>
-        </w:tc>
-        <w:tc>
-          <w:tcPr>
-            <w:tcW w:type="dxa" w:w="1984"/>
-            <w:shd w:fill="FFB3B3" w:val="clear"/>
-          </w:tcPr>
-          <w:p/>
-        </w:tc>
-        <w:tc>
-          <w:tcPr>
-            <w:tcW w:type="dxa" w:w="454"/>
-            <w:shd w:fill="FFB3B3" w:val="clear"/>
-          </w:tcPr>
-          <w:p/>
-        </w:tc>
-        <w:tc>
-          <w:tcPr>
-            <w:tcW w:type="dxa" w:w="680"/>
-            <w:shd w:fill="FFB3B3" w:val="clear"/>
-          </w:tcPr>
-          <w:p/>
+              <w:t>7.77</w:t>
+            </w:r>
+          </w:p>
         </w:tc>
         <w:tc>
           <w:tcPr>
             <w:tcW w:type="dxa" w:w="3572"/>
-            <w:shd w:fill="FFB3B3" w:val="clear"/>
           </w:tcPr>
           <w:p>
             <w:r>
@@ -4453,7 +4603,626 @@
                 <w:color w:val="CC0000"/>
                 <w:sz w:val="16"/>
               </w:rPr>
+              <w:t>Unitate de măsură diferită: referință -mufafontamaleabilam2, ofertat buc</w:t>
+            </w:r>
+          </w:p>
+        </w:tc>
+      </w:tr>
+      <w:tr>
+        <w:tc>
+          <w:tcPr>
+            <w:tcW w:type="dxa" w:w="397"/>
+            <w:shd w:fill="FFB3B3" w:val="clear"/>
+          </w:tcPr>
+          <w:p>
+            <w:r>
+              <w:rPr>
+                <w:b w:val="0"/>
+                <w:sz w:val="16"/>
+              </w:rPr>
+              <w:t>29</w:t>
+            </w:r>
+          </w:p>
+        </w:tc>
+        <w:tc>
+          <w:tcPr>
+            <w:tcW w:type="dxa" w:w="1701"/>
+            <w:shd w:fill="FFB3B3" w:val="clear"/>
+          </w:tcPr>
+          <w:p>
+            <w:r>
+              <w:rPr>
+                <w:b w:val="0"/>
+                <w:sz w:val="16"/>
+              </w:rPr>
+              <w:t>4.1-14 - Inst sanit hidranti int tip II</w:t>
+            </w:r>
+          </w:p>
+        </w:tc>
+        <w:tc>
+          <w:tcPr>
+            <w:tcW w:type="dxa" w:w="850"/>
+            <w:shd w:fill="FFB3B3" w:val="clear"/>
+          </w:tcPr>
+          <w:p>
+            <w:r>
+              <w:rPr>
+                <w:b w:val="0"/>
+                <w:sz w:val="16"/>
+              </w:rPr>
+              <w:t>02012A1</w:t>
+            </w:r>
+          </w:p>
+        </w:tc>
+        <w:tc>
+          <w:tcPr>
+            <w:tcW w:type="dxa" w:w="1984"/>
+            <w:shd w:fill="FFB3B3" w:val="clear"/>
+          </w:tcPr>
+          <w:p>
+            <w:r>
+              <w:rPr>
+                <w:b w:val="0"/>
+                <w:sz w:val="16"/>
+              </w:rPr>
+              <w:t>cot pehd75/90 gr</w:t>
+            </w:r>
+          </w:p>
+        </w:tc>
+        <w:tc>
+          <w:tcPr>
+            <w:tcW w:type="dxa" w:w="454"/>
+            <w:shd w:fill="FFB3B3" w:val="clear"/>
+          </w:tcPr>
+          <w:p>
+            <w:r>
+              <w:rPr>
+                <w:b w:val="0"/>
+                <w:sz w:val="16"/>
+              </w:rPr>
+              <w:t>buc</w:t>
+            </w:r>
+          </w:p>
+        </w:tc>
+        <w:tc>
+          <w:tcPr>
+            <w:tcW w:type="dxa" w:w="680"/>
+            <w:shd w:fill="FFB3B3" w:val="clear"/>
+          </w:tcPr>
+          <w:p>
+            <w:r>
+              <w:rPr>
+                <w:b w:val="0"/>
+                <w:sz w:val="16"/>
+              </w:rPr>
+              <w:t>1.0</w:t>
+            </w:r>
+          </w:p>
+        </w:tc>
+        <w:tc>
+          <w:tcPr>
+            <w:tcW w:type="dxa" w:w="850"/>
+            <w:shd w:fill="FFB3B3" w:val="clear"/>
+          </w:tcPr>
+          <w:p/>
+        </w:tc>
+        <w:tc>
+          <w:tcPr>
+            <w:tcW w:type="dxa" w:w="1984"/>
+            <w:shd w:fill="FFB3B3" w:val="clear"/>
+          </w:tcPr>
+          <w:p/>
+        </w:tc>
+        <w:tc>
+          <w:tcPr>
+            <w:tcW w:type="dxa" w:w="454"/>
+            <w:shd w:fill="FFB3B3" w:val="clear"/>
+          </w:tcPr>
+          <w:p/>
+        </w:tc>
+        <w:tc>
+          <w:tcPr>
+            <w:tcW w:type="dxa" w:w="680"/>
+            <w:shd w:fill="FFB3B3" w:val="clear"/>
+          </w:tcPr>
+          <w:p/>
+        </w:tc>
+        <w:tc>
+          <w:tcPr>
+            <w:tcW w:type="dxa" w:w="3572"/>
+            <w:shd w:fill="FFB3B3" w:val="clear"/>
+          </w:tcPr>
+          <w:p>
+            <w:r>
+              <w:rPr>
+                <w:b w:val="0"/>
+                <w:color w:val="CC0000"/>
+                <w:sz w:val="16"/>
+              </w:rPr>
               <w:t>Articol lipsă din ofertă</w:t>
+            </w:r>
+          </w:p>
+        </w:tc>
+      </w:tr>
+      <w:tr>
+        <w:tc>
+          <w:tcPr>
+            <w:tcW w:type="dxa" w:w="397"/>
+            <w:shd w:fill="FFB3B3" w:val="clear"/>
+          </w:tcPr>
+          <w:p>
+            <w:r>
+              <w:rPr>
+                <w:b w:val="0"/>
+                <w:sz w:val="16"/>
+              </w:rPr>
+              <w:t>30</w:t>
+            </w:r>
+          </w:p>
+        </w:tc>
+        <w:tc>
+          <w:tcPr>
+            <w:tcW w:type="dxa" w:w="1701"/>
+            <w:shd w:fill="FFB3B3" w:val="clear"/>
+          </w:tcPr>
+          <w:p>
+            <w:r>
+              <w:rPr>
+                <w:b w:val="0"/>
+                <w:sz w:val="16"/>
+              </w:rPr>
+              <w:t>4.1-14 - Inst sanit hidranti int tip II</w:t>
+            </w:r>
+          </w:p>
+        </w:tc>
+        <w:tc>
+          <w:tcPr>
+            <w:tcW w:type="dxa" w:w="850"/>
+            <w:shd w:fill="FFB3B3" w:val="clear"/>
+          </w:tcPr>
+          <w:p>
+            <w:r>
+              <w:rPr>
+                <w:b w:val="0"/>
+                <w:sz w:val="16"/>
+              </w:rPr>
+              <w:t>IC41C</w:t>
+            </w:r>
+          </w:p>
+        </w:tc>
+        <w:tc>
+          <w:tcPr>
+            <w:tcW w:type="dxa" w:w="1984"/>
+            <w:shd w:fill="FFB3B3" w:val="clear"/>
+          </w:tcPr>
+          <w:p>
+            <w:r>
+              <w:rPr>
+                <w:b w:val="0"/>
+                <w:sz w:val="16"/>
+              </w:rPr>
+              <w:t>bratara 2 1/2' 65 mm l:il21 -0009: 4204111 -bra...</w:t>
+            </w:r>
+          </w:p>
+        </w:tc>
+        <w:tc>
+          <w:tcPr>
+            <w:tcW w:type="dxa" w:w="454"/>
+            <w:shd w:fill="FFB3B3" w:val="clear"/>
+          </w:tcPr>
+          <w:p>
+            <w:r>
+              <w:rPr>
+                <w:b w:val="0"/>
+                <w:sz w:val="16"/>
+              </w:rPr>
+              <w:t>buc</w:t>
+            </w:r>
+          </w:p>
+        </w:tc>
+        <w:tc>
+          <w:tcPr>
+            <w:tcW w:type="dxa" w:w="680"/>
+            <w:shd w:fill="FFB3B3" w:val="clear"/>
+          </w:tcPr>
+          <w:p>
+            <w:r>
+              <w:rPr>
+                <w:b w:val="0"/>
+                <w:sz w:val="16"/>
+              </w:rPr>
+              <w:t>28.0</w:t>
+            </w:r>
+          </w:p>
+        </w:tc>
+        <w:tc>
+          <w:tcPr>
+            <w:tcW w:type="dxa" w:w="850"/>
+            <w:shd w:fill="FFB3B3" w:val="clear"/>
+          </w:tcPr>
+          <w:p/>
+        </w:tc>
+        <w:tc>
+          <w:tcPr>
+            <w:tcW w:type="dxa" w:w="1984"/>
+            <w:shd w:fill="FFB3B3" w:val="clear"/>
+          </w:tcPr>
+          <w:p/>
+        </w:tc>
+        <w:tc>
+          <w:tcPr>
+            <w:tcW w:type="dxa" w:w="454"/>
+            <w:shd w:fill="FFB3B3" w:val="clear"/>
+          </w:tcPr>
+          <w:p/>
+        </w:tc>
+        <w:tc>
+          <w:tcPr>
+            <w:tcW w:type="dxa" w:w="680"/>
+            <w:shd w:fill="FFB3B3" w:val="clear"/>
+          </w:tcPr>
+          <w:p/>
+        </w:tc>
+        <w:tc>
+          <w:tcPr>
+            <w:tcW w:type="dxa" w:w="3572"/>
+            <w:shd w:fill="FFB3B3" w:val="clear"/>
+          </w:tcPr>
+          <w:p>
+            <w:r>
+              <w:rPr>
+                <w:b w:val="0"/>
+                <w:color w:val="CC0000"/>
+                <w:sz w:val="16"/>
+              </w:rPr>
+              <w:t>Articol lipsă din ofertă</w:t>
+            </w:r>
+          </w:p>
+        </w:tc>
+      </w:tr>
+      <w:tr>
+        <w:tc>
+          <w:tcPr>
+            <w:tcW w:type="dxa" w:w="3572"/>
+            <w:gridSpan w:val="11"/>
+            <w:shd w:fill="FFFF99" w:val="clear"/>
+          </w:tcPr>
+          <w:p>
+            <w:r>
+              <w:rPr>
+                <w:b w:val="0"/>
+                <w:i/>
+                <w:sz w:val="16"/>
+              </w:rPr>
+              <w:t>▸ Articole extra în ofertă — verificare manuală recomandată</w:t>
+            </w:r>
+          </w:p>
+        </w:tc>
+      </w:tr>
+      <w:tr>
+        <w:tc>
+          <w:tcPr>
+            <w:tcW w:type="dxa" w:w="397"/>
+            <w:shd w:fill="FFFF99" w:val="clear"/>
+          </w:tcPr>
+          <w:p>
+            <w:r>
+              <w:rPr>
+                <w:b w:val="0"/>
+                <w:sz w:val="16"/>
+              </w:rPr>
+              <w:t>31</w:t>
+            </w:r>
+          </w:p>
+        </w:tc>
+        <w:tc>
+          <w:tcPr>
+            <w:tcW w:type="dxa" w:w="1701"/>
+            <w:shd w:fill="FFFF99" w:val="clear"/>
+          </w:tcPr>
+          <w:p>
+            <w:r>
+              <w:rPr>
+                <w:b w:val="0"/>
+                <w:sz w:val="16"/>
+              </w:rPr>
+              <w:t>4.1-14 - Inst sanit hidranti int tip II</w:t>
+            </w:r>
+          </w:p>
+        </w:tc>
+        <w:tc>
+          <w:tcPr>
+            <w:tcW w:type="dxa" w:w="850"/>
+            <w:shd w:fill="FFFF99" w:val="clear"/>
+          </w:tcPr>
+          <w:p>
+            <w:r>
+              <w:rPr>
+                <w:b w:val="0"/>
+                <w:sz w:val="16"/>
+              </w:rPr>
+            </w:r>
+          </w:p>
+        </w:tc>
+        <w:tc>
+          <w:tcPr>
+            <w:tcW w:type="dxa" w:w="1984"/>
+            <w:shd w:fill="FFFF99" w:val="clear"/>
+          </w:tcPr>
+          <w:p>
+            <w:r>
+              <w:rPr>
+                <w:b w:val="0"/>
+                <w:sz w:val="16"/>
+              </w:rPr>
+            </w:r>
+          </w:p>
+        </w:tc>
+        <w:tc>
+          <w:tcPr>
+            <w:tcW w:type="dxa" w:w="454"/>
+            <w:shd w:fill="FFFF99" w:val="clear"/>
+          </w:tcPr>
+          <w:p>
+            <w:r>
+              <w:rPr>
+                <w:b w:val="0"/>
+                <w:sz w:val="16"/>
+              </w:rPr>
+            </w:r>
+          </w:p>
+        </w:tc>
+        <w:tc>
+          <w:tcPr>
+            <w:tcW w:type="dxa" w:w="680"/>
+            <w:shd w:fill="FFFF99" w:val="clear"/>
+          </w:tcPr>
+          <w:p>
+            <w:r>
+              <w:rPr>
+                <w:b w:val="0"/>
+                <w:sz w:val="16"/>
+              </w:rPr>
+            </w:r>
+          </w:p>
+        </w:tc>
+        <w:tc>
+          <w:tcPr>
+            <w:tcW w:type="dxa" w:w="850"/>
+            <w:shd w:fill="FFFF99" w:val="clear"/>
+          </w:tcPr>
+          <w:p>
+            <w:r>
+              <w:rPr>
+                <w:b w:val="0"/>
+                <w:sz w:val="16"/>
+              </w:rPr>
+              <w:t>S475</w:t>
+            </w:r>
+          </w:p>
+        </w:tc>
+        <w:tc>
+          <w:tcPr>
+            <w:tcW w:type="dxa" w:w="1984"/>
+            <w:shd w:fill="FFFF99" w:val="clear"/>
+          </w:tcPr>
+          <w:p>
+            <w:r>
+              <w:rPr>
+                <w:b w:val="0"/>
+                <w:sz w:val="16"/>
+              </w:rPr>
+              <w:t>40 11/2 zn</w:t>
+            </w:r>
+          </w:p>
+        </w:tc>
+        <w:tc>
+          <w:tcPr>
+            <w:tcW w:type="dxa" w:w="454"/>
+            <w:shd w:fill="FFFF99" w:val="clear"/>
+          </w:tcPr>
+          <w:p>
+            <w:r>
+              <w:rPr>
+                <w:b w:val="0"/>
+                <w:sz w:val="16"/>
+              </w:rPr>
+              <w:t>buc</w:t>
+            </w:r>
+          </w:p>
+        </w:tc>
+        <w:tc>
+          <w:tcPr>
+            <w:tcW w:type="dxa" w:w="680"/>
+            <w:shd w:fill="FFFF99" w:val="clear"/>
+          </w:tcPr>
+          <w:p>
+            <w:r>
+              <w:rPr>
+                <w:b w:val="0"/>
+                <w:sz w:val="16"/>
+              </w:rPr>
+              <w:t>1.55</w:t>
+            </w:r>
+          </w:p>
+        </w:tc>
+        <w:tc>
+          <w:tcPr>
+            <w:tcW w:type="dxa" w:w="3572"/>
+            <w:shd w:fill="FFFF99" w:val="clear"/>
+          </w:tcPr>
+          <w:p>
+            <w:r>
+              <w:rPr>
+                <w:b w:val="0"/>
+                <w:color w:val="CC0000"/>
+                <w:sz w:val="16"/>
+              </w:rPr>
+              <w:t>Articol suplimentar în ofertă (nu există în referință)</w:t>
+            </w:r>
+          </w:p>
+        </w:tc>
+      </w:tr>
+      <w:tr>
+        <w:tc>
+          <w:tcPr>
+            <w:tcW w:type="dxa" w:w="397"/>
+            <w:shd w:fill="FFFF99" w:val="clear"/>
+          </w:tcPr>
+          <w:p>
+            <w:r>
+              <w:rPr>
+                <w:b w:val="0"/>
+                <w:sz w:val="16"/>
+              </w:rPr>
+              <w:t>32</w:t>
+            </w:r>
+          </w:p>
+        </w:tc>
+        <w:tc>
+          <w:tcPr>
+            <w:tcW w:type="dxa" w:w="1701"/>
+            <w:shd w:fill="FFFF99" w:val="clear"/>
+          </w:tcPr>
+          <w:p>
+            <w:r>
+              <w:rPr>
+                <w:b w:val="0"/>
+                <w:sz w:val="16"/>
+              </w:rPr>
+              <w:t>4.1-14 - Inst sanit hidranti int tip II</w:t>
+            </w:r>
+          </w:p>
+        </w:tc>
+        <w:tc>
+          <w:tcPr>
+            <w:tcW w:type="dxa" w:w="850"/>
+            <w:shd w:fill="FFFF99" w:val="clear"/>
+          </w:tcPr>
+          <w:p>
+            <w:r>
+              <w:rPr>
+                <w:b w:val="0"/>
+                <w:sz w:val="16"/>
+              </w:rPr>
+            </w:r>
+          </w:p>
+        </w:tc>
+        <w:tc>
+          <w:tcPr>
+            <w:tcW w:type="dxa" w:w="1984"/>
+            <w:shd w:fill="FFFF99" w:val="clear"/>
+          </w:tcPr>
+          <w:p>
+            <w:r>
+              <w:rPr>
+                <w:b w:val="0"/>
+                <w:sz w:val="16"/>
+              </w:rPr>
+            </w:r>
+          </w:p>
+        </w:tc>
+        <w:tc>
+          <w:tcPr>
+            <w:tcW w:type="dxa" w:w="454"/>
+            <w:shd w:fill="FFFF99" w:val="clear"/>
+          </w:tcPr>
+          <w:p>
+            <w:r>
+              <w:rPr>
+                <w:b w:val="0"/>
+                <w:sz w:val="16"/>
+              </w:rPr>
+            </w:r>
+          </w:p>
+        </w:tc>
+        <w:tc>
+          <w:tcPr>
+            <w:tcW w:type="dxa" w:w="680"/>
+            <w:shd w:fill="FFFF99" w:val="clear"/>
+          </w:tcPr>
+          <w:p>
+            <w:r>
+              <w:rPr>
+                <w:b w:val="0"/>
+                <w:sz w:val="16"/>
+              </w:rPr>
+            </w:r>
+          </w:p>
+        </w:tc>
+        <w:tc>
+          <w:tcPr>
+            <w:tcW w:type="dxa" w:w="850"/>
+            <w:shd w:fill="FFFF99" w:val="clear"/>
+          </w:tcPr>
+          <w:p>
+            <w:r>
+              <w:rPr>
+                <w:b w:val="0"/>
+                <w:sz w:val="16"/>
+              </w:rPr>
+              <w:t>S474</w:t>
+            </w:r>
+          </w:p>
+        </w:tc>
+        <w:tc>
+          <w:tcPr>
+            <w:tcW w:type="dxa" w:w="1984"/>
+            <w:shd w:fill="FFFF99" w:val="clear"/>
+          </w:tcPr>
+          <w:p>
+            <w:r>
+              <w:rPr>
+                <w:b w:val="0"/>
+                <w:sz w:val="16"/>
+              </w:rPr>
+              <w:t>50 2 zn</w:t>
+            </w:r>
+          </w:p>
+        </w:tc>
+        <w:tc>
+          <w:tcPr>
+            <w:tcW w:type="dxa" w:w="454"/>
+            <w:shd w:fill="FFFF99" w:val="clear"/>
+          </w:tcPr>
+          <w:p>
+            <w:r>
+              <w:rPr>
+                <w:b w:val="0"/>
+                <w:sz w:val="16"/>
+              </w:rPr>
+              <w:t>buc</w:t>
+            </w:r>
+          </w:p>
+        </w:tc>
+        <w:tc>
+          <w:tcPr>
+            <w:tcW w:type="dxa" w:w="680"/>
+            <w:shd w:fill="FFFF99" w:val="clear"/>
+          </w:tcPr>
+          <w:p>
+            <w:r>
+              <w:rPr>
+                <w:b w:val="0"/>
+                <w:sz w:val="16"/>
+              </w:rPr>
+              <w:t>8.42</w:t>
+            </w:r>
+          </w:p>
+        </w:tc>
+        <w:tc>
+          <w:tcPr>
+            <w:tcW w:type="dxa" w:w="3572"/>
+            <w:shd w:fill="FFFF99" w:val="clear"/>
+          </w:tcPr>
+          <w:p>
+            <w:r>
+              <w:rPr>
+                <w:b w:val="0"/>
+                <w:color w:val="CC0000"/>
+                <w:sz w:val="16"/>
+              </w:rPr>
+              <w:t>Articol suplimentar în ofertă (nu există în referință)</w:t>
             </w:r>
           </w:p>
         </w:tc>
@@ -4493,7 +5262,7 @@
                 <w:color w:val="000000"/>
                 <w:sz w:val="18"/>
               </w:rPr>
-              <w:t>Neconformitati: 3 din 86 articole ref.</w:t>
+              <w:t>Neconformitati: 3 din 33 articole ref.</w:t>
             </w:r>
           </w:p>
         </w:tc>
@@ -4539,7 +5308,7 @@
                 <w:color w:val="000000"/>
                 <w:sz w:val="18"/>
               </w:rPr>
-              <w:t>86</w:t>
+              <w:t>33</w:t>
             </w:r>
           </w:p>
         </w:tc>
@@ -4576,7 +5345,7 @@
                 <w:color w:val="000000"/>
                 <w:sz w:val="18"/>
               </w:rPr>
-              <w:t>80</w:t>
+              <w:t>31</w:t>
             </w:r>
           </w:p>
         </w:tc>
@@ -4603,7 +5372,7 @@
                 <w:b/>
                 <w:sz w:val="18"/>
               </w:rPr>
-              <w:t>Capitol de lucrări 4.1-14 — Inst sanit hidranti int tip II  │  LIPSA: 1  │  EXTRA: 2  │  Delta: +1</w:t>
+              <w:t>Capitol de lucrări 4.3-05 — Instalatii camin apometru  │  LIPSA: 1  │  EXTRA: 0  │  Delta: -1</w:t>
             </w:r>
           </w:p>
         </w:tc>
@@ -4612,6 +5381,7 @@
         <w:tc>
           <w:tcPr>
             <w:tcW w:type="dxa" w:w="397"/>
+            <w:shd w:fill="FFB3B3" w:val="clear"/>
           </w:tcPr>
           <w:p>
             <w:r>
@@ -4619,13 +5389,14 @@
                 <w:b w:val="0"/>
                 <w:sz w:val="16"/>
               </w:rPr>
-              <w:t>29</w:t>
+              <w:t>34</w:t>
             </w:r>
           </w:p>
         </w:tc>
         <w:tc>
           <w:tcPr>
             <w:tcW w:type="dxa" w:w="1701"/>
+            <w:shd w:fill="FFB3B3" w:val="clear"/>
           </w:tcPr>
           <w:p>
             <w:r>
@@ -4633,13 +5404,14 @@
                 <w:b w:val="0"/>
                 <w:sz w:val="16"/>
               </w:rPr>
-              <w:t>4.1-14 - Inst sanit hidranti int tip II</w:t>
+              <w:t>4.3-05 - Instalatii camin apometru</w:t>
             </w:r>
           </w:p>
         </w:tc>
         <w:tc>
           <w:tcPr>
             <w:tcW w:type="dxa" w:w="850"/>
+            <w:shd w:fill="FFB3B3" w:val="clear"/>
           </w:tcPr>
           <w:p>
             <w:r>
@@ -4647,13 +5419,14 @@
                 <w:b w:val="0"/>
                 <w:sz w:val="16"/>
               </w:rPr>
-              <w:t>S474</w:t>
+              <w:t>TRB05A24</w:t>
             </w:r>
           </w:p>
         </w:tc>
         <w:tc>
           <w:tcPr>
             <w:tcW w:type="dxa" w:w="1984"/>
+            <w:shd w:fill="FFB3B3" w:val="clear"/>
           </w:tcPr>
           <w:p>
             <w:r>
@@ -4661,13 +5434,72 @@
                 <w:b w:val="0"/>
                 <w:sz w:val="16"/>
               </w:rPr>
-              <w:t>dn 40 11/2 zn l: sl02d -0112:4120200</w:t>
+              <w:t>transportul materialelor prin purtat direct mat...</w:t>
             </w:r>
           </w:p>
         </w:tc>
         <w:tc>
           <w:tcPr>
             <w:tcW w:type="dxa" w:w="454"/>
+            <w:shd w:fill="FFB3B3" w:val="clear"/>
+          </w:tcPr>
+          <w:p>
+            <w:r>
+              <w:rPr>
+                <w:b w:val="0"/>
+                <w:sz w:val="16"/>
+              </w:rPr>
+              <w:t>tona</w:t>
+            </w:r>
+          </w:p>
+        </w:tc>
+        <w:tc>
+          <w:tcPr>
+            <w:tcW w:type="dxa" w:w="680"/>
+            <w:shd w:fill="FFB3B3" w:val="clear"/>
+          </w:tcPr>
+          <w:p>
+            <w:r>
+              <w:rPr>
+                <w:b w:val="0"/>
+                <w:sz w:val="16"/>
+              </w:rPr>
+              <w:t>0.3</w:t>
+            </w:r>
+          </w:p>
+        </w:tc>
+        <w:tc>
+          <w:tcPr>
+            <w:tcW w:type="dxa" w:w="850"/>
+            <w:shd w:fill="FFB3B3" w:val="clear"/>
+          </w:tcPr>
+          <w:p/>
+        </w:tc>
+        <w:tc>
+          <w:tcPr>
+            <w:tcW w:type="dxa" w:w="1984"/>
+            <w:shd w:fill="FFB3B3" w:val="clear"/>
+          </w:tcPr>
+          <w:p/>
+        </w:tc>
+        <w:tc>
+          <w:tcPr>
+            <w:tcW w:type="dxa" w:w="454"/>
+            <w:shd w:fill="FFB3B3" w:val="clear"/>
+          </w:tcPr>
+          <w:p/>
+        </w:tc>
+        <w:tc>
+          <w:tcPr>
+            <w:tcW w:type="dxa" w:w="680"/>
+            <w:shd w:fill="FFB3B3" w:val="clear"/>
+          </w:tcPr>
+          <w:p/>
+        </w:tc>
+        <w:tc>
+          <w:tcPr>
+            <w:tcW w:type="dxa" w:w="3572"/>
+            <w:shd w:fill="FFB3B3" w:val="clear"/>
           </w:tcPr>
           <w:p>
             <w:r>
@@ -4676,13 +5508,165 @@
                 <w:color w:val="CC0000"/>
                 <w:sz w:val="16"/>
               </w:rPr>
-              <w:t>-mufafontamaleabilam2</w:t>
-            </w:r>
+              <w:t>Articol lipsă din ofertă</w:t>
+            </w:r>
+          </w:p>
+        </w:tc>
+      </w:tr>
+      <w:tr>
+        <w:tc>
+          <w:tcPr>
+            <w:tcW w:type="dxa" w:w="397"/>
+          </w:tcPr>
+          <w:p/>
+        </w:tc>
+        <w:tc>
+          <w:tcPr>
+            <w:tcW w:type="dxa" w:w="1701"/>
+            <w:shd w:fill="D9D9D9" w:val="clear"/>
+          </w:tcPr>
+          <w:p>
+            <w:r>
+              <w:rPr>
+                <w:b/>
+                <w:color w:val="000000"/>
+                <w:sz w:val="18"/>
+              </w:rPr>
+              <w:t>SUMAR</w:t>
+            </w:r>
+          </w:p>
+        </w:tc>
+        <w:tc>
+          <w:tcPr>
+            <w:tcW w:type="dxa" w:w="850"/>
+            <w:shd w:fill="D9D9D9" w:val="clear"/>
+          </w:tcPr>
+          <w:p>
+            <w:r>
+              <w:rPr>
+                <w:b/>
+                <w:color w:val="000000"/>
+                <w:sz w:val="18"/>
+              </w:rPr>
+              <w:t>Neconformitati: 1 din 13 articole ref.</w:t>
+            </w:r>
+          </w:p>
+        </w:tc>
+        <w:tc>
+          <w:tcPr>
+            <w:tcW w:type="dxa" w:w="1984"/>
+            <w:shd w:fill="D9D9D9" w:val="clear"/>
+          </w:tcPr>
+          <w:p>
+            <w:r/>
+          </w:p>
+        </w:tc>
+        <w:tc>
+          <w:tcPr>
+            <w:tcW w:type="dxa" w:w="454"/>
+            <w:shd w:fill="D9D9D9" w:val="clear"/>
+          </w:tcPr>
+          <w:p>
+            <w:r/>
           </w:p>
         </w:tc>
         <w:tc>
           <w:tcPr>
             <w:tcW w:type="dxa" w:w="680"/>
+            <w:shd w:fill="D9D9D9" w:val="clear"/>
+          </w:tcPr>
+          <w:p>
+            <w:r/>
+          </w:p>
+        </w:tc>
+        <w:tc>
+          <w:tcPr>
+            <w:tcW w:type="dxa" w:w="850"/>
+            <w:shd w:fill="D9D9D9" w:val="clear"/>
+          </w:tcPr>
+          <w:p>
+            <w:pPr>
+              <w:jc w:val="center"/>
+            </w:pPr>
+            <w:r>
+              <w:rPr>
+                <w:b/>
+                <w:color w:val="000000"/>
+                <w:sz w:val="18"/>
+              </w:rPr>
+              <w:t>13</w:t>
+            </w:r>
+          </w:p>
+        </w:tc>
+        <w:tc>
+          <w:tcPr>
+            <w:tcW w:type="dxa" w:w="1984"/>
+            <w:shd w:fill="D9D9D9" w:val="clear"/>
+          </w:tcPr>
+          <w:p>
+            <w:r/>
+          </w:p>
+        </w:tc>
+        <w:tc>
+          <w:tcPr>
+            <w:tcW w:type="dxa" w:w="454"/>
+            <w:shd w:fill="D9D9D9" w:val="clear"/>
+          </w:tcPr>
+          <w:p>
+            <w:r/>
+          </w:p>
+        </w:tc>
+        <w:tc>
+          <w:tcPr>
+            <w:tcW w:type="dxa" w:w="680"/>
+            <w:shd w:fill="D9D9D9" w:val="clear"/>
+          </w:tcPr>
+          <w:p>
+            <w:pPr>
+              <w:jc w:val="center"/>
+            </w:pPr>
+            <w:r>
+              <w:rPr>
+                <w:b/>
+                <w:color w:val="000000"/>
+                <w:sz w:val="18"/>
+              </w:rPr>
+              <w:t>11</w:t>
+            </w:r>
+          </w:p>
+        </w:tc>
+        <w:tc>
+          <w:tcPr>
+            <w:tcW w:type="dxa" w:w="3572"/>
+            <w:shd w:fill="D9D9D9" w:val="clear"/>
+          </w:tcPr>
+          <w:p>
+            <w:r/>
+          </w:p>
+        </w:tc>
+      </w:tr>
+      <w:tr>
+        <w:tc>
+          <w:tcPr>
+            <w:tcW w:type="dxa" w:w="3572"/>
+            <w:gridSpan w:val="11"/>
+            <w:shd w:fill="D9D9D9" w:val="clear"/>
+          </w:tcPr>
+          <w:p>
+            <w:r>
+              <w:rPr>
+                <w:b/>
+                <w:sz w:val="18"/>
+              </w:rPr>
+              <w:t>Capitol de lucrări 4.3-06 — Inst sanitare GospApa  │  LIPSA: 1  │  EXTRA: 0  │  Delta: -1</w:t>
+            </w:r>
+          </w:p>
+        </w:tc>
+      </w:tr>
+      <w:tr>
+        <w:tc>
+          <w:tcPr>
+            <w:tcW w:type="dxa" w:w="397"/>
           </w:tcPr>
           <w:p>
             <w:r>
@@ -4690,13 +5674,13 @@
                 <w:b w:val="0"/>
                 <w:sz w:val="16"/>
               </w:rPr>
-              <w:t>0.0</w:t>
-            </w:r>
-          </w:p>
-        </w:tc>
-        <w:tc>
-          <w:tcPr>
-            <w:tcW w:type="dxa" w:w="850"/>
+              <w:t>36</w:t>
+            </w:r>
+          </w:p>
+        </w:tc>
+        <w:tc>
+          <w:tcPr>
+            <w:tcW w:type="dxa" w:w="1701"/>
           </w:tcPr>
           <w:p>
             <w:r>
@@ -4704,13 +5688,13 @@
                 <w:b w:val="0"/>
                 <w:sz w:val="16"/>
               </w:rPr>
-              <w:t>S474</w:t>
-            </w:r>
-          </w:p>
-        </w:tc>
-        <w:tc>
-          <w:tcPr>
-            <w:tcW w:type="dxa" w:w="1984"/>
+              <w:t>4.3-06 - Inst sanitare GospApa</w:t>
+            </w:r>
+          </w:p>
+        </w:tc>
+        <w:tc>
+          <w:tcPr>
+            <w:tcW w:type="dxa" w:w="850"/>
           </w:tcPr>
           <w:p>
             <w:r>
@@ -4718,13 +5702,41 @@
                 <w:b w:val="0"/>
                 <w:sz w:val="16"/>
               </w:rPr>
-              <w:t>40 11/2 zn</w:t>
+              <w:t>SD18A1</w:t>
+            </w:r>
+          </w:p>
+        </w:tc>
+        <w:tc>
+          <w:tcPr>
+            <w:tcW w:type="dxa" w:w="1984"/>
+          </w:tcPr>
+          <w:p>
+            <w:r>
+              <w:rPr>
+                <w:b w:val="0"/>
+                <w:sz w:val="16"/>
+              </w:rPr>
+              <w:t>robinet de golire 25 mm l: 11411 -m : 8813001 -...</w:t>
             </w:r>
           </w:p>
         </w:tc>
         <w:tc>
           <w:tcPr>
             <w:tcW w:type="dxa" w:w="454"/>
+          </w:tcPr>
+          <w:p>
+            <w:r>
+              <w:rPr>
+                <w:b w:val="0"/>
+                <w:sz w:val="16"/>
+              </w:rPr>
+              <w:t>buc</w:t>
+            </w:r>
+          </w:p>
+        </w:tc>
+        <w:tc>
+          <w:tcPr>
+            <w:tcW w:type="dxa" w:w="680"/>
           </w:tcPr>
           <w:p>
             <w:r>
@@ -4733,13 +5745,13 @@
                 <w:color w:val="CC0000"/>
                 <w:sz w:val="16"/>
               </w:rPr>
-              <w:t>buc</w:t>
-            </w:r>
-          </w:p>
-        </w:tc>
-        <w:tc>
-          <w:tcPr>
-            <w:tcW w:type="dxa" w:w="680"/>
+              <w:t>1.0</w:t>
+            </w:r>
+          </w:p>
+        </w:tc>
+        <w:tc>
+          <w:tcPr>
+            <w:tcW w:type="dxa" w:w="850"/>
           </w:tcPr>
           <w:p>
             <w:r>
@@ -4747,13 +5759,41 @@
                 <w:b w:val="0"/>
                 <w:sz w:val="16"/>
               </w:rPr>
-              <w:t>7.77</w:t>
-            </w:r>
-          </w:p>
-        </w:tc>
-        <w:tc>
-          <w:tcPr>
-            <w:tcW w:type="dxa" w:w="3572"/>
+              <w:t>SD18A1</w:t>
+            </w:r>
+          </w:p>
+        </w:tc>
+        <w:tc>
+          <w:tcPr>
+            <w:tcW w:type="dxa" w:w="1984"/>
+          </w:tcPr>
+          <w:p>
+            <w:r>
+              <w:rPr>
+                <w:b w:val="0"/>
+                <w:sz w:val="16"/>
+              </w:rPr>
+              <w:t>robinet cu plutitor dn 3/4'</w:t>
+            </w:r>
+          </w:p>
+        </w:tc>
+        <w:tc>
+          <w:tcPr>
+            <w:tcW w:type="dxa" w:w="454"/>
+          </w:tcPr>
+          <w:p>
+            <w:r>
+              <w:rPr>
+                <w:b w:val="0"/>
+                <w:sz w:val="16"/>
+              </w:rPr>
+              <w:t>buc</w:t>
+            </w:r>
+          </w:p>
+        </w:tc>
+        <w:tc>
+          <w:tcPr>
+            <w:tcW w:type="dxa" w:w="680"/>
           </w:tcPr>
           <w:p>
             <w:r>
@@ -4762,134 +5802,13 @@
                 <w:color w:val="CC0000"/>
                 <w:sz w:val="16"/>
               </w:rPr>
-              <w:t>Unitate de măsură diferită: referință -mufafontamaleabilam2, ofertat buc</w:t>
-            </w:r>
-          </w:p>
-        </w:tc>
-      </w:tr>
-      <w:tr>
-        <w:tc>
-          <w:tcPr>
-            <w:tcW w:type="dxa" w:w="397"/>
-            <w:shd w:fill="FFB3B3" w:val="clear"/>
-          </w:tcPr>
-          <w:p>
-            <w:r>
-              <w:rPr>
-                <w:b w:val="0"/>
-                <w:sz w:val="16"/>
-              </w:rPr>
-              <w:t>30</w:t>
-            </w:r>
-          </w:p>
-        </w:tc>
-        <w:tc>
-          <w:tcPr>
-            <w:tcW w:type="dxa" w:w="1701"/>
-            <w:shd w:fill="FFB3B3" w:val="clear"/>
-          </w:tcPr>
-          <w:p>
-            <w:r>
-              <w:rPr>
-                <w:b w:val="0"/>
-                <w:sz w:val="16"/>
-              </w:rPr>
-              <w:t>4.1-14 - Inst sanit hidranti int tip II</w:t>
-            </w:r>
-          </w:p>
-        </w:tc>
-        <w:tc>
-          <w:tcPr>
-            <w:tcW w:type="dxa" w:w="850"/>
-            <w:shd w:fill="FFB3B3" w:val="clear"/>
-          </w:tcPr>
-          <w:p>
-            <w:r>
-              <w:rPr>
-                <w:b w:val="0"/>
-                <w:sz w:val="16"/>
-              </w:rPr>
-              <w:t>02012A1</w:t>
-            </w:r>
-          </w:p>
-        </w:tc>
-        <w:tc>
-          <w:tcPr>
-            <w:tcW w:type="dxa" w:w="1984"/>
-            <w:shd w:fill="FFB3B3" w:val="clear"/>
-          </w:tcPr>
-          <w:p>
-            <w:r>
-              <w:rPr>
-                <w:b w:val="0"/>
-                <w:sz w:val="16"/>
-              </w:rPr>
-              <w:t>cot pehd75/90 gr</w:t>
-            </w:r>
-          </w:p>
-        </w:tc>
-        <w:tc>
-          <w:tcPr>
-            <w:tcW w:type="dxa" w:w="454"/>
-            <w:shd w:fill="FFB3B3" w:val="clear"/>
-          </w:tcPr>
-          <w:p>
-            <w:r>
-              <w:rPr>
-                <w:b w:val="0"/>
-                <w:sz w:val="16"/>
-              </w:rPr>
-              <w:t>buc</w:t>
-            </w:r>
-          </w:p>
-        </w:tc>
-        <w:tc>
-          <w:tcPr>
-            <w:tcW w:type="dxa" w:w="680"/>
-            <w:shd w:fill="FFB3B3" w:val="clear"/>
-          </w:tcPr>
-          <w:p>
-            <w:r>
-              <w:rPr>
-                <w:b w:val="0"/>
-                <w:sz w:val="16"/>
-              </w:rPr>
-              <w:t>1.0</w:t>
-            </w:r>
-          </w:p>
-        </w:tc>
-        <w:tc>
-          <w:tcPr>
-            <w:tcW w:type="dxa" w:w="850"/>
-            <w:shd w:fill="FFB3B3" w:val="clear"/>
-          </w:tcPr>
-          <w:p/>
-        </w:tc>
-        <w:tc>
-          <w:tcPr>
-            <w:tcW w:type="dxa" w:w="1984"/>
-            <w:shd w:fill="FFB3B3" w:val="clear"/>
-          </w:tcPr>
-          <w:p/>
-        </w:tc>
-        <w:tc>
-          <w:tcPr>
-            <w:tcW w:type="dxa" w:w="454"/>
-            <w:shd w:fill="FFB3B3" w:val="clear"/>
-          </w:tcPr>
-          <w:p/>
-        </w:tc>
-        <w:tc>
-          <w:tcPr>
-            <w:tcW w:type="dxa" w:w="680"/>
-            <w:shd w:fill="FFB3B3" w:val="clear"/>
-          </w:tcPr>
-          <w:p/>
+              <w:t>3.0</w:t>
+            </w:r>
+          </w:p>
         </w:tc>
         <w:tc>
           <w:tcPr>
             <w:tcW w:type="dxa" w:w="3572"/>
-            <w:shd w:fill="FFB3B3" w:val="clear"/>
           </w:tcPr>
           <w:p>
             <w:r>
@@ -4898,7 +5817,293 @@
                 <w:color w:val="CC0000"/>
                 <w:sz w:val="16"/>
               </w:rPr>
+              <w:t>Cantitate diferită: referință 1.0 buc, ofertat 3.0 buc</w:t>
+            </w:r>
+          </w:p>
+        </w:tc>
+      </w:tr>
+      <w:tr>
+        <w:tc>
+          <w:tcPr>
+            <w:tcW w:type="dxa" w:w="397"/>
+            <w:shd w:fill="FFB3B3" w:val="clear"/>
+          </w:tcPr>
+          <w:p>
+            <w:r>
+              <w:rPr>
+                <w:b w:val="0"/>
+                <w:sz w:val="16"/>
+              </w:rPr>
+              <w:t>37</w:t>
+            </w:r>
+          </w:p>
+        </w:tc>
+        <w:tc>
+          <w:tcPr>
+            <w:tcW w:type="dxa" w:w="1701"/>
+            <w:shd w:fill="FFB3B3" w:val="clear"/>
+          </w:tcPr>
+          <w:p>
+            <w:r>
+              <w:rPr>
+                <w:b w:val="0"/>
+                <w:sz w:val="16"/>
+              </w:rPr>
+              <w:t>4.3-06 - Inst sanitare GospApa</w:t>
+            </w:r>
+          </w:p>
+        </w:tc>
+        <w:tc>
+          <w:tcPr>
+            <w:tcW w:type="dxa" w:w="850"/>
+            <w:shd w:fill="FFB3B3" w:val="clear"/>
+          </w:tcPr>
+          <w:p>
+            <w:r>
+              <w:rPr>
+                <w:b w:val="0"/>
+                <w:sz w:val="16"/>
+              </w:rPr>
+              <w:t>SD18A1</w:t>
+            </w:r>
+          </w:p>
+        </w:tc>
+        <w:tc>
+          <w:tcPr>
+            <w:tcW w:type="dxa" w:w="1984"/>
+            <w:shd w:fill="FFB3B3" w:val="clear"/>
+          </w:tcPr>
+          <w:p>
+            <w:r>
+              <w:rPr>
+                <w:b w:val="0"/>
+                <w:sz w:val="16"/>
+              </w:rPr>
+              <w:t>robinet cu plutitor dn %%' l: 11411 -0130: 4201...</w:t>
+            </w:r>
+          </w:p>
+        </w:tc>
+        <w:tc>
+          <w:tcPr>
+            <w:tcW w:type="dxa" w:w="454"/>
+            <w:shd w:fill="FFB3B3" w:val="clear"/>
+          </w:tcPr>
+          <w:p>
+            <w:r>
+              <w:rPr>
+                <w:b w:val="0"/>
+                <w:sz w:val="16"/>
+              </w:rPr>
+              <w:t>buc</w:t>
+            </w:r>
+          </w:p>
+        </w:tc>
+        <w:tc>
+          <w:tcPr>
+            <w:tcW w:type="dxa" w:w="680"/>
+            <w:shd w:fill="FFB3B3" w:val="clear"/>
+          </w:tcPr>
+          <w:p>
+            <w:r>
+              <w:rPr>
+                <w:b w:val="0"/>
+                <w:sz w:val="16"/>
+              </w:rPr>
+              <w:t>3.0</w:t>
+            </w:r>
+          </w:p>
+        </w:tc>
+        <w:tc>
+          <w:tcPr>
+            <w:tcW w:type="dxa" w:w="850"/>
+            <w:shd w:fill="FFB3B3" w:val="clear"/>
+          </w:tcPr>
+          <w:p/>
+        </w:tc>
+        <w:tc>
+          <w:tcPr>
+            <w:tcW w:type="dxa" w:w="1984"/>
+            <w:shd w:fill="FFB3B3" w:val="clear"/>
+          </w:tcPr>
+          <w:p/>
+        </w:tc>
+        <w:tc>
+          <w:tcPr>
+            <w:tcW w:type="dxa" w:w="454"/>
+            <w:shd w:fill="FFB3B3" w:val="clear"/>
+          </w:tcPr>
+          <w:p/>
+        </w:tc>
+        <w:tc>
+          <w:tcPr>
+            <w:tcW w:type="dxa" w:w="680"/>
+            <w:shd w:fill="FFB3B3" w:val="clear"/>
+          </w:tcPr>
+          <w:p/>
+        </w:tc>
+        <w:tc>
+          <w:tcPr>
+            <w:tcW w:type="dxa" w:w="3572"/>
+            <w:shd w:fill="FFB3B3" w:val="clear"/>
+          </w:tcPr>
+          <w:p>
+            <w:r>
+              <w:rPr>
+                <w:b w:val="0"/>
+                <w:color w:val="CC0000"/>
+                <w:sz w:val="16"/>
+              </w:rPr>
               <w:t>Articol lipsă din ofertă</w:t>
+            </w:r>
+          </w:p>
+        </w:tc>
+      </w:tr>
+      <w:tr>
+        <w:tc>
+          <w:tcPr>
+            <w:tcW w:type="dxa" w:w="397"/>
+          </w:tcPr>
+          <w:p/>
+        </w:tc>
+        <w:tc>
+          <w:tcPr>
+            <w:tcW w:type="dxa" w:w="1701"/>
+            <w:shd w:fill="D9D9D9" w:val="clear"/>
+          </w:tcPr>
+          <w:p>
+            <w:r>
+              <w:rPr>
+                <w:b/>
+                <w:color w:val="000000"/>
+                <w:sz w:val="18"/>
+              </w:rPr>
+              <w:t>SUMAR</w:t>
+            </w:r>
+          </w:p>
+        </w:tc>
+        <w:tc>
+          <w:tcPr>
+            <w:tcW w:type="dxa" w:w="850"/>
+            <w:shd w:fill="D9D9D9" w:val="clear"/>
+          </w:tcPr>
+          <w:p>
+            <w:r>
+              <w:rPr>
+                <w:b/>
+                <w:color w:val="000000"/>
+                <w:sz w:val="18"/>
+              </w:rPr>
+              <w:t>Neconformitati: 1 din 43 articole ref.</w:t>
+            </w:r>
+          </w:p>
+        </w:tc>
+        <w:tc>
+          <w:tcPr>
+            <w:tcW w:type="dxa" w:w="1984"/>
+            <w:shd w:fill="D9D9D9" w:val="clear"/>
+          </w:tcPr>
+          <w:p>
+            <w:r/>
+          </w:p>
+        </w:tc>
+        <w:tc>
+          <w:tcPr>
+            <w:tcW w:type="dxa" w:w="454"/>
+            <w:shd w:fill="D9D9D9" w:val="clear"/>
+          </w:tcPr>
+          <w:p>
+            <w:r/>
+          </w:p>
+        </w:tc>
+        <w:tc>
+          <w:tcPr>
+            <w:tcW w:type="dxa" w:w="680"/>
+            <w:shd w:fill="D9D9D9" w:val="clear"/>
+          </w:tcPr>
+          <w:p>
+            <w:r/>
+          </w:p>
+        </w:tc>
+        <w:tc>
+          <w:tcPr>
+            <w:tcW w:type="dxa" w:w="850"/>
+            <w:shd w:fill="D9D9D9" w:val="clear"/>
+          </w:tcPr>
+          <w:p>
+            <w:pPr>
+              <w:jc w:val="center"/>
+            </w:pPr>
+            <w:r>
+              <w:rPr>
+                <w:b/>
+                <w:color w:val="000000"/>
+                <w:sz w:val="18"/>
+              </w:rPr>
+              <w:t>43</w:t>
+            </w:r>
+          </w:p>
+        </w:tc>
+        <w:tc>
+          <w:tcPr>
+            <w:tcW w:type="dxa" w:w="1984"/>
+            <w:shd w:fill="D9D9D9" w:val="clear"/>
+          </w:tcPr>
+          <w:p>
+            <w:r/>
+          </w:p>
+        </w:tc>
+        <w:tc>
+          <w:tcPr>
+            <w:tcW w:type="dxa" w:w="454"/>
+            <w:shd w:fill="D9D9D9" w:val="clear"/>
+          </w:tcPr>
+          <w:p>
+            <w:r/>
+          </w:p>
+        </w:tc>
+        <w:tc>
+          <w:tcPr>
+            <w:tcW w:type="dxa" w:w="680"/>
+            <w:shd w:fill="D9D9D9" w:val="clear"/>
+          </w:tcPr>
+          <w:p>
+            <w:pPr>
+              <w:jc w:val="center"/>
+            </w:pPr>
+            <w:r>
+              <w:rPr>
+                <w:b/>
+                <w:color w:val="000000"/>
+                <w:sz w:val="18"/>
+              </w:rPr>
+              <w:t>40</w:t>
+            </w:r>
+          </w:p>
+        </w:tc>
+        <w:tc>
+          <w:tcPr>
+            <w:tcW w:type="dxa" w:w="3572"/>
+            <w:shd w:fill="D9D9D9" w:val="clear"/>
+          </w:tcPr>
+          <w:p>
+            <w:r/>
+          </w:p>
+        </w:tc>
+      </w:tr>
+      <w:tr>
+        <w:tc>
+          <w:tcPr>
+            <w:tcW w:type="dxa" w:w="3572"/>
+            <w:gridSpan w:val="11"/>
+            <w:shd w:fill="D9D9D9" w:val="clear"/>
+          </w:tcPr>
+          <w:p>
+            <w:r>
+              <w:rPr>
+                <w:b/>
+                <w:sz w:val="18"/>
+              </w:rPr>
+              <w:t>Capitol de lucrări 4.2-2 — Structura  │  LIPSA: 0  │  EXTRA: 1  │  Delta: +1</w:t>
             </w:r>
           </w:p>
         </w:tc>
@@ -4934,7 +6139,7 @@
                 <w:b w:val="0"/>
                 <w:sz w:val="16"/>
               </w:rPr>
-              <w:t>31</w:t>
+              <w:t>39</w:t>
             </w:r>
           </w:p>
         </w:tc>
@@ -4949,7 +6154,7 @@
                 <w:b w:val="0"/>
                 <w:sz w:val="16"/>
               </w:rPr>
-              <w:t>4.1-14 - Inst sanit hidranti int tip II</w:t>
+              <w:t>4.2-2 - Structura</w:t>
             </w:r>
           </w:p>
         </w:tc>
@@ -5020,7 +6225,7 @@
                 <w:b w:val="0"/>
                 <w:sz w:val="16"/>
               </w:rPr>
-              <w:t>S475</w:t>
+              <w:t>RPCB02E</w:t>
             </w:r>
           </w:p>
         </w:tc>
@@ -5035,7 +6240,7 @@
                 <w:b w:val="0"/>
                 <w:sz w:val="16"/>
               </w:rPr>
-              <w:t>40 11/2 zn</w:t>
+              <w:t>beton c12/15 egalizare</w:t>
             </w:r>
           </w:p>
         </w:tc>
@@ -5050,7 +6255,7 @@
                 <w:b w:val="0"/>
                 <w:sz w:val="16"/>
               </w:rPr>
-              <w:t>buc</w:t>
+              <w:t>mc</w:t>
             </w:r>
           </w:p>
         </w:tc>
@@ -5065,7 +6270,7 @@
                 <w:b w:val="0"/>
                 <w:sz w:val="16"/>
               </w:rPr>
-              <w:t>1.55</w:t>
+              <w:t>2.17</w:t>
             </w:r>
           </w:p>
         </w:tc>
@@ -5090,6 +6295,175 @@
         <w:tc>
           <w:tcPr>
             <w:tcW w:type="dxa" w:w="397"/>
+          </w:tcPr>
+          <w:p/>
+        </w:tc>
+        <w:tc>
+          <w:tcPr>
+            <w:tcW w:type="dxa" w:w="1701"/>
+            <w:shd w:fill="D9D9D9" w:val="clear"/>
+          </w:tcPr>
+          <w:p>
+            <w:r>
+              <w:rPr>
+                <w:b/>
+                <w:color w:val="000000"/>
+                <w:sz w:val="18"/>
+              </w:rPr>
+              <w:t>SUMAR</w:t>
+            </w:r>
+          </w:p>
+        </w:tc>
+        <w:tc>
+          <w:tcPr>
+            <w:tcW w:type="dxa" w:w="850"/>
+            <w:shd w:fill="D9D9D9" w:val="clear"/>
+          </w:tcPr>
+          <w:p>
+            <w:r>
+              <w:rPr>
+                <w:b/>
+                <w:color w:val="000000"/>
+                <w:sz w:val="18"/>
+              </w:rPr>
+              <w:t>Neconformitati: 1 din 14 articole ref.</w:t>
+            </w:r>
+          </w:p>
+        </w:tc>
+        <w:tc>
+          <w:tcPr>
+            <w:tcW w:type="dxa" w:w="1984"/>
+            <w:shd w:fill="D9D9D9" w:val="clear"/>
+          </w:tcPr>
+          <w:p>
+            <w:r/>
+          </w:p>
+        </w:tc>
+        <w:tc>
+          <w:tcPr>
+            <w:tcW w:type="dxa" w:w="454"/>
+            <w:shd w:fill="D9D9D9" w:val="clear"/>
+          </w:tcPr>
+          <w:p>
+            <w:r/>
+          </w:p>
+        </w:tc>
+        <w:tc>
+          <w:tcPr>
+            <w:tcW w:type="dxa" w:w="680"/>
+            <w:shd w:fill="D9D9D9" w:val="clear"/>
+          </w:tcPr>
+          <w:p>
+            <w:r/>
+          </w:p>
+        </w:tc>
+        <w:tc>
+          <w:tcPr>
+            <w:tcW w:type="dxa" w:w="850"/>
+            <w:shd w:fill="D9D9D9" w:val="clear"/>
+          </w:tcPr>
+          <w:p>
+            <w:pPr>
+              <w:jc w:val="center"/>
+            </w:pPr>
+            <w:r>
+              <w:rPr>
+                <w:b/>
+                <w:color w:val="000000"/>
+                <w:sz w:val="18"/>
+              </w:rPr>
+              <w:t>14</w:t>
+            </w:r>
+          </w:p>
+        </w:tc>
+        <w:tc>
+          <w:tcPr>
+            <w:tcW w:type="dxa" w:w="1984"/>
+            <w:shd w:fill="D9D9D9" w:val="clear"/>
+          </w:tcPr>
+          <w:p>
+            <w:r/>
+          </w:p>
+        </w:tc>
+        <w:tc>
+          <w:tcPr>
+            <w:tcW w:type="dxa" w:w="454"/>
+            <w:shd w:fill="D9D9D9" w:val="clear"/>
+          </w:tcPr>
+          <w:p>
+            <w:r/>
+          </w:p>
+        </w:tc>
+        <w:tc>
+          <w:tcPr>
+            <w:tcW w:type="dxa" w:w="680"/>
+            <w:shd w:fill="D9D9D9" w:val="clear"/>
+          </w:tcPr>
+          <w:p>
+            <w:pPr>
+              <w:jc w:val="center"/>
+            </w:pPr>
+            <w:r>
+              <w:rPr>
+                <w:b/>
+                <w:color w:val="000000"/>
+                <w:sz w:val="18"/>
+              </w:rPr>
+              <w:t>12</w:t>
+            </w:r>
+          </w:p>
+        </w:tc>
+        <w:tc>
+          <w:tcPr>
+            <w:tcW w:type="dxa" w:w="3572"/>
+            <w:shd w:fill="D9D9D9" w:val="clear"/>
+          </w:tcPr>
+          <w:p>
+            <w:r/>
+          </w:p>
+        </w:tc>
+      </w:tr>
+      <w:tr>
+        <w:tc>
+          <w:tcPr>
+            <w:tcW w:type="dxa" w:w="3572"/>
+            <w:gridSpan w:val="11"/>
+            <w:shd w:fill="D9D9D9" w:val="clear"/>
+          </w:tcPr>
+          <w:p>
+            <w:r>
+              <w:rPr>
+                <w:b/>
+                <w:sz w:val="18"/>
+              </w:rPr>
+              <w:t>Capitol de lucrări 5.1-1 — Lucrari de constructii  │  LIPSA: 0  │  EXTRA: 2  │  Delta: +2</w:t>
+            </w:r>
+          </w:p>
+        </w:tc>
+      </w:tr>
+      <w:tr>
+        <w:tc>
+          <w:tcPr>
+            <w:tcW w:type="dxa" w:w="3572"/>
+            <w:gridSpan w:val="11"/>
+            <w:shd w:fill="FFFF99" w:val="clear"/>
+          </w:tcPr>
+          <w:p>
+            <w:r>
+              <w:rPr>
+                <w:b w:val="0"/>
+                <w:i/>
+                <w:sz w:val="16"/>
+              </w:rPr>
+              <w:t>▸ Articole extra în ofertă — verificare manuală recomandată</w:t>
+            </w:r>
+          </w:p>
+        </w:tc>
+      </w:tr>
+      <w:tr>
+        <w:tc>
+          <w:tcPr>
+            <w:tcW w:type="dxa" w:w="397"/>
             <w:shd w:fill="FFFF99" w:val="clear"/>
           </w:tcPr>
           <w:p>
@@ -5098,7 +6472,7 @@
                 <w:b w:val="0"/>
                 <w:sz w:val="16"/>
               </w:rPr>
-              <w:t>32</w:t>
+              <w:t>41</w:t>
             </w:r>
           </w:p>
         </w:tc>
@@ -5113,7 +6487,7 @@
                 <w:b w:val="0"/>
                 <w:sz w:val="16"/>
               </w:rPr>
-              <w:t>4.1-14 - Inst sanit hidranti int tip II</w:t>
+              <w:t>5.1-1 - Lucrari de constructii</w:t>
             </w:r>
           </w:p>
         </w:tc>
@@ -5184,7 +6558,7 @@
                 <w:b w:val="0"/>
                 <w:sz w:val="16"/>
               </w:rPr>
-              <w:t>S474</w:t>
+              <w:t>IEC60076</w:t>
             </w:r>
           </w:p>
         </w:tc>
@@ -5199,7 +6573,7 @@
                 <w:b w:val="0"/>
                 <w:sz w:val="16"/>
               </w:rPr>
-              <w:t>50 2 zn</w:t>
+              <w:t>fabricație conform standardelor ue 1so9g01; iec...</w:t>
             </w:r>
           </w:p>
         </w:tc>
@@ -5214,7 +6588,6 @@
                 <w:b w:val="0"/>
                 <w:sz w:val="16"/>
               </w:rPr>
-              <w:t>buc</w:t>
             </w:r>
           </w:p>
         </w:tc>
@@ -5229,7 +6602,7 @@
                 <w:b w:val="0"/>
                 <w:sz w:val="16"/>
               </w:rPr>
-              <w:t>8.42</w:t>
+              <w:t>1.0</w:t>
             </w:r>
           </w:p>
         </w:tc>
@@ -5254,156 +6627,7 @@
         <w:tc>
           <w:tcPr>
             <w:tcW w:type="dxa" w:w="397"/>
-          </w:tcPr>
-          <w:p/>
-        </w:tc>
-        <w:tc>
-          <w:tcPr>
-            <w:tcW w:type="dxa" w:w="1701"/>
-            <w:shd w:fill="D9D9D9" w:val="clear"/>
-          </w:tcPr>
-          <w:p>
-            <w:r>
-              <w:rPr>
-                <w:b/>
-                <w:color w:val="000000"/>
-                <w:sz w:val="18"/>
-              </w:rPr>
-              <w:t>SUMAR</w:t>
-            </w:r>
-          </w:p>
-        </w:tc>
-        <w:tc>
-          <w:tcPr>
-            <w:tcW w:type="dxa" w:w="850"/>
-            <w:shd w:fill="D9D9D9" w:val="clear"/>
-          </w:tcPr>
-          <w:p>
-            <w:r>
-              <w:rPr>
-                <w:b/>
-                <w:color w:val="000000"/>
-                <w:sz w:val="18"/>
-              </w:rPr>
-              <w:t>Neconformitati: 2 din 33 articole ref.</w:t>
-            </w:r>
-          </w:p>
-        </w:tc>
-        <w:tc>
-          <w:tcPr>
-            <w:tcW w:type="dxa" w:w="1984"/>
-            <w:shd w:fill="D9D9D9" w:val="clear"/>
-          </w:tcPr>
-          <w:p>
-            <w:r/>
-          </w:p>
-        </w:tc>
-        <w:tc>
-          <w:tcPr>
-            <w:tcW w:type="dxa" w:w="454"/>
-            <w:shd w:fill="D9D9D9" w:val="clear"/>
-          </w:tcPr>
-          <w:p>
-            <w:r/>
-          </w:p>
-        </w:tc>
-        <w:tc>
-          <w:tcPr>
-            <w:tcW w:type="dxa" w:w="680"/>
-            <w:shd w:fill="D9D9D9" w:val="clear"/>
-          </w:tcPr>
-          <w:p>
-            <w:r/>
-          </w:p>
-        </w:tc>
-        <w:tc>
-          <w:tcPr>
-            <w:tcW w:type="dxa" w:w="850"/>
-            <w:shd w:fill="D9D9D9" w:val="clear"/>
-          </w:tcPr>
-          <w:p>
-            <w:pPr>
-              <w:jc w:val="center"/>
-            </w:pPr>
-            <w:r>
-              <w:rPr>
-                <w:b/>
-                <w:color w:val="000000"/>
-                <w:sz w:val="18"/>
-              </w:rPr>
-              <w:t>33</w:t>
-            </w:r>
-          </w:p>
-        </w:tc>
-        <w:tc>
-          <w:tcPr>
-            <w:tcW w:type="dxa" w:w="1984"/>
-            <w:shd w:fill="D9D9D9" w:val="clear"/>
-          </w:tcPr>
-          <w:p>
-            <w:r/>
-          </w:p>
-        </w:tc>
-        <w:tc>
-          <w:tcPr>
-            <w:tcW w:type="dxa" w:w="454"/>
-            <w:shd w:fill="D9D9D9" w:val="clear"/>
-          </w:tcPr>
-          <w:p>
-            <w:r/>
-          </w:p>
-        </w:tc>
-        <w:tc>
-          <w:tcPr>
-            <w:tcW w:type="dxa" w:w="680"/>
-            <w:shd w:fill="D9D9D9" w:val="clear"/>
-          </w:tcPr>
-          <w:p>
-            <w:pPr>
-              <w:jc w:val="center"/>
-            </w:pPr>
-            <w:r>
-              <w:rPr>
-                <w:b/>
-                <w:color w:val="000000"/>
-                <w:sz w:val="18"/>
-              </w:rPr>
-              <w:t>31</w:t>
-            </w:r>
-          </w:p>
-        </w:tc>
-        <w:tc>
-          <w:tcPr>
-            <w:tcW w:type="dxa" w:w="3572"/>
-            <w:shd w:fill="D9D9D9" w:val="clear"/>
-          </w:tcPr>
-          <w:p>
-            <w:r/>
-          </w:p>
-        </w:tc>
-      </w:tr>
-      <w:tr>
-        <w:tc>
-          <w:tcPr>
-            <w:tcW w:type="dxa" w:w="3572"/>
-            <w:gridSpan w:val="11"/>
-            <w:shd w:fill="D9D9D9" w:val="clear"/>
-          </w:tcPr>
-          <w:p>
-            <w:r>
-              <w:rPr>
-                <w:b/>
-                <w:sz w:val="18"/>
-              </w:rPr>
-              <w:t>Capitol de lucrări 4.1-17 — Echipam apa calda tip I  │  LIPSA: 0  │  EXTRA: 0  │  Delta: 0 ✓</w:t>
-            </w:r>
-          </w:p>
-        </w:tc>
-      </w:tr>
-      <w:tr>
-        <w:tc>
-          <w:tcPr>
-            <w:tcW w:type="dxa" w:w="397"/>
+            <w:shd w:fill="FFFF99" w:val="clear"/>
           </w:tcPr>
           <w:p>
             <w:r>
@@ -5411,13 +6635,14 @@
                 <w:b w:val="0"/>
                 <w:sz w:val="16"/>
               </w:rPr>
-              <w:t>34</w:t>
+              <w:t>42</w:t>
             </w:r>
           </w:p>
         </w:tc>
         <w:tc>
           <w:tcPr>
             <w:tcW w:type="dxa" w:w="1701"/>
+            <w:shd w:fill="FFFF99" w:val="clear"/>
           </w:tcPr>
           <w:p>
             <w:r>
@@ -5425,13 +6650,14 @@
                 <w:b w:val="0"/>
                 <w:sz w:val="16"/>
               </w:rPr>
-              <w:t>4.1-17 - Echipam apa calda tip I</w:t>
+              <w:t>5.1-1 - Lucrari de constructii</w:t>
             </w:r>
           </w:p>
         </w:tc>
         <w:tc>
           <w:tcPr>
             <w:tcW w:type="dxa" w:w="850"/>
+            <w:shd w:fill="FFFF99" w:val="clear"/>
           </w:tcPr>
           <w:p>
             <w:r>
@@ -5439,13 +6665,13 @@
                 <w:b w:val="0"/>
                 <w:sz w:val="16"/>
               </w:rPr>
-              <w:t>FA14A1</w:t>
             </w:r>
           </w:p>
         </w:tc>
         <w:tc>
           <w:tcPr>
             <w:tcW w:type="dxa" w:w="1984"/>
+            <w:shd w:fill="FFFF99" w:val="clear"/>
           </w:tcPr>
           <w:p>
             <w:r>
@@ -5453,28 +6679,13 @@
                 <w:b w:val="0"/>
                 <w:sz w:val="16"/>
               </w:rPr>
-              <w:t>montaj vas de expansiune capacit 12 - 150 l con...</w:t>
             </w:r>
           </w:p>
         </w:tc>
         <w:tc>
           <w:tcPr>
             <w:tcW w:type="dxa" w:w="454"/>
-          </w:tcPr>
-          <w:p>
-            <w:r>
-              <w:rPr>
-                <w:b w:val="0"/>
-                <w:color w:val="CC0000"/>
-                <w:sz w:val="16"/>
-              </w:rPr>
-              <w:t>buc</w:t>
-            </w:r>
-          </w:p>
-        </w:tc>
-        <w:tc>
-          <w:tcPr>
-            <w:tcW w:type="dxa" w:w="680"/>
+            <w:shd w:fill="FFFF99" w:val="clear"/>
           </w:tcPr>
           <w:p>
             <w:r>
@@ -5482,13 +6693,13 @@
                 <w:b w:val="0"/>
                 <w:sz w:val="16"/>
               </w:rPr>
-              <w:t>2.0</w:t>
-            </w:r>
-          </w:p>
-        </w:tc>
-        <w:tc>
-          <w:tcPr>
-            <w:tcW w:type="dxa" w:w="850"/>
+            </w:r>
+          </w:p>
+        </w:tc>
+        <w:tc>
+          <w:tcPr>
+            <w:tcW w:type="dxa" w:w="680"/>
+            <w:shd w:fill="FFFF99" w:val="clear"/>
           </w:tcPr>
           <w:p>
             <w:r>
@@ -5496,13 +6707,13 @@
                 <w:b w:val="0"/>
                 <w:sz w:val="16"/>
               </w:rPr>
-              <w:t>FA14A1</w:t>
-            </w:r>
-          </w:p>
-        </w:tc>
-        <w:tc>
-          <w:tcPr>
-            <w:tcW w:type="dxa" w:w="1984"/>
+            </w:r>
+          </w:p>
+        </w:tc>
+        <w:tc>
+          <w:tcPr>
+            <w:tcW w:type="dxa" w:w="850"/>
+            <w:shd w:fill="FFFF99" w:val="clear"/>
           </w:tcPr>
           <w:p>
             <w:r>
@@ -5510,28 +6721,14 @@
                 <w:b w:val="0"/>
                 <w:sz w:val="16"/>
               </w:rPr>
-              <w:t>montaj vas de expansiune capacit 12 - buc proce...</w:t>
-            </w:r>
-          </w:p>
-        </w:tc>
-        <w:tc>
-          <w:tcPr>
-            <w:tcW w:type="dxa" w:w="454"/>
-          </w:tcPr>
-          <w:p>
-            <w:r>
-              <w:rPr>
-                <w:b w:val="0"/>
-                <w:color w:val="CC0000"/>
-                <w:sz w:val="16"/>
-              </w:rPr>
-              <w:t>ml</w:t>
-            </w:r>
-          </w:p>
-        </w:tc>
-        <w:tc>
-          <w:tcPr>
-            <w:tcW w:type="dxa" w:w="680"/>
+              <w:t>M2</w:t>
+            </w:r>
+          </w:p>
+        </w:tc>
+        <w:tc>
+          <w:tcPr>
+            <w:tcW w:type="dxa" w:w="1984"/>
+            <w:shd w:fill="FFFF99" w:val="clear"/>
           </w:tcPr>
           <w:p>
             <w:r>
@@ -5539,181 +6736,14 @@
                 <w:b w:val="0"/>
                 <w:sz w:val="16"/>
               </w:rPr>
-              <w:t>2.0</w:t>
-            </w:r>
-          </w:p>
-        </w:tc>
-        <w:tc>
-          <w:tcPr>
-            <w:tcW w:type="dxa" w:w="3572"/>
-          </w:tcPr>
-          <w:p>
-            <w:r>
-              <w:rPr>
-                <w:b w:val="0"/>
-                <w:color w:val="CC0000"/>
-                <w:sz w:val="16"/>
-              </w:rPr>
-              <w:t>Unitate de măsură diferită: referință buc, ofertat ml</w:t>
-            </w:r>
-          </w:p>
-        </w:tc>
-      </w:tr>
-      <w:tr>
-        <w:tc>
-          <w:tcPr>
-            <w:tcW w:type="dxa" w:w="397"/>
-          </w:tcPr>
-          <w:p/>
-        </w:tc>
-        <w:tc>
-          <w:tcPr>
-            <w:tcW w:type="dxa" w:w="1701"/>
-            <w:shd w:fill="D9D9D9" w:val="clear"/>
-          </w:tcPr>
-          <w:p>
-            <w:r>
-              <w:rPr>
-                <w:b/>
-                <w:color w:val="000000"/>
-                <w:sz w:val="18"/>
-              </w:rPr>
-              <w:t>SUMAR</w:t>
-            </w:r>
-          </w:p>
-        </w:tc>
-        <w:tc>
-          <w:tcPr>
-            <w:tcW w:type="dxa" w:w="850"/>
-            <w:shd w:fill="D9D9D9" w:val="clear"/>
-          </w:tcPr>
-          <w:p>
-            <w:r>
-              <w:rPr>
-                <w:b/>
-                <w:color w:val="000000"/>
-                <w:sz w:val="18"/>
-              </w:rPr>
-              <w:t>Neconformitati: 1 din 3 articole ref.</w:t>
-            </w:r>
-          </w:p>
-        </w:tc>
-        <w:tc>
-          <w:tcPr>
-            <w:tcW w:type="dxa" w:w="1984"/>
-            <w:shd w:fill="D9D9D9" w:val="clear"/>
-          </w:tcPr>
-          <w:p>
-            <w:r/>
+              <w:t>s475 dn 40 11/2 zn dataconstruct</w:t>
+            </w:r>
           </w:p>
         </w:tc>
         <w:tc>
           <w:tcPr>
             <w:tcW w:type="dxa" w:w="454"/>
-            <w:shd w:fill="D9D9D9" w:val="clear"/>
-          </w:tcPr>
-          <w:p>
-            <w:r/>
-          </w:p>
-        </w:tc>
-        <w:tc>
-          <w:tcPr>
-            <w:tcW w:type="dxa" w:w="680"/>
-            <w:shd w:fill="D9D9D9" w:val="clear"/>
-          </w:tcPr>
-          <w:p>
-            <w:r/>
-          </w:p>
-        </w:tc>
-        <w:tc>
-          <w:tcPr>
-            <w:tcW w:type="dxa" w:w="850"/>
-            <w:shd w:fill="D9D9D9" w:val="clear"/>
-          </w:tcPr>
-          <w:p>
-            <w:pPr>
-              <w:jc w:val="center"/>
-            </w:pPr>
-            <w:r>
-              <w:rPr>
-                <w:b/>
-                <w:color w:val="000000"/>
-                <w:sz w:val="18"/>
-              </w:rPr>
-              <w:t>3</w:t>
-            </w:r>
-          </w:p>
-        </w:tc>
-        <w:tc>
-          <w:tcPr>
-            <w:tcW w:type="dxa" w:w="1984"/>
-            <w:shd w:fill="D9D9D9" w:val="clear"/>
-          </w:tcPr>
-          <w:p>
-            <w:r/>
-          </w:p>
-        </w:tc>
-        <w:tc>
-          <w:tcPr>
-            <w:tcW w:type="dxa" w:w="454"/>
-            <w:shd w:fill="D9D9D9" w:val="clear"/>
-          </w:tcPr>
-          <w:p>
-            <w:r/>
-          </w:p>
-        </w:tc>
-        <w:tc>
-          <w:tcPr>
-            <w:tcW w:type="dxa" w:w="680"/>
-            <w:shd w:fill="D9D9D9" w:val="clear"/>
-          </w:tcPr>
-          <w:p>
-            <w:pPr>
-              <w:jc w:val="center"/>
-            </w:pPr>
-            <w:r>
-              <w:rPr>
-                <w:b/>
-                <w:color w:val="000000"/>
-                <w:sz w:val="18"/>
-              </w:rPr>
-              <w:t>3</w:t>
-            </w:r>
-          </w:p>
-        </w:tc>
-        <w:tc>
-          <w:tcPr>
-            <w:tcW w:type="dxa" w:w="3572"/>
-            <w:shd w:fill="D9D9D9" w:val="clear"/>
-          </w:tcPr>
-          <w:p>
-            <w:r/>
-          </w:p>
-        </w:tc>
-      </w:tr>
-      <w:tr>
-        <w:tc>
-          <w:tcPr>
-            <w:tcW w:type="dxa" w:w="3572"/>
-            <w:gridSpan w:val="11"/>
-            <w:shd w:fill="D9D9D9" w:val="clear"/>
-          </w:tcPr>
-          <w:p>
-            <w:r>
-              <w:rPr>
-                <w:b/>
-                <w:sz w:val="18"/>
-              </w:rPr>
-              <w:t>Capitol de lucrări 4.3-05 — Instalatii camin apometru  │  LIPSA: 1  │  EXTRA: 0  │  Delta: -1</w:t>
-            </w:r>
-          </w:p>
-        </w:tc>
-      </w:tr>
-      <w:tr>
-        <w:tc>
-          <w:tcPr>
-            <w:tcW w:type="dxa" w:w="397"/>
-            <w:shd w:fill="FFB3B3" w:val="clear"/>
+            <w:shd w:fill="FFFF99" w:val="clear"/>
           </w:tcPr>
           <w:p>
             <w:r>
@@ -5721,14 +6751,14 @@
                 <w:b w:val="0"/>
                 <w:sz w:val="16"/>
               </w:rPr>
-              <w:t>36</w:t>
-            </w:r>
-          </w:p>
-        </w:tc>
-        <w:tc>
-          <w:tcPr>
-            <w:tcW w:type="dxa" w:w="1701"/>
-            <w:shd w:fill="FFB3B3" w:val="clear"/>
+              <w:t>buc</w:t>
+            </w:r>
+          </w:p>
+        </w:tc>
+        <w:tc>
+          <w:tcPr>
+            <w:tcW w:type="dxa" w:w="680"/>
+            <w:shd w:fill="FFFF99" w:val="clear"/>
           </w:tcPr>
           <w:p>
             <w:r>
@@ -5736,1369 +6766,7 @@
                 <w:b w:val="0"/>
                 <w:sz w:val="16"/>
               </w:rPr>
-              <w:t>4.3-05 - Instalatii camin apometru</w:t>
-            </w:r>
-          </w:p>
-        </w:tc>
-        <w:tc>
-          <w:tcPr>
-            <w:tcW w:type="dxa" w:w="850"/>
-            <w:shd w:fill="FFB3B3" w:val="clear"/>
-          </w:tcPr>
-          <w:p>
-            <w:r>
-              <w:rPr>
-                <w:b w:val="0"/>
-                <w:sz w:val="16"/>
-              </w:rPr>
-              <w:t>TRB05A24</w:t>
-            </w:r>
-          </w:p>
-        </w:tc>
-        <w:tc>
-          <w:tcPr>
-            <w:tcW w:type="dxa" w:w="1984"/>
-            <w:shd w:fill="FFB3B3" w:val="clear"/>
-          </w:tcPr>
-          <w:p>
-            <w:r>
-              <w:rPr>
-                <w:b w:val="0"/>
-                <w:sz w:val="16"/>
-              </w:rPr>
-              <w:t>transportul materialelor prin purtat direct mat...</w:t>
-            </w:r>
-          </w:p>
-        </w:tc>
-        <w:tc>
-          <w:tcPr>
-            <w:tcW w:type="dxa" w:w="454"/>
-            <w:shd w:fill="FFB3B3" w:val="clear"/>
-          </w:tcPr>
-          <w:p>
-            <w:r>
-              <w:rPr>
-                <w:b w:val="0"/>
-                <w:sz w:val="16"/>
-              </w:rPr>
-              <w:t>tona</w:t>
-            </w:r>
-          </w:p>
-        </w:tc>
-        <w:tc>
-          <w:tcPr>
-            <w:tcW w:type="dxa" w:w="680"/>
-            <w:shd w:fill="FFB3B3" w:val="clear"/>
-          </w:tcPr>
-          <w:p>
-            <w:r>
-              <w:rPr>
-                <w:b w:val="0"/>
-                <w:sz w:val="16"/>
-              </w:rPr>
-              <w:t>0.3</w:t>
-            </w:r>
-          </w:p>
-        </w:tc>
-        <w:tc>
-          <w:tcPr>
-            <w:tcW w:type="dxa" w:w="850"/>
-            <w:shd w:fill="FFB3B3" w:val="clear"/>
-          </w:tcPr>
-          <w:p/>
-        </w:tc>
-        <w:tc>
-          <w:tcPr>
-            <w:tcW w:type="dxa" w:w="1984"/>
-            <w:shd w:fill="FFB3B3" w:val="clear"/>
-          </w:tcPr>
-          <w:p/>
-        </w:tc>
-        <w:tc>
-          <w:tcPr>
-            <w:tcW w:type="dxa" w:w="454"/>
-            <w:shd w:fill="FFB3B3" w:val="clear"/>
-          </w:tcPr>
-          <w:p/>
-        </w:tc>
-        <w:tc>
-          <w:tcPr>
-            <w:tcW w:type="dxa" w:w="680"/>
-            <w:shd w:fill="FFB3B3" w:val="clear"/>
-          </w:tcPr>
-          <w:p/>
-        </w:tc>
-        <w:tc>
-          <w:tcPr>
-            <w:tcW w:type="dxa" w:w="3572"/>
-            <w:shd w:fill="FFB3B3" w:val="clear"/>
-          </w:tcPr>
-          <w:p>
-            <w:r>
-              <w:rPr>
-                <w:b w:val="0"/>
-                <w:color w:val="CC0000"/>
-                <w:sz w:val="16"/>
-              </w:rPr>
-              <w:t>Articol lipsă din ofertă</w:t>
-            </w:r>
-          </w:p>
-        </w:tc>
-      </w:tr>
-      <w:tr>
-        <w:tc>
-          <w:tcPr>
-            <w:tcW w:type="dxa" w:w="397"/>
-          </w:tcPr>
-          <w:p/>
-        </w:tc>
-        <w:tc>
-          <w:tcPr>
-            <w:tcW w:type="dxa" w:w="1701"/>
-            <w:shd w:fill="D9D9D9" w:val="clear"/>
-          </w:tcPr>
-          <w:p>
-            <w:r>
-              <w:rPr>
-                <w:b/>
-                <w:color w:val="000000"/>
-                <w:sz w:val="18"/>
-              </w:rPr>
-              <w:t>SUMAR</w:t>
-            </w:r>
-          </w:p>
-        </w:tc>
-        <w:tc>
-          <w:tcPr>
-            <w:tcW w:type="dxa" w:w="850"/>
-            <w:shd w:fill="D9D9D9" w:val="clear"/>
-          </w:tcPr>
-          <w:p>
-            <w:r>
-              <w:rPr>
-                <w:b/>
-                <w:color w:val="000000"/>
-                <w:sz w:val="18"/>
-              </w:rPr>
-              <w:t>Neconformitati: 1 din 13 articole ref.</w:t>
-            </w:r>
-          </w:p>
-        </w:tc>
-        <w:tc>
-          <w:tcPr>
-            <w:tcW w:type="dxa" w:w="1984"/>
-            <w:shd w:fill="D9D9D9" w:val="clear"/>
-          </w:tcPr>
-          <w:p>
-            <w:r/>
-          </w:p>
-        </w:tc>
-        <w:tc>
-          <w:tcPr>
-            <w:tcW w:type="dxa" w:w="454"/>
-            <w:shd w:fill="D9D9D9" w:val="clear"/>
-          </w:tcPr>
-          <w:p>
-            <w:r/>
-          </w:p>
-        </w:tc>
-        <w:tc>
-          <w:tcPr>
-            <w:tcW w:type="dxa" w:w="680"/>
-            <w:shd w:fill="D9D9D9" w:val="clear"/>
-          </w:tcPr>
-          <w:p>
-            <w:r/>
-          </w:p>
-        </w:tc>
-        <w:tc>
-          <w:tcPr>
-            <w:tcW w:type="dxa" w:w="850"/>
-            <w:shd w:fill="D9D9D9" w:val="clear"/>
-          </w:tcPr>
-          <w:p>
-            <w:pPr>
-              <w:jc w:val="center"/>
-            </w:pPr>
-            <w:r>
-              <w:rPr>
-                <w:b/>
-                <w:color w:val="000000"/>
-                <w:sz w:val="18"/>
-              </w:rPr>
-              <w:t>13</w:t>
-            </w:r>
-          </w:p>
-        </w:tc>
-        <w:tc>
-          <w:tcPr>
-            <w:tcW w:type="dxa" w:w="1984"/>
-            <w:shd w:fill="D9D9D9" w:val="clear"/>
-          </w:tcPr>
-          <w:p>
-            <w:r/>
-          </w:p>
-        </w:tc>
-        <w:tc>
-          <w:tcPr>
-            <w:tcW w:type="dxa" w:w="454"/>
-            <w:shd w:fill="D9D9D9" w:val="clear"/>
-          </w:tcPr>
-          <w:p>
-            <w:r/>
-          </w:p>
-        </w:tc>
-        <w:tc>
-          <w:tcPr>
-            <w:tcW w:type="dxa" w:w="680"/>
-            <w:shd w:fill="D9D9D9" w:val="clear"/>
-          </w:tcPr>
-          <w:p>
-            <w:pPr>
-              <w:jc w:val="center"/>
-            </w:pPr>
-            <w:r>
-              <w:rPr>
-                <w:b/>
-                <w:color w:val="000000"/>
-                <w:sz w:val="18"/>
-              </w:rPr>
-              <w:t>11</w:t>
-            </w:r>
-          </w:p>
-        </w:tc>
-        <w:tc>
-          <w:tcPr>
-            <w:tcW w:type="dxa" w:w="3572"/>
-            <w:shd w:fill="D9D9D9" w:val="clear"/>
-          </w:tcPr>
-          <w:p>
-            <w:r/>
-          </w:p>
-        </w:tc>
-      </w:tr>
-      <w:tr>
-        <w:tc>
-          <w:tcPr>
-            <w:tcW w:type="dxa" w:w="3572"/>
-            <w:gridSpan w:val="11"/>
-            <w:shd w:fill="D9D9D9" w:val="clear"/>
-          </w:tcPr>
-          <w:p>
-            <w:r>
-              <w:rPr>
-                <w:b/>
-                <w:sz w:val="18"/>
-              </w:rPr>
-              <w:t>Capitol de lucrări 4.3-06 — Inst sanitare GospApa  │  LIPSA: 1  │  EXTRA: 0  │  Delta: -1</w:t>
-            </w:r>
-          </w:p>
-        </w:tc>
-      </w:tr>
-      <w:tr>
-        <w:tc>
-          <w:tcPr>
-            <w:tcW w:type="dxa" w:w="397"/>
-          </w:tcPr>
-          <w:p>
-            <w:r>
-              <w:rPr>
-                <w:b w:val="0"/>
-                <w:sz w:val="16"/>
-              </w:rPr>
-              <w:t>38</w:t>
-            </w:r>
-          </w:p>
-        </w:tc>
-        <w:tc>
-          <w:tcPr>
-            <w:tcW w:type="dxa" w:w="1701"/>
-          </w:tcPr>
-          <w:p>
-            <w:r>
-              <w:rPr>
-                <w:b w:val="0"/>
-                <w:sz w:val="16"/>
-              </w:rPr>
-              <w:t>4.3-06 - Inst sanitare GospApa</w:t>
-            </w:r>
-          </w:p>
-        </w:tc>
-        <w:tc>
-          <w:tcPr>
-            <w:tcW w:type="dxa" w:w="850"/>
-          </w:tcPr>
-          <w:p>
-            <w:r>
-              <w:rPr>
-                <w:b w:val="0"/>
-                <w:sz w:val="16"/>
-              </w:rPr>
-              <w:t>SD18A1</w:t>
-            </w:r>
-          </w:p>
-        </w:tc>
-        <w:tc>
-          <w:tcPr>
-            <w:tcW w:type="dxa" w:w="1984"/>
-          </w:tcPr>
-          <w:p>
-            <w:r>
-              <w:rPr>
-                <w:b w:val="0"/>
-                <w:sz w:val="16"/>
-              </w:rPr>
-              <w:t>robinet de golire 25 mm l: 11411 -m : 8813001 -...</w:t>
-            </w:r>
-          </w:p>
-        </w:tc>
-        <w:tc>
-          <w:tcPr>
-            <w:tcW w:type="dxa" w:w="454"/>
-          </w:tcPr>
-          <w:p>
-            <w:r>
-              <w:rPr>
-                <w:b w:val="0"/>
-                <w:sz w:val="16"/>
-              </w:rPr>
-              <w:t>buc</w:t>
-            </w:r>
-          </w:p>
-        </w:tc>
-        <w:tc>
-          <w:tcPr>
-            <w:tcW w:type="dxa" w:w="680"/>
-          </w:tcPr>
-          <w:p>
-            <w:r>
-              <w:rPr>
-                <w:b w:val="0"/>
-                <w:color w:val="CC0000"/>
-                <w:sz w:val="16"/>
-              </w:rPr>
-              <w:t>1.0</w:t>
-            </w:r>
-          </w:p>
-        </w:tc>
-        <w:tc>
-          <w:tcPr>
-            <w:tcW w:type="dxa" w:w="850"/>
-          </w:tcPr>
-          <w:p>
-            <w:r>
-              <w:rPr>
-                <w:b w:val="0"/>
-                <w:sz w:val="16"/>
-              </w:rPr>
-              <w:t>SD18A1</w:t>
-            </w:r>
-          </w:p>
-        </w:tc>
-        <w:tc>
-          <w:tcPr>
-            <w:tcW w:type="dxa" w:w="1984"/>
-          </w:tcPr>
-          <w:p>
-            <w:r>
-              <w:rPr>
-                <w:b w:val="0"/>
-                <w:sz w:val="16"/>
-              </w:rPr>
-              <w:t>robinet cu plutitor dn 3/4'</w:t>
-            </w:r>
-          </w:p>
-        </w:tc>
-        <w:tc>
-          <w:tcPr>
-            <w:tcW w:type="dxa" w:w="454"/>
-          </w:tcPr>
-          <w:p>
-            <w:r>
-              <w:rPr>
-                <w:b w:val="0"/>
-                <w:sz w:val="16"/>
-              </w:rPr>
-              <w:t>buc</w:t>
-            </w:r>
-          </w:p>
-        </w:tc>
-        <w:tc>
-          <w:tcPr>
-            <w:tcW w:type="dxa" w:w="680"/>
-          </w:tcPr>
-          <w:p>
-            <w:r>
-              <w:rPr>
-                <w:b w:val="0"/>
-                <w:color w:val="CC0000"/>
-                <w:sz w:val="16"/>
-              </w:rPr>
-              <w:t>3.0</w:t>
-            </w:r>
-          </w:p>
-        </w:tc>
-        <w:tc>
-          <w:tcPr>
-            <w:tcW w:type="dxa" w:w="3572"/>
-          </w:tcPr>
-          <w:p>
-            <w:r>
-              <w:rPr>
-                <w:b w:val="0"/>
-                <w:color w:val="CC0000"/>
-                <w:sz w:val="16"/>
-              </w:rPr>
-              <w:t>Cantitate diferită: referință 1.0 buc, ofertat 3.0 buc</w:t>
-            </w:r>
-          </w:p>
-        </w:tc>
-      </w:tr>
-      <w:tr>
-        <w:tc>
-          <w:tcPr>
-            <w:tcW w:type="dxa" w:w="397"/>
-            <w:shd w:fill="FFB3B3" w:val="clear"/>
-          </w:tcPr>
-          <w:p>
-            <w:r>
-              <w:rPr>
-                <w:b w:val="0"/>
-                <w:sz w:val="16"/>
-              </w:rPr>
-              <w:t>39</w:t>
-            </w:r>
-          </w:p>
-        </w:tc>
-        <w:tc>
-          <w:tcPr>
-            <w:tcW w:type="dxa" w:w="1701"/>
-            <w:shd w:fill="FFB3B3" w:val="clear"/>
-          </w:tcPr>
-          <w:p>
-            <w:r>
-              <w:rPr>
-                <w:b w:val="0"/>
-                <w:sz w:val="16"/>
-              </w:rPr>
-              <w:t>4.3-06 - Inst sanitare GospApa</w:t>
-            </w:r>
-          </w:p>
-        </w:tc>
-        <w:tc>
-          <w:tcPr>
-            <w:tcW w:type="dxa" w:w="850"/>
-            <w:shd w:fill="FFB3B3" w:val="clear"/>
-          </w:tcPr>
-          <w:p>
-            <w:r>
-              <w:rPr>
-                <w:b w:val="0"/>
-                <w:sz w:val="16"/>
-              </w:rPr>
-              <w:t>SD18A1</w:t>
-            </w:r>
-          </w:p>
-        </w:tc>
-        <w:tc>
-          <w:tcPr>
-            <w:tcW w:type="dxa" w:w="1984"/>
-            <w:shd w:fill="FFB3B3" w:val="clear"/>
-          </w:tcPr>
-          <w:p>
-            <w:r>
-              <w:rPr>
-                <w:b w:val="0"/>
-                <w:sz w:val="16"/>
-              </w:rPr>
-              <w:t>robinet cu plutitor dn %%' l: 11411 -0130: 4201...</w:t>
-            </w:r>
-          </w:p>
-        </w:tc>
-        <w:tc>
-          <w:tcPr>
-            <w:tcW w:type="dxa" w:w="454"/>
-            <w:shd w:fill="FFB3B3" w:val="clear"/>
-          </w:tcPr>
-          <w:p>
-            <w:r>
-              <w:rPr>
-                <w:b w:val="0"/>
-                <w:sz w:val="16"/>
-              </w:rPr>
-              <w:t>buc</w:t>
-            </w:r>
-          </w:p>
-        </w:tc>
-        <w:tc>
-          <w:tcPr>
-            <w:tcW w:type="dxa" w:w="680"/>
-            <w:shd w:fill="FFB3B3" w:val="clear"/>
-          </w:tcPr>
-          <w:p>
-            <w:r>
-              <w:rPr>
-                <w:b w:val="0"/>
-                <w:sz w:val="16"/>
-              </w:rPr>
-              <w:t>3.0</w:t>
-            </w:r>
-          </w:p>
-        </w:tc>
-        <w:tc>
-          <w:tcPr>
-            <w:tcW w:type="dxa" w:w="850"/>
-            <w:shd w:fill="FFB3B3" w:val="clear"/>
-          </w:tcPr>
-          <w:p/>
-        </w:tc>
-        <w:tc>
-          <w:tcPr>
-            <w:tcW w:type="dxa" w:w="1984"/>
-            <w:shd w:fill="FFB3B3" w:val="clear"/>
-          </w:tcPr>
-          <w:p/>
-        </w:tc>
-        <w:tc>
-          <w:tcPr>
-            <w:tcW w:type="dxa" w:w="454"/>
-            <w:shd w:fill="FFB3B3" w:val="clear"/>
-          </w:tcPr>
-          <w:p/>
-        </w:tc>
-        <w:tc>
-          <w:tcPr>
-            <w:tcW w:type="dxa" w:w="680"/>
-            <w:shd w:fill="FFB3B3" w:val="clear"/>
-          </w:tcPr>
-          <w:p/>
-        </w:tc>
-        <w:tc>
-          <w:tcPr>
-            <w:tcW w:type="dxa" w:w="3572"/>
-            <w:shd w:fill="FFB3B3" w:val="clear"/>
-          </w:tcPr>
-          <w:p>
-            <w:r>
-              <w:rPr>
-                <w:b w:val="0"/>
-                <w:color w:val="CC0000"/>
-                <w:sz w:val="16"/>
-              </w:rPr>
-              <w:t>Articol lipsă din ofertă</w:t>
-            </w:r>
-          </w:p>
-        </w:tc>
-      </w:tr>
-      <w:tr>
-        <w:tc>
-          <w:tcPr>
-            <w:tcW w:type="dxa" w:w="397"/>
-          </w:tcPr>
-          <w:p/>
-        </w:tc>
-        <w:tc>
-          <w:tcPr>
-            <w:tcW w:type="dxa" w:w="1701"/>
-            <w:shd w:fill="D9D9D9" w:val="clear"/>
-          </w:tcPr>
-          <w:p>
-            <w:r>
-              <w:rPr>
-                <w:b/>
-                <w:color w:val="000000"/>
-                <w:sz w:val="18"/>
-              </w:rPr>
-              <w:t>SUMAR</w:t>
-            </w:r>
-          </w:p>
-        </w:tc>
-        <w:tc>
-          <w:tcPr>
-            <w:tcW w:type="dxa" w:w="850"/>
-            <w:shd w:fill="D9D9D9" w:val="clear"/>
-          </w:tcPr>
-          <w:p>
-            <w:r>
-              <w:rPr>
-                <w:b/>
-                <w:color w:val="000000"/>
-                <w:sz w:val="18"/>
-              </w:rPr>
-              <w:t>Neconformitati: 1 din 43 articole ref.</w:t>
-            </w:r>
-          </w:p>
-        </w:tc>
-        <w:tc>
-          <w:tcPr>
-            <w:tcW w:type="dxa" w:w="1984"/>
-            <w:shd w:fill="D9D9D9" w:val="clear"/>
-          </w:tcPr>
-          <w:p>
-            <w:r/>
-          </w:p>
-        </w:tc>
-        <w:tc>
-          <w:tcPr>
-            <w:tcW w:type="dxa" w:w="454"/>
-            <w:shd w:fill="D9D9D9" w:val="clear"/>
-          </w:tcPr>
-          <w:p>
-            <w:r/>
-          </w:p>
-        </w:tc>
-        <w:tc>
-          <w:tcPr>
-            <w:tcW w:type="dxa" w:w="680"/>
-            <w:shd w:fill="D9D9D9" w:val="clear"/>
-          </w:tcPr>
-          <w:p>
-            <w:r/>
-          </w:p>
-        </w:tc>
-        <w:tc>
-          <w:tcPr>
-            <w:tcW w:type="dxa" w:w="850"/>
-            <w:shd w:fill="D9D9D9" w:val="clear"/>
-          </w:tcPr>
-          <w:p>
-            <w:pPr>
-              <w:jc w:val="center"/>
-            </w:pPr>
-            <w:r>
-              <w:rPr>
-                <w:b/>
-                <w:color w:val="000000"/>
-                <w:sz w:val="18"/>
-              </w:rPr>
-              <w:t>43</w:t>
-            </w:r>
-          </w:p>
-        </w:tc>
-        <w:tc>
-          <w:tcPr>
-            <w:tcW w:type="dxa" w:w="1984"/>
-            <w:shd w:fill="D9D9D9" w:val="clear"/>
-          </w:tcPr>
-          <w:p>
-            <w:r/>
-          </w:p>
-        </w:tc>
-        <w:tc>
-          <w:tcPr>
-            <w:tcW w:type="dxa" w:w="454"/>
-            <w:shd w:fill="D9D9D9" w:val="clear"/>
-          </w:tcPr>
-          <w:p>
-            <w:r/>
-          </w:p>
-        </w:tc>
-        <w:tc>
-          <w:tcPr>
-            <w:tcW w:type="dxa" w:w="680"/>
-            <w:shd w:fill="D9D9D9" w:val="clear"/>
-          </w:tcPr>
-          <w:p>
-            <w:pPr>
-              <w:jc w:val="center"/>
-            </w:pPr>
-            <w:r>
-              <w:rPr>
-                <w:b/>
-                <w:color w:val="000000"/>
-                <w:sz w:val="18"/>
-              </w:rPr>
-              <w:t>40</w:t>
-            </w:r>
-          </w:p>
-        </w:tc>
-        <w:tc>
-          <w:tcPr>
-            <w:tcW w:type="dxa" w:w="3572"/>
-            <w:shd w:fill="D9D9D9" w:val="clear"/>
-          </w:tcPr>
-          <w:p>
-            <w:r/>
-          </w:p>
-        </w:tc>
-      </w:tr>
-      <w:tr>
-        <w:tc>
-          <w:tcPr>
-            <w:tcW w:type="dxa" w:w="3572"/>
-            <w:gridSpan w:val="11"/>
-            <w:shd w:fill="D9D9D9" w:val="clear"/>
-          </w:tcPr>
-          <w:p>
-            <w:r>
-              <w:rPr>
-                <w:b/>
-                <w:sz w:val="18"/>
-              </w:rPr>
-              <w:t>Capitol de lucrări 4.2-2 — Structura  │  LIPSA: 0  │  EXTRA: 1  │  Delta: +1</w:t>
-            </w:r>
-          </w:p>
-        </w:tc>
-      </w:tr>
-      <w:tr>
-        <w:tc>
-          <w:tcPr>
-            <w:tcW w:type="dxa" w:w="3572"/>
-            <w:gridSpan w:val="11"/>
-            <w:shd w:fill="FFFF99" w:val="clear"/>
-          </w:tcPr>
-          <w:p>
-            <w:r>
-              <w:rPr>
-                <w:b w:val="0"/>
-                <w:i/>
-                <w:sz w:val="16"/>
-              </w:rPr>
-              <w:t>▸ Articole extra în ofertă — verificare manuală recomandată</w:t>
-            </w:r>
-          </w:p>
-        </w:tc>
-      </w:tr>
-      <w:tr>
-        <w:tc>
-          <w:tcPr>
-            <w:tcW w:type="dxa" w:w="397"/>
-            <w:shd w:fill="FFFF99" w:val="clear"/>
-          </w:tcPr>
-          <w:p>
-            <w:r>
-              <w:rPr>
-                <w:b w:val="0"/>
-                <w:sz w:val="16"/>
-              </w:rPr>
-              <w:t>41</w:t>
-            </w:r>
-          </w:p>
-        </w:tc>
-        <w:tc>
-          <w:tcPr>
-            <w:tcW w:type="dxa" w:w="1701"/>
-            <w:shd w:fill="FFFF99" w:val="clear"/>
-          </w:tcPr>
-          <w:p>
-            <w:r>
-              <w:rPr>
-                <w:b w:val="0"/>
-                <w:sz w:val="16"/>
-              </w:rPr>
-              <w:t>4.2-2 - Structura</w:t>
-            </w:r>
-          </w:p>
-        </w:tc>
-        <w:tc>
-          <w:tcPr>
-            <w:tcW w:type="dxa" w:w="850"/>
-            <w:shd w:fill="FFFF99" w:val="clear"/>
-          </w:tcPr>
-          <w:p>
-            <w:r>
-              <w:rPr>
-                <w:b w:val="0"/>
-                <w:sz w:val="16"/>
-              </w:rPr>
-            </w:r>
-          </w:p>
-        </w:tc>
-        <w:tc>
-          <w:tcPr>
-            <w:tcW w:type="dxa" w:w="1984"/>
-            <w:shd w:fill="FFFF99" w:val="clear"/>
-          </w:tcPr>
-          <w:p>
-            <w:r>
-              <w:rPr>
-                <w:b w:val="0"/>
-                <w:sz w:val="16"/>
-              </w:rPr>
-            </w:r>
-          </w:p>
-        </w:tc>
-        <w:tc>
-          <w:tcPr>
-            <w:tcW w:type="dxa" w:w="454"/>
-            <w:shd w:fill="FFFF99" w:val="clear"/>
-          </w:tcPr>
-          <w:p>
-            <w:r>
-              <w:rPr>
-                <w:b w:val="0"/>
-                <w:sz w:val="16"/>
-              </w:rPr>
-            </w:r>
-          </w:p>
-        </w:tc>
-        <w:tc>
-          <w:tcPr>
-            <w:tcW w:type="dxa" w:w="680"/>
-            <w:shd w:fill="FFFF99" w:val="clear"/>
-          </w:tcPr>
-          <w:p>
-            <w:r>
-              <w:rPr>
-                <w:b w:val="0"/>
-                <w:sz w:val="16"/>
-              </w:rPr>
-            </w:r>
-          </w:p>
-        </w:tc>
-        <w:tc>
-          <w:tcPr>
-            <w:tcW w:type="dxa" w:w="850"/>
-            <w:shd w:fill="FFFF99" w:val="clear"/>
-          </w:tcPr>
-          <w:p>
-            <w:r>
-              <w:rPr>
-                <w:b w:val="0"/>
-                <w:sz w:val="16"/>
-              </w:rPr>
-              <w:t>RPCB02E</w:t>
-            </w:r>
-          </w:p>
-        </w:tc>
-        <w:tc>
-          <w:tcPr>
-            <w:tcW w:type="dxa" w:w="1984"/>
-            <w:shd w:fill="FFFF99" w:val="clear"/>
-          </w:tcPr>
-          <w:p>
-            <w:r>
-              <w:rPr>
-                <w:b w:val="0"/>
-                <w:sz w:val="16"/>
-              </w:rPr>
-              <w:t>beton c12/15 egalizare</w:t>
-            </w:r>
-          </w:p>
-        </w:tc>
-        <w:tc>
-          <w:tcPr>
-            <w:tcW w:type="dxa" w:w="454"/>
-            <w:shd w:fill="FFFF99" w:val="clear"/>
-          </w:tcPr>
-          <w:p>
-            <w:r>
-              <w:rPr>
-                <w:b w:val="0"/>
-                <w:sz w:val="16"/>
-              </w:rPr>
-              <w:t>mc</w:t>
-            </w:r>
-          </w:p>
-        </w:tc>
-        <w:tc>
-          <w:tcPr>
-            <w:tcW w:type="dxa" w:w="680"/>
-            <w:shd w:fill="FFFF99" w:val="clear"/>
-          </w:tcPr>
-          <w:p>
-            <w:r>
-              <w:rPr>
-                <w:b w:val="0"/>
-                <w:sz w:val="16"/>
-              </w:rPr>
-              <w:t>2.17</w:t>
-            </w:r>
-          </w:p>
-        </w:tc>
-        <w:tc>
-          <w:tcPr>
-            <w:tcW w:type="dxa" w:w="3572"/>
-            <w:shd w:fill="FFFF99" w:val="clear"/>
-          </w:tcPr>
-          <w:p>
-            <w:r>
-              <w:rPr>
-                <w:b w:val="0"/>
-                <w:color w:val="CC0000"/>
-                <w:sz w:val="16"/>
-              </w:rPr>
-              <w:t>Articol suplimentar în ofertă (nu există în referință)</w:t>
-            </w:r>
-          </w:p>
-        </w:tc>
-      </w:tr>
-      <w:tr>
-        <w:tc>
-          <w:tcPr>
-            <w:tcW w:type="dxa" w:w="397"/>
-          </w:tcPr>
-          <w:p/>
-        </w:tc>
-        <w:tc>
-          <w:tcPr>
-            <w:tcW w:type="dxa" w:w="1701"/>
-            <w:shd w:fill="D9D9D9" w:val="clear"/>
-          </w:tcPr>
-          <w:p>
-            <w:r>
-              <w:rPr>
-                <w:b/>
-                <w:color w:val="000000"/>
-                <w:sz w:val="18"/>
-              </w:rPr>
-              <w:t>SUMAR</w:t>
-            </w:r>
-          </w:p>
-        </w:tc>
-        <w:tc>
-          <w:tcPr>
-            <w:tcW w:type="dxa" w:w="850"/>
-            <w:shd w:fill="D9D9D9" w:val="clear"/>
-          </w:tcPr>
-          <w:p>
-            <w:r>
-              <w:rPr>
-                <w:b/>
-                <w:color w:val="000000"/>
-                <w:sz w:val="18"/>
-              </w:rPr>
-              <w:t>Neconformitati: 1 din 14 articole ref.</w:t>
-            </w:r>
-          </w:p>
-        </w:tc>
-        <w:tc>
-          <w:tcPr>
-            <w:tcW w:type="dxa" w:w="1984"/>
-            <w:shd w:fill="D9D9D9" w:val="clear"/>
-          </w:tcPr>
-          <w:p>
-            <w:r/>
-          </w:p>
-        </w:tc>
-        <w:tc>
-          <w:tcPr>
-            <w:tcW w:type="dxa" w:w="454"/>
-            <w:shd w:fill="D9D9D9" w:val="clear"/>
-          </w:tcPr>
-          <w:p>
-            <w:r/>
-          </w:p>
-        </w:tc>
-        <w:tc>
-          <w:tcPr>
-            <w:tcW w:type="dxa" w:w="680"/>
-            <w:shd w:fill="D9D9D9" w:val="clear"/>
-          </w:tcPr>
-          <w:p>
-            <w:r/>
-          </w:p>
-        </w:tc>
-        <w:tc>
-          <w:tcPr>
-            <w:tcW w:type="dxa" w:w="850"/>
-            <w:shd w:fill="D9D9D9" w:val="clear"/>
-          </w:tcPr>
-          <w:p>
-            <w:pPr>
-              <w:jc w:val="center"/>
-            </w:pPr>
-            <w:r>
-              <w:rPr>
-                <w:b/>
-                <w:color w:val="000000"/>
-                <w:sz w:val="18"/>
-              </w:rPr>
-              <w:t>14</w:t>
-            </w:r>
-          </w:p>
-        </w:tc>
-        <w:tc>
-          <w:tcPr>
-            <w:tcW w:type="dxa" w:w="1984"/>
-            <w:shd w:fill="D9D9D9" w:val="clear"/>
-          </w:tcPr>
-          <w:p>
-            <w:r/>
-          </w:p>
-        </w:tc>
-        <w:tc>
-          <w:tcPr>
-            <w:tcW w:type="dxa" w:w="454"/>
-            <w:shd w:fill="D9D9D9" w:val="clear"/>
-          </w:tcPr>
-          <w:p>
-            <w:r/>
-          </w:p>
-        </w:tc>
-        <w:tc>
-          <w:tcPr>
-            <w:tcW w:type="dxa" w:w="680"/>
-            <w:shd w:fill="D9D9D9" w:val="clear"/>
-          </w:tcPr>
-          <w:p>
-            <w:pPr>
-              <w:jc w:val="center"/>
-            </w:pPr>
-            <w:r>
-              <w:rPr>
-                <w:b/>
-                <w:color w:val="000000"/>
-                <w:sz w:val="18"/>
-              </w:rPr>
-              <w:t>12</w:t>
-            </w:r>
-          </w:p>
-        </w:tc>
-        <w:tc>
-          <w:tcPr>
-            <w:tcW w:type="dxa" w:w="3572"/>
-            <w:shd w:fill="D9D9D9" w:val="clear"/>
-          </w:tcPr>
-          <w:p>
-            <w:r/>
-          </w:p>
-        </w:tc>
-      </w:tr>
-      <w:tr>
-        <w:tc>
-          <w:tcPr>
-            <w:tcW w:type="dxa" w:w="3572"/>
-            <w:gridSpan w:val="11"/>
-            <w:shd w:fill="D9D9D9" w:val="clear"/>
-          </w:tcPr>
-          <w:p>
-            <w:r>
-              <w:rPr>
-                <w:b/>
-                <w:sz w:val="18"/>
-              </w:rPr>
-              <w:t>Capitol de lucrări 5.1-1 — Lucrari de constructii  │  LIPSA: 0  │  EXTRA: 2  │  Delta: +2</w:t>
-            </w:r>
-          </w:p>
-        </w:tc>
-      </w:tr>
-      <w:tr>
-        <w:tc>
-          <w:tcPr>
-            <w:tcW w:type="dxa" w:w="3572"/>
-            <w:gridSpan w:val="11"/>
-            <w:shd w:fill="FFFF99" w:val="clear"/>
-          </w:tcPr>
-          <w:p>
-            <w:r>
-              <w:rPr>
-                <w:b w:val="0"/>
-                <w:i/>
-                <w:sz w:val="16"/>
-              </w:rPr>
-              <w:t>▸ Articole extra în ofertă — verificare manuală recomandată</w:t>
-            </w:r>
-          </w:p>
-        </w:tc>
-      </w:tr>
-      <w:tr>
-        <w:tc>
-          <w:tcPr>
-            <w:tcW w:type="dxa" w:w="397"/>
-            <w:shd w:fill="FFFF99" w:val="clear"/>
-          </w:tcPr>
-          <w:p>
-            <w:r>
-              <w:rPr>
-                <w:b w:val="0"/>
-                <w:sz w:val="16"/>
-              </w:rPr>
-              <w:t>43</w:t>
-            </w:r>
-          </w:p>
-        </w:tc>
-        <w:tc>
-          <w:tcPr>
-            <w:tcW w:type="dxa" w:w="1701"/>
-            <w:shd w:fill="FFFF99" w:val="clear"/>
-          </w:tcPr>
-          <w:p>
-            <w:r>
-              <w:rPr>
-                <w:b w:val="0"/>
-                <w:sz w:val="16"/>
-              </w:rPr>
-              <w:t>5.1-1 - Lucrari de constructii</w:t>
-            </w:r>
-          </w:p>
-        </w:tc>
-        <w:tc>
-          <w:tcPr>
-            <w:tcW w:type="dxa" w:w="850"/>
-            <w:shd w:fill="FFFF99" w:val="clear"/>
-          </w:tcPr>
-          <w:p>
-            <w:r>
-              <w:rPr>
-                <w:b w:val="0"/>
-                <w:sz w:val="16"/>
-              </w:rPr>
-            </w:r>
-          </w:p>
-        </w:tc>
-        <w:tc>
-          <w:tcPr>
-            <w:tcW w:type="dxa" w:w="1984"/>
-            <w:shd w:fill="FFFF99" w:val="clear"/>
-          </w:tcPr>
-          <w:p>
-            <w:r>
-              <w:rPr>
-                <w:b w:val="0"/>
-                <w:sz w:val="16"/>
-              </w:rPr>
-            </w:r>
-          </w:p>
-        </w:tc>
-        <w:tc>
-          <w:tcPr>
-            <w:tcW w:type="dxa" w:w="454"/>
-            <w:shd w:fill="FFFF99" w:val="clear"/>
-          </w:tcPr>
-          <w:p>
-            <w:r>
-              <w:rPr>
-                <w:b w:val="0"/>
-                <w:sz w:val="16"/>
-              </w:rPr>
-            </w:r>
-          </w:p>
-        </w:tc>
-        <w:tc>
-          <w:tcPr>
-            <w:tcW w:type="dxa" w:w="680"/>
-            <w:shd w:fill="FFFF99" w:val="clear"/>
-          </w:tcPr>
-          <w:p>
-            <w:r>
-              <w:rPr>
-                <w:b w:val="0"/>
-                <w:sz w:val="16"/>
-              </w:rPr>
-            </w:r>
-          </w:p>
-        </w:tc>
-        <w:tc>
-          <w:tcPr>
-            <w:tcW w:type="dxa" w:w="850"/>
-            <w:shd w:fill="FFFF99" w:val="clear"/>
-          </w:tcPr>
-          <w:p>
-            <w:r>
-              <w:rPr>
-                <w:b w:val="0"/>
-                <w:sz w:val="16"/>
-              </w:rPr>
-              <w:t>M2</w:t>
-            </w:r>
-          </w:p>
-        </w:tc>
-        <w:tc>
-          <w:tcPr>
-            <w:tcW w:type="dxa" w:w="1984"/>
-            <w:shd w:fill="FFFF99" w:val="clear"/>
-          </w:tcPr>
-          <w:p>
-            <w:r>
-              <w:rPr>
-                <w:b w:val="0"/>
-                <w:sz w:val="16"/>
-              </w:rPr>
-              <w:t>s475 dn 40 11/2 zn dataconstruct</w:t>
-            </w:r>
-          </w:p>
-        </w:tc>
-        <w:tc>
-          <w:tcPr>
-            <w:tcW w:type="dxa" w:w="454"/>
-            <w:shd w:fill="FFFF99" w:val="clear"/>
-          </w:tcPr>
-          <w:p>
-            <w:r>
-              <w:rPr>
-                <w:b w:val="0"/>
-                <w:sz w:val="16"/>
-              </w:rPr>
-              <w:t>buc</w:t>
-            </w:r>
-          </w:p>
-        </w:tc>
-        <w:tc>
-          <w:tcPr>
-            <w:tcW w:type="dxa" w:w="680"/>
-            <w:shd w:fill="FFFF99" w:val="clear"/>
-          </w:tcPr>
-          <w:p>
-            <w:r>
-              <w:rPr>
-                <w:b w:val="0"/>
-                <w:sz w:val="16"/>
-              </w:rPr>
               <w:t>1.61</w:t>
-            </w:r>
-          </w:p>
-        </w:tc>
-        <w:tc>
-          <w:tcPr>
-            <w:tcW w:type="dxa" w:w="3572"/>
-            <w:shd w:fill="FFFF99" w:val="clear"/>
-          </w:tcPr>
-          <w:p>
-            <w:r>
-              <w:rPr>
-                <w:b w:val="0"/>
-                <w:color w:val="CC0000"/>
-                <w:sz w:val="16"/>
-              </w:rPr>
-              <w:t>Articol suplimentar în ofertă (nu există în referință)</w:t>
-            </w:r>
-          </w:p>
-        </w:tc>
-      </w:tr>
-      <w:tr>
-        <w:tc>
-          <w:tcPr>
-            <w:tcW w:type="dxa" w:w="397"/>
-            <w:shd w:fill="FFFF99" w:val="clear"/>
-          </w:tcPr>
-          <w:p>
-            <w:r>
-              <w:rPr>
-                <w:b w:val="0"/>
-                <w:sz w:val="16"/>
-              </w:rPr>
-              <w:t>44</w:t>
-            </w:r>
-          </w:p>
-        </w:tc>
-        <w:tc>
-          <w:tcPr>
-            <w:tcW w:type="dxa" w:w="1701"/>
-            <w:shd w:fill="FFFF99" w:val="clear"/>
-          </w:tcPr>
-          <w:p>
-            <w:r>
-              <w:rPr>
-                <w:b w:val="0"/>
-                <w:sz w:val="16"/>
-              </w:rPr>
-              <w:t>5.1-1 - Lucrari de constructii</w:t>
-            </w:r>
-          </w:p>
-        </w:tc>
-        <w:tc>
-          <w:tcPr>
-            <w:tcW w:type="dxa" w:w="850"/>
-            <w:shd w:fill="FFFF99" w:val="clear"/>
-          </w:tcPr>
-          <w:p>
-            <w:r>
-              <w:rPr>
-                <w:b w:val="0"/>
-                <w:sz w:val="16"/>
-              </w:rPr>
-            </w:r>
-          </w:p>
-        </w:tc>
-        <w:tc>
-          <w:tcPr>
-            <w:tcW w:type="dxa" w:w="1984"/>
-            <w:shd w:fill="FFFF99" w:val="clear"/>
-          </w:tcPr>
-          <w:p>
-            <w:r>
-              <w:rPr>
-                <w:b w:val="0"/>
-                <w:sz w:val="16"/>
-              </w:rPr>
-            </w:r>
-          </w:p>
-        </w:tc>
-        <w:tc>
-          <w:tcPr>
-            <w:tcW w:type="dxa" w:w="454"/>
-            <w:shd w:fill="FFFF99" w:val="clear"/>
-          </w:tcPr>
-          <w:p>
-            <w:r>
-              <w:rPr>
-                <w:b w:val="0"/>
-                <w:sz w:val="16"/>
-              </w:rPr>
-            </w:r>
-          </w:p>
-        </w:tc>
-        <w:tc>
-          <w:tcPr>
-            <w:tcW w:type="dxa" w:w="680"/>
-            <w:shd w:fill="FFFF99" w:val="clear"/>
-          </w:tcPr>
-          <w:p>
-            <w:r>
-              <w:rPr>
-                <w:b w:val="0"/>
-                <w:sz w:val="16"/>
-              </w:rPr>
-            </w:r>
-          </w:p>
-        </w:tc>
-        <w:tc>
-          <w:tcPr>
-            <w:tcW w:type="dxa" w:w="850"/>
-            <w:shd w:fill="FFFF99" w:val="clear"/>
-          </w:tcPr>
-          <w:p>
-            <w:r>
-              <w:rPr>
-                <w:b w:val="0"/>
-                <w:sz w:val="16"/>
-              </w:rPr>
-              <w:t>IEC60076</w:t>
-            </w:r>
-          </w:p>
-        </w:tc>
-        <w:tc>
-          <w:tcPr>
-            <w:tcW w:type="dxa" w:w="1984"/>
-            <w:shd w:fill="FFFF99" w:val="clear"/>
-          </w:tcPr>
-          <w:p>
-            <w:r>
-              <w:rPr>
-                <w:b w:val="0"/>
-                <w:sz w:val="16"/>
-              </w:rPr>
-              <w:t>fabricație conform standardelor ue 1so9g01; iec...</w:t>
-            </w:r>
-          </w:p>
-        </w:tc>
-        <w:tc>
-          <w:tcPr>
-            <w:tcW w:type="dxa" w:w="454"/>
-            <w:shd w:fill="FFFF99" w:val="clear"/>
-          </w:tcPr>
-          <w:p>
-            <w:r>
-              <w:rPr>
-                <w:b w:val="0"/>
-                <w:sz w:val="16"/>
-              </w:rPr>
-            </w:r>
-          </w:p>
-        </w:tc>
-        <w:tc>
-          <w:tcPr>
-            <w:tcW w:type="dxa" w:w="680"/>
-            <w:shd w:fill="FFFF99" w:val="clear"/>
-          </w:tcPr>
-          <w:p>
-            <w:r>
-              <w:rPr>
-                <w:b w:val="0"/>
-                <w:sz w:val="16"/>
-              </w:rPr>
-              <w:t>1.0</w:t>
             </w:r>
           </w:p>
         </w:tc>

</xml_diff>